<commit_message>
Fix media spill (wrapSquare) and title-page spill
- All 35 floating images: wrapNone → wrapSquare (bothSides) so text wraps cleanly and images no longer spill/overlap.
- Title page: removed excess empties after Date, inserted section break so title page ends cleanly on its own page; 3 spacers before INTRODUCTION.
</commit_message>
<xml_diff>
--- a/thesis/Velasquez_CTA_Skincare_Thesis_DRAFT_003.docx
+++ b/thesis/Velasquez_CTA_Skincare_Thesis_DRAFT_003.docx
@@ -734,6 +734,13 @@
           <w:sz w:val="24"/>
           <w:szCs w:val="24"/>
         </w:rPr>
+        <w:sectPr>
+          <w:pgSz w:w="11906" w:h="16838"/>
+          <w:pgMar w:top="1440" w:right="1440" w:bottom="1440" w:left="2160" w:header="720" w:footer="720" w:gutter="0"/>
+          <w:titlePg/>
+          <w:headerReference w:type="default" r:id="rId11"/>
+          <w:headerReference w:type="first" r:id="rId12"/>
+        </w:sectPr>
       </w:pPr>
       <w:r>
         <w:rPr>
@@ -745,114 +752,13 @@
     </w:p>
     <w:p>
       <w:pPr>
-        <w:spacing w:before="0" w:after="0" w:line="360" w:lineRule="auto"/>
-        <w:rPr>
-          <w:rFonts w:ascii="Georgia" w:cs="Georgia" w:eastAsia="Georgia" w:hAnsi="Georgia"/>
-        </w:rPr>
-      </w:pPr>
-      <w:r>
-        <w:rPr>
-          <w:rFonts w:ascii="Georgia" w:hAnsi="Georgia" w:eastAsia="Georgia" w:cs="Georgia"/>
-          <w:sz w:val="24"/>
-          <w:rtl w:val="0"/>
-        </w:rPr>
-      </w:r>
-    </w:p>
-    <w:p>
-      <w:pPr>
-        <w:spacing w:before="0" w:after="0" w:line="360" w:lineRule="auto"/>
-        <w:rPr>
-          <w:rFonts w:ascii="Georgia" w:cs="Georgia" w:eastAsia="Georgia" w:hAnsi="Georgia"/>
-        </w:rPr>
-      </w:pPr>
-      <w:r>
-        <w:rPr>
-          <w:rFonts w:ascii="Georgia" w:hAnsi="Georgia" w:eastAsia="Georgia" w:cs="Georgia"/>
-          <w:sz w:val="24"/>
-          <w:rtl w:val="0"/>
-        </w:rPr>
-      </w:r>
-    </w:p>
-    <w:p>
-      <w:pPr>
-        <w:spacing w:before="0" w:after="0" w:line="360" w:lineRule="auto"/>
-        <w:rPr>
-          <w:rFonts w:ascii="Georgia" w:cs="Georgia" w:eastAsia="Georgia" w:hAnsi="Georgia"/>
-        </w:rPr>
-      </w:pPr>
-      <w:r>
-        <w:rPr>
-          <w:rFonts w:ascii="Georgia" w:hAnsi="Georgia" w:eastAsia="Georgia" w:cs="Georgia"/>
-          <w:sz w:val="24"/>
-          <w:rtl w:val="0"/>
-        </w:rPr>
-      </w:r>
-    </w:p>
-    <w:p>
-      <w:pPr>
-        <w:spacing w:before="0" w:after="0" w:line="360" w:lineRule="auto"/>
-        <w:rPr>
-          <w:rFonts w:ascii="Georgia" w:cs="Georgia" w:eastAsia="Georgia" w:hAnsi="Georgia"/>
-        </w:rPr>
-      </w:pPr>
-      <w:r>
-        <w:rPr>
-          <w:rFonts w:ascii="Georgia" w:hAnsi="Georgia" w:eastAsia="Georgia" w:cs="Georgia"/>
-          <w:sz w:val="24"/>
-          <w:rtl w:val="0"/>
-        </w:rPr>
-      </w:r>
-    </w:p>
-    <w:p>
-      <w:pPr>
-        <w:spacing w:line="360" w:lineRule="auto" w:before="0" w:after="0"/>
-        <w:rPr>
-          <w:rFonts w:ascii="Georgia" w:cs="Georgia" w:eastAsia="Georgia" w:hAnsi="Georgia"/>
-          <w:b w:val="1"/>
-          <w:bCs w:val="1"/>
-        </w:rPr>
-      </w:pPr>
-      <w:r>
-        <w:rPr>
-          <w:rFonts w:ascii="Georgia" w:hAnsi="Georgia" w:eastAsia="Georgia" w:cs="Georgia"/>
-          <w:sz w:val="24"/>
-          <w:rtl w:val="0"/>
-        </w:rPr>
-      </w:r>
-    </w:p>
-    <w:p>
-      <w:pPr>
-        <w:spacing w:line="360" w:lineRule="auto" w:before="0" w:after="0"/>
-        <w:rPr>
-          <w:rFonts w:ascii="Georgia" w:cs="Georgia" w:eastAsia="Georgia" w:hAnsi="Georgia"/>
-          <w:b w:val="1"/>
-          <w:bCs w:val="1"/>
-        </w:rPr>
-      </w:pPr>
-      <w:r>
-        <w:rPr>
-          <w:rFonts w:ascii="Georgia" w:hAnsi="Georgia" w:eastAsia="Georgia" w:cs="Georgia"/>
-          <w:sz w:val="24"/>
-          <w:rtl w:val="0"/>
-        </w:rPr>
-      </w:r>
-    </w:p>
-    <w:p>
-      <w:pPr>
-        <w:spacing w:line="360" w:lineRule="auto" w:before="0" w:after="0"/>
-        <w:rPr>
-          <w:rFonts w:ascii="Georgia" w:cs="Georgia" w:eastAsia="Georgia" w:hAnsi="Georgia"/>
-          <w:b w:val="1"/>
-          <w:bCs w:val="1"/>
-        </w:rPr>
-      </w:pPr>
-      <w:r>
-        <w:rPr>
-          <w:rFonts w:ascii="Georgia" w:hAnsi="Georgia" w:eastAsia="Georgia" w:cs="Georgia"/>
-          <w:sz w:val="24"/>
-          <w:rtl w:val="0"/>
-        </w:rPr>
-      </w:r>
+        <w:spacing w:before="0" w:after="0" w:line="480" w:lineRule="auto"/>
+      </w:pPr>
+    </w:p>
+    <w:p>
+      <w:pPr>
+        <w:spacing w:before="0" w:after="0" w:line="480" w:lineRule="auto"/>
+      </w:pPr>
     </w:p>
     <w:p>
       <w:pPr>
@@ -2131,8 +2037,8 @@
               <wp:posOffset>390525</wp:posOffset>
             </wp:positionV>
             <wp:extent cx="3052763" cy="3229856"/>
+            <wp:wrapSquare wrapText="bothSides"/>
             <wp:effectExtent b="0" l="0" r="0" t="0"/>
-            <wp:wrapNone/>
             <wp:docPr id="12" name="image40.jpg"/>
             <a:graphic>
               <a:graphicData uri="http://schemas.openxmlformats.org/drawingml/2006/picture">
@@ -14515,8 +14421,8 @@
               <wp:posOffset>285750</wp:posOffset>
             </wp:positionV>
             <wp:extent cx="1323975" cy="2471401"/>
+            <wp:wrapSquare wrapText="bothSides"/>
             <wp:effectExtent b="0" l="0" r="0" t="0"/>
-            <wp:wrapNone/>
             <wp:docPr id="43" name="image28.jpg"/>
             <a:graphic>
               <a:graphicData uri="http://schemas.openxmlformats.org/drawingml/2006/picture">
@@ -14545,13 +14451,6 @@
             </a:graphic>
           </wp:anchor>
         </w:drawing>
-      </w:r>
-      <w:r>
-        <w:rPr>
-          <w:rFonts w:ascii="Georgia" w:hAnsi="Georgia" w:eastAsia="Georgia" w:cs="Georgia"/>
-          <w:b w:val="0"/>
-          <w:sz w:val="22"/>
-        </w:rPr>
         <w:drawing>
           <wp:anchor allowOverlap="1" behindDoc="0" distB="114300" distT="114300" distL="114300" distR="114300" hidden="0" layoutInCell="1" locked="0" relativeHeight="0" simplePos="0">
             <wp:simplePos x="0" y="0"/>
@@ -14562,8 +14461,8 @@
               <wp:posOffset>285750</wp:posOffset>
             </wp:positionV>
             <wp:extent cx="1266825" cy="2466975"/>
+            <wp:wrapSquare wrapText="bothSides"/>
             <wp:effectExtent b="0" l="0" r="0" t="0"/>
-            <wp:wrapNone/>
             <wp:docPr id="39" name="image39.jpg"/>
             <a:graphic>
               <a:graphicData uri="http://schemas.openxmlformats.org/drawingml/2006/picture">
@@ -14592,13 +14491,6 @@
             </a:graphic>
           </wp:anchor>
         </w:drawing>
-      </w:r>
-      <w:r>
-        <w:rPr>
-          <w:rFonts w:ascii="Georgia" w:hAnsi="Georgia" w:eastAsia="Georgia" w:cs="Georgia"/>
-          <w:b w:val="0"/>
-          <w:sz w:val="22"/>
-        </w:rPr>
         <w:drawing>
           <wp:anchor allowOverlap="1" behindDoc="0" distB="114300" distT="114300" distL="114300" distR="114300" hidden="0" layoutInCell="1" locked="0" relativeHeight="0" simplePos="0">
             <wp:simplePos x="0" y="0"/>
@@ -14609,8 +14501,8 @@
               <wp:posOffset>285750</wp:posOffset>
             </wp:positionV>
             <wp:extent cx="1323975" cy="2632289"/>
+            <wp:wrapSquare wrapText="bothSides"/>
             <wp:effectExtent b="0" l="0" r="0" t="0"/>
-            <wp:wrapNone/>
             <wp:docPr id="37" name="image30.jpg"/>
             <a:graphic>
               <a:graphicData uri="http://schemas.openxmlformats.org/drawingml/2006/picture">
@@ -14639,13 +14531,6 @@
             </a:graphic>
           </wp:anchor>
         </w:drawing>
-      </w:r>
-      <w:r>
-        <w:rPr>
-          <w:rFonts w:ascii="Georgia" w:hAnsi="Georgia" w:eastAsia="Georgia" w:cs="Georgia"/>
-          <w:b w:val="0"/>
-          <w:sz w:val="22"/>
-        </w:rPr>
         <w:drawing>
           <wp:anchor allowOverlap="1" behindDoc="0" distB="114300" distT="114300" distL="114300" distR="114300" hidden="0" layoutInCell="1" locked="0" relativeHeight="0" simplePos="0">
             <wp:simplePos x="0" y="0"/>
@@ -14656,8 +14541,8 @@
               <wp:posOffset>285750</wp:posOffset>
             </wp:positionV>
             <wp:extent cx="1266825" cy="2466975"/>
+            <wp:wrapSquare wrapText="bothSides"/>
             <wp:effectExtent b="0" l="0" r="0" t="0"/>
-            <wp:wrapNone/>
             <wp:docPr id="9" name="image47.jpg"/>
             <a:graphic>
               <a:graphicData uri="http://schemas.openxmlformats.org/drawingml/2006/picture">
@@ -14732,8 +14617,8 @@
               <wp:posOffset>2690813</wp:posOffset>
             </wp:positionV>
             <wp:extent cx="1400175" cy="3352800"/>
+            <wp:wrapSquare wrapText="bothSides"/>
             <wp:effectExtent b="0" l="0" r="0" t="0"/>
-            <wp:wrapNone/>
             <wp:docPr id="8" name="image26.jpg"/>
             <a:graphic>
               <a:graphicData uri="http://schemas.openxmlformats.org/drawingml/2006/picture">
@@ -14762,13 +14647,6 @@
             </a:graphic>
           </wp:anchor>
         </w:drawing>
-      </w:r>
-      <w:r>
-        <w:rPr>
-          <w:rFonts w:ascii="Georgia" w:hAnsi="Georgia" w:eastAsia="Georgia" w:cs="Georgia"/>
-          <w:b w:val="0"/>
-          <w:sz w:val="22"/>
-        </w:rPr>
         <w:drawing>
           <wp:anchor allowOverlap="1" behindDoc="0" distB="114300" distT="114300" distL="114300" distR="114300" hidden="0" layoutInCell="1" locked="0" relativeHeight="0" simplePos="0">
             <wp:simplePos x="0" y="0"/>
@@ -14779,8 +14657,8 @@
               <wp:posOffset>2905125</wp:posOffset>
             </wp:positionV>
             <wp:extent cx="1323975" cy="2833203"/>
+            <wp:wrapSquare wrapText="bothSides"/>
             <wp:effectExtent b="0" l="0" r="0" t="0"/>
-            <wp:wrapNone/>
             <wp:docPr id="19" name="image14.jpg"/>
             <a:graphic>
               <a:graphicData uri="http://schemas.openxmlformats.org/drawingml/2006/picture">
@@ -14809,13 +14687,6 @@
             </a:graphic>
           </wp:anchor>
         </w:drawing>
-      </w:r>
-      <w:r>
-        <w:rPr>
-          <w:rFonts w:ascii="Georgia" w:hAnsi="Georgia" w:eastAsia="Georgia" w:cs="Georgia"/>
-          <w:b w:val="0"/>
-          <w:sz w:val="22"/>
-        </w:rPr>
         <w:drawing>
           <wp:anchor allowOverlap="1" behindDoc="0" distB="114300" distT="114300" distL="114300" distR="114300" hidden="0" layoutInCell="1" locked="0" relativeHeight="0" simplePos="0">
             <wp:simplePos x="0" y="0"/>
@@ -14826,8 +14697,8 @@
               <wp:posOffset>2943225</wp:posOffset>
             </wp:positionV>
             <wp:extent cx="1323975" cy="2852253"/>
+            <wp:wrapSquare wrapText="bothSides"/>
             <wp:effectExtent b="0" l="0" r="0" t="0"/>
-            <wp:wrapNone/>
             <wp:docPr id="25" name="image21.jpg"/>
             <a:graphic>
               <a:graphicData uri="http://schemas.openxmlformats.org/drawingml/2006/picture">
@@ -14944,8 +14815,8 @@
               <wp:posOffset>200025</wp:posOffset>
             </wp:positionV>
             <wp:extent cx="1266825" cy="3156500"/>
+            <wp:wrapSquare wrapText="bothSides"/>
             <wp:effectExtent b="0" l="0" r="0" t="0"/>
-            <wp:wrapNone/>
             <wp:docPr id="32" name="image38.jpg"/>
             <a:graphic>
               <a:graphicData uri="http://schemas.openxmlformats.org/drawingml/2006/picture">
@@ -14974,13 +14845,6 @@
             </a:graphic>
           </wp:anchor>
         </w:drawing>
-      </w:r>
-      <w:r>
-        <w:rPr>
-          <w:rFonts w:ascii="Georgia" w:hAnsi="Georgia" w:eastAsia="Georgia" w:cs="Georgia"/>
-          <w:b w:val="0"/>
-          <w:sz w:val="22"/>
-        </w:rPr>
         <w:drawing>
           <wp:anchor allowOverlap="1" behindDoc="0" distB="114300" distT="114300" distL="114300" distR="114300" hidden="0" layoutInCell="1" locked="0" relativeHeight="0" simplePos="0">
             <wp:simplePos x="0" y="0"/>
@@ -14991,8 +14855,8 @@
               <wp:posOffset>343687</wp:posOffset>
             </wp:positionV>
             <wp:extent cx="1323975" cy="2710900"/>
+            <wp:wrapSquare wrapText="bothSides"/>
             <wp:effectExtent b="0" l="0" r="0" t="0"/>
-            <wp:wrapNone/>
             <wp:docPr id="38" name="image41.jpg"/>
             <a:graphic>
               <a:graphicData uri="http://schemas.openxmlformats.org/drawingml/2006/picture">
@@ -15059,8 +14923,8 @@
               <wp:posOffset>230675</wp:posOffset>
             </wp:positionV>
             <wp:extent cx="1323975" cy="2779225"/>
+            <wp:wrapSquare wrapText="bothSides"/>
             <wp:effectExtent b="0" l="0" r="0" t="0"/>
-            <wp:wrapNone/>
             <wp:docPr id="24" name="image27.jpg"/>
             <a:graphic>
               <a:graphicData uri="http://schemas.openxmlformats.org/drawingml/2006/picture">
@@ -15089,13 +14953,6 @@
             </a:graphic>
           </wp:anchor>
         </w:drawing>
-      </w:r>
-      <w:r>
-        <w:rPr>
-          <w:rFonts w:ascii="Georgia" w:hAnsi="Georgia" w:eastAsia="Georgia" w:cs="Georgia"/>
-          <w:b w:val="0"/>
-          <w:sz w:val="22"/>
-        </w:rPr>
         <w:drawing>
           <wp:anchor allowOverlap="1" behindDoc="0" distB="114300" distT="114300" distL="114300" distR="114300" hidden="0" layoutInCell="1" locked="0" relativeHeight="0" simplePos="0">
             <wp:simplePos x="0" y="0"/>
@@ -15106,8 +14963,8 @@
               <wp:posOffset>245467</wp:posOffset>
             </wp:positionV>
             <wp:extent cx="1266825" cy="2507258"/>
+            <wp:wrapSquare wrapText="bothSides"/>
             <wp:effectExtent b="0" l="0" r="0" t="0"/>
-            <wp:wrapNone/>
             <wp:docPr id="47" name="image49.jpg"/>
             <a:graphic>
               <a:graphicData uri="http://schemas.openxmlformats.org/drawingml/2006/picture">
@@ -15195,8 +15052,8 @@
               <wp:posOffset>3116453</wp:posOffset>
             </wp:positionV>
             <wp:extent cx="1323975" cy="3004228"/>
+            <wp:wrapSquare wrapText="bothSides"/>
             <wp:effectExtent b="0" l="0" r="0" t="0"/>
-            <wp:wrapNone/>
             <wp:docPr id="21" name="image22.jpg"/>
             <a:graphic>
               <a:graphicData uri="http://schemas.openxmlformats.org/drawingml/2006/picture">
@@ -15225,13 +15082,6 @@
             </a:graphic>
           </wp:anchor>
         </w:drawing>
-      </w:r>
-      <w:r>
-        <w:rPr>
-          <w:rFonts w:ascii="Georgia" w:hAnsi="Georgia" w:eastAsia="Georgia" w:cs="Georgia"/>
-          <w:b w:val="0"/>
-          <w:sz w:val="22"/>
-        </w:rPr>
         <w:drawing>
           <wp:anchor allowOverlap="1" behindDoc="0" distB="114300" distT="114300" distL="114300" distR="114300" hidden="0" layoutInCell="1" locked="0" relativeHeight="0" simplePos="0">
             <wp:simplePos x="0" y="0"/>
@@ -15242,8 +15092,8 @@
               <wp:posOffset>2852737</wp:posOffset>
             </wp:positionV>
             <wp:extent cx="1400175" cy="3352800"/>
+            <wp:wrapSquare wrapText="bothSides"/>
             <wp:effectExtent b="0" l="0" r="0" t="0"/>
-            <wp:wrapNone/>
             <wp:docPr id="23" name="image23.jpg"/>
             <a:graphic>
               <a:graphicData uri="http://schemas.openxmlformats.org/drawingml/2006/picture">
@@ -15583,8 +15433,8 @@
               <wp:posOffset>142875</wp:posOffset>
             </wp:positionV>
             <wp:extent cx="1323975" cy="3340528"/>
+            <wp:wrapSquare wrapText="bothSides"/>
             <wp:effectExtent b="0" l="0" r="0" t="0"/>
-            <wp:wrapNone/>
             <wp:docPr id="28" name="image18.jpg"/>
             <a:graphic>
               <a:graphicData uri="http://schemas.openxmlformats.org/drawingml/2006/picture">
@@ -16045,8 +15895,8 @@
               <wp:posOffset>313436</wp:posOffset>
             </wp:positionV>
             <wp:extent cx="1323975" cy="2016632"/>
+            <wp:wrapSquare wrapText="bothSides"/>
             <wp:effectExtent b="0" l="0" r="0" t="0"/>
-            <wp:wrapNone/>
             <wp:docPr id="31" name="image35.jpg"/>
             <a:graphic>
               <a:graphicData uri="http://schemas.openxmlformats.org/drawingml/2006/picture">
@@ -16113,8 +15963,8 @@
               <wp:posOffset>161925</wp:posOffset>
             </wp:positionV>
             <wp:extent cx="1323975" cy="2616707"/>
+            <wp:wrapSquare wrapText="bothSides"/>
             <wp:effectExtent b="0" l="0" r="0" t="0"/>
-            <wp:wrapNone/>
             <wp:docPr id="6" name="image32.jpg"/>
             <a:graphic>
               <a:graphicData uri="http://schemas.openxmlformats.org/drawingml/2006/picture">
@@ -16143,13 +15993,6 @@
             </a:graphic>
           </wp:anchor>
         </w:drawing>
-      </w:r>
-      <w:r>
-        <w:rPr>
-          <w:rFonts w:ascii="Georgia" w:hAnsi="Georgia" w:eastAsia="Georgia" w:cs="Georgia"/>
-          <w:b w:val="0"/>
-          <w:sz w:val="22"/>
-        </w:rPr>
         <w:drawing>
           <wp:anchor allowOverlap="1" behindDoc="0" distB="114300" distT="114300" distL="114300" distR="114300" hidden="0" layoutInCell="1" locked="0" relativeHeight="0" simplePos="0">
             <wp:simplePos x="0" y="0"/>
@@ -16160,8 +16003,8 @@
               <wp:posOffset>114300</wp:posOffset>
             </wp:positionV>
             <wp:extent cx="1323975" cy="2710900"/>
+            <wp:wrapSquare wrapText="bothSides"/>
             <wp:effectExtent b="0" l="0" r="0" t="0"/>
-            <wp:wrapNone/>
             <wp:docPr id="3" name="image17.jpg"/>
             <a:graphic>
               <a:graphicData uri="http://schemas.openxmlformats.org/drawingml/2006/picture">
@@ -16190,13 +16033,6 @@
             </a:graphic>
           </wp:anchor>
         </w:drawing>
-      </w:r>
-      <w:r>
-        <w:rPr>
-          <w:rFonts w:ascii="Georgia" w:hAnsi="Georgia" w:eastAsia="Georgia" w:cs="Georgia"/>
-          <w:b w:val="0"/>
-          <w:sz w:val="22"/>
-        </w:rPr>
         <w:drawing>
           <wp:anchor allowOverlap="1" behindDoc="0" distB="114300" distT="114300" distL="114300" distR="114300" hidden="0" layoutInCell="1" locked="0" relativeHeight="0" simplePos="0">
             <wp:simplePos x="0" y="0"/>
@@ -16207,8 +16043,8 @@
               <wp:posOffset>114300</wp:posOffset>
             </wp:positionV>
             <wp:extent cx="1323975" cy="3031618"/>
+            <wp:wrapSquare wrapText="bothSides"/>
             <wp:effectExtent b="0" l="0" r="0" t="0"/>
-            <wp:wrapNone/>
             <wp:docPr id="34" name="image42.jpg"/>
             <a:graphic>
               <a:graphicData uri="http://schemas.openxmlformats.org/drawingml/2006/picture">
@@ -16451,8 +16287,8 @@
               <wp:posOffset>1687071</wp:posOffset>
             </wp:positionV>
             <wp:extent cx="1323975" cy="3172971"/>
+            <wp:wrapSquare wrapText="bothSides"/>
             <wp:effectExtent b="0" l="0" r="0" t="0"/>
-            <wp:wrapNone/>
             <wp:docPr id="2" name="image36.jpg"/>
             <a:graphic>
               <a:graphicData uri="http://schemas.openxmlformats.org/drawingml/2006/picture">
@@ -16481,13 +16317,6 @@
             </a:graphic>
           </wp:anchor>
         </w:drawing>
-      </w:r>
-      <w:r>
-        <w:rPr>
-          <w:rFonts w:ascii="Georgia" w:hAnsi="Georgia" w:eastAsia="Georgia" w:cs="Georgia"/>
-          <w:b w:val="0"/>
-          <w:sz w:val="22"/>
-        </w:rPr>
         <w:drawing>
           <wp:anchor allowOverlap="1" behindDoc="0" distB="114300" distT="114300" distL="114300" distR="114300" hidden="0" layoutInCell="1" locked="0" relativeHeight="0" simplePos="0">
             <wp:simplePos x="0" y="0"/>
@@ -16498,8 +16327,8 @@
               <wp:posOffset>1771650</wp:posOffset>
             </wp:positionV>
             <wp:extent cx="1323975" cy="2982471"/>
+            <wp:wrapSquare wrapText="bothSides"/>
             <wp:effectExtent b="0" l="0" r="0" t="0"/>
-            <wp:wrapNone/>
             <wp:docPr id="33" name="image34.jpg"/>
             <a:graphic>
               <a:graphicData uri="http://schemas.openxmlformats.org/drawingml/2006/picture">
@@ -16528,13 +16357,6 @@
             </a:graphic>
           </wp:anchor>
         </w:drawing>
-      </w:r>
-      <w:r>
-        <w:rPr>
-          <w:rFonts w:ascii="Georgia" w:hAnsi="Georgia" w:eastAsia="Georgia" w:cs="Georgia"/>
-          <w:b w:val="0"/>
-          <w:sz w:val="22"/>
-        </w:rPr>
         <w:drawing>
           <wp:anchor allowOverlap="1" behindDoc="0" distB="114300" distT="114300" distL="114300" distR="114300" hidden="0" layoutInCell="1" locked="0" relativeHeight="0" simplePos="0">
             <wp:simplePos x="0" y="0"/>
@@ -16545,8 +16367,8 @@
               <wp:posOffset>1925196</wp:posOffset>
             </wp:positionV>
             <wp:extent cx="1323975" cy="2649096"/>
+            <wp:wrapSquare wrapText="bothSides"/>
             <wp:effectExtent b="0" l="0" r="0" t="0"/>
-            <wp:wrapNone/>
             <wp:docPr id="41" name="image43.jpg"/>
             <a:graphic>
               <a:graphicData uri="http://schemas.openxmlformats.org/drawingml/2006/picture">
@@ -16692,8 +16514,8 @@
               <wp:posOffset>3705225</wp:posOffset>
             </wp:positionV>
             <wp:extent cx="1323975" cy="2240450"/>
+            <wp:wrapSquare wrapText="bothSides"/>
             <wp:effectExtent b="0" l="0" r="0" t="0"/>
-            <wp:wrapNone/>
             <wp:docPr id="4" name="image8.jpg"/>
             <a:graphic>
               <a:graphicData uri="http://schemas.openxmlformats.org/drawingml/2006/picture">
@@ -16722,13 +16544,6 @@
             </a:graphic>
           </wp:anchor>
         </w:drawing>
-      </w:r>
-      <w:r>
-        <w:rPr>
-          <w:rFonts w:ascii="Georgia" w:hAnsi="Georgia" w:eastAsia="Georgia" w:cs="Georgia"/>
-          <w:b w:val="0"/>
-          <w:sz w:val="22"/>
-        </w:rPr>
         <w:drawing>
           <wp:anchor allowOverlap="1" behindDoc="0" distB="114300" distT="114300" distL="114300" distR="114300" hidden="0" layoutInCell="1" locked="0" relativeHeight="0" simplePos="0">
             <wp:simplePos x="0" y="0"/>
@@ -16739,8 +16554,8 @@
               <wp:posOffset>3638550</wp:posOffset>
             </wp:positionV>
             <wp:extent cx="1323975" cy="3029820"/>
+            <wp:wrapSquare wrapText="bothSides"/>
             <wp:effectExtent b="0" l="0" r="0" t="0"/>
-            <wp:wrapNone/>
             <wp:docPr id="10" name="image13.jpg"/>
             <a:graphic>
               <a:graphicData uri="http://schemas.openxmlformats.org/drawingml/2006/picture">
@@ -16769,13 +16584,6 @@
             </a:graphic>
           </wp:anchor>
         </w:drawing>
-      </w:r>
-      <w:r>
-        <w:rPr>
-          <w:rFonts w:ascii="Georgia" w:hAnsi="Georgia" w:eastAsia="Georgia" w:cs="Georgia"/>
-          <w:b w:val="0"/>
-          <w:sz w:val="22"/>
-        </w:rPr>
         <w:drawing>
           <wp:anchor allowOverlap="1" behindDoc="0" distB="114300" distT="114300" distL="114300" distR="114300" hidden="0" layoutInCell="1" locked="0" relativeHeight="0" simplePos="0">
             <wp:simplePos x="0" y="0"/>
@@ -16786,8 +16594,8 @@
               <wp:posOffset>495300</wp:posOffset>
             </wp:positionV>
             <wp:extent cx="1323975" cy="2269025"/>
+            <wp:wrapSquare wrapText="bothSides"/>
             <wp:effectExtent b="0" l="0" r="0" t="0"/>
-            <wp:wrapNone/>
             <wp:docPr id="17" name="image12.jpg"/>
             <a:graphic>
               <a:graphicData uri="http://schemas.openxmlformats.org/drawingml/2006/picture">
@@ -16816,13 +16624,6 @@
             </a:graphic>
           </wp:anchor>
         </w:drawing>
-      </w:r>
-      <w:r>
-        <w:rPr>
-          <w:rFonts w:ascii="Georgia" w:hAnsi="Georgia" w:eastAsia="Georgia" w:cs="Georgia"/>
-          <w:b w:val="0"/>
-          <w:sz w:val="22"/>
-        </w:rPr>
         <w:drawing>
           <wp:anchor allowOverlap="1" behindDoc="0" distB="114300" distT="114300" distL="114300" distR="114300" hidden="0" layoutInCell="1" locked="0" relativeHeight="0" simplePos="0">
             <wp:simplePos x="0" y="0"/>
@@ -16833,8 +16634,8 @@
               <wp:posOffset>3705225</wp:posOffset>
             </wp:positionV>
             <wp:extent cx="1323975" cy="3006157"/>
+            <wp:wrapSquare wrapText="bothSides"/>
             <wp:effectExtent b="0" l="0" r="0" t="0"/>
-            <wp:wrapNone/>
             <wp:docPr id="20" name="image10.jpg"/>
             <a:graphic>
               <a:graphicData uri="http://schemas.openxmlformats.org/drawingml/2006/picture">
@@ -16863,13 +16664,6 @@
             </a:graphic>
           </wp:anchor>
         </w:drawing>
-      </w:r>
-      <w:r>
-        <w:rPr>
-          <w:rFonts w:ascii="Georgia" w:hAnsi="Georgia" w:eastAsia="Georgia" w:cs="Georgia"/>
-          <w:b w:val="0"/>
-          <w:sz w:val="22"/>
-        </w:rPr>
         <w:drawing>
           <wp:anchor allowOverlap="1" behindDoc="0" distB="114300" distT="114300" distL="114300" distR="114300" hidden="0" layoutInCell="1" locked="0" relativeHeight="0" simplePos="0">
             <wp:simplePos x="0" y="0"/>
@@ -16880,8 +16674,8 @@
               <wp:posOffset>497375</wp:posOffset>
             </wp:positionV>
             <wp:extent cx="1257300" cy="2836375"/>
+            <wp:wrapSquare wrapText="bothSides"/>
             <wp:effectExtent b="0" l="0" r="0" t="0"/>
-            <wp:wrapNone/>
             <wp:docPr id="29" name="image19.jpg"/>
             <a:graphic>
               <a:graphicData uri="http://schemas.openxmlformats.org/drawingml/2006/picture">
@@ -16910,13 +16704,6 @@
             </a:graphic>
           </wp:anchor>
         </w:drawing>
-      </w:r>
-      <w:r>
-        <w:rPr>
-          <w:rFonts w:ascii="Georgia" w:hAnsi="Georgia" w:eastAsia="Georgia" w:cs="Georgia"/>
-          <w:b w:val="0"/>
-          <w:sz w:val="22"/>
-        </w:rPr>
         <w:drawing>
           <wp:anchor allowOverlap="1" behindDoc="0" distB="114300" distT="114300" distL="114300" distR="114300" hidden="0" layoutInCell="1" locked="0" relativeHeight="0" simplePos="0">
             <wp:simplePos x="0" y="0"/>
@@ -16927,8 +16714,8 @@
               <wp:posOffset>495300</wp:posOffset>
             </wp:positionV>
             <wp:extent cx="1323975" cy="2841817"/>
+            <wp:wrapSquare wrapText="bothSides"/>
             <wp:effectExtent b="0" l="0" r="0" t="0"/>
-            <wp:wrapNone/>
             <wp:docPr id="26" name="image15.jpg"/>
             <a:graphic>
               <a:graphicData uri="http://schemas.openxmlformats.org/drawingml/2006/picture">
@@ -16957,13 +16744,6 @@
             </a:graphic>
           </wp:anchor>
         </w:drawing>
-      </w:r>
-      <w:r>
-        <w:rPr>
-          <w:rFonts w:ascii="Georgia" w:hAnsi="Georgia" w:eastAsia="Georgia" w:cs="Georgia"/>
-          <w:b w:val="0"/>
-          <w:sz w:val="22"/>
-        </w:rPr>
         <w:drawing>
           <wp:anchor allowOverlap="1" behindDoc="0" distB="114300" distT="114300" distL="114300" distR="114300" hidden="0" layoutInCell="1" locked="0" relativeHeight="0" simplePos="0">
             <wp:simplePos x="0" y="0"/>
@@ -16974,8 +16754,8 @@
               <wp:posOffset>419100</wp:posOffset>
             </wp:positionV>
             <wp:extent cx="1323975" cy="2274400"/>
+            <wp:wrapSquare wrapText="bothSides"/>
             <wp:effectExtent b="0" l="0" r="0" t="0"/>
-            <wp:wrapNone/>
             <wp:docPr id="14" name="image9.jpg"/>
             <a:graphic>
               <a:graphicData uri="http://schemas.openxmlformats.org/drawingml/2006/picture">
@@ -17121,8 +16901,8 @@
               <wp:posOffset>3686175</wp:posOffset>
             </wp:positionV>
             <wp:extent cx="1257300" cy="2836375"/>
+            <wp:wrapSquare wrapText="bothSides"/>
             <wp:effectExtent b="0" l="0" r="0" t="0"/>
-            <wp:wrapNone/>
             <wp:docPr id="27" name="image37.jpg"/>
             <a:graphic>
               <a:graphicData uri="http://schemas.openxmlformats.org/drawingml/2006/picture">
@@ -17151,13 +16931,6 @@
             </a:graphic>
           </wp:anchor>
         </w:drawing>
-      </w:r>
-      <w:r>
-        <w:rPr>
-          <w:rFonts w:ascii="Georgia" w:hAnsi="Georgia" w:eastAsia="Georgia" w:cs="Georgia"/>
-          <w:b w:val="0"/>
-          <w:sz w:val="22"/>
-        </w:rPr>
         <w:drawing>
           <wp:anchor allowOverlap="1" behindDoc="0" distB="114300" distT="114300" distL="114300" distR="114300" hidden="0" layoutInCell="1" locked="0" relativeHeight="0" simplePos="0">
             <wp:simplePos x="0" y="0"/>
@@ -17168,8 +16941,8 @@
               <wp:posOffset>342900</wp:posOffset>
             </wp:positionV>
             <wp:extent cx="1257300" cy="2836375"/>
+            <wp:wrapSquare wrapText="bothSides"/>
             <wp:effectExtent b="0" l="0" r="0" t="0"/>
-            <wp:wrapNone/>
             <wp:docPr id="46" name="image45.jpg"/>
             <a:graphic>
               <a:graphicData uri="http://schemas.openxmlformats.org/drawingml/2006/picture">
@@ -17198,13 +16971,6 @@
             </a:graphic>
           </wp:anchor>
         </w:drawing>
-      </w:r>
-      <w:r>
-        <w:rPr>
-          <w:rFonts w:ascii="Georgia" w:hAnsi="Georgia" w:eastAsia="Georgia" w:cs="Georgia"/>
-          <w:b w:val="0"/>
-          <w:sz w:val="22"/>
-        </w:rPr>
         <w:drawing>
           <wp:anchor allowOverlap="1" behindDoc="0" distB="114300" distT="114300" distL="114300" distR="114300" hidden="0" layoutInCell="1" locked="0" relativeHeight="0" simplePos="0">
             <wp:simplePos x="0" y="0"/>
@@ -17215,8 +16981,8 @@
               <wp:posOffset>346625</wp:posOffset>
             </wp:positionV>
             <wp:extent cx="1257300" cy="2836375"/>
+            <wp:wrapSquare wrapText="bothSides"/>
             <wp:effectExtent b="0" l="0" r="0" t="0"/>
-            <wp:wrapNone/>
             <wp:docPr id="48" name="image46.jpg"/>
             <a:graphic>
               <a:graphicData uri="http://schemas.openxmlformats.org/drawingml/2006/picture">
@@ -17245,13 +17011,6 @@
             </a:graphic>
           </wp:anchor>
         </w:drawing>
-      </w:r>
-      <w:r>
-        <w:rPr>
-          <w:rFonts w:ascii="Georgia" w:hAnsi="Georgia" w:eastAsia="Georgia" w:cs="Georgia"/>
-          <w:b w:val="0"/>
-          <w:sz w:val="22"/>
-        </w:rPr>
         <w:drawing>
           <wp:anchor allowOverlap="1" behindDoc="0" distB="114300" distT="114300" distL="114300" distR="114300" hidden="0" layoutInCell="1" locked="0" relativeHeight="0" simplePos="0">
             <wp:simplePos x="0" y="0"/>
@@ -17262,8 +17021,8 @@
               <wp:posOffset>3684910</wp:posOffset>
             </wp:positionV>
             <wp:extent cx="1257300" cy="2836375"/>
+            <wp:wrapSquare wrapText="bothSides"/>
             <wp:effectExtent b="0" l="0" r="0" t="0"/>
-            <wp:wrapNone/>
             <wp:docPr id="18" name="image44.jpg"/>
             <a:graphic>
               <a:graphicData uri="http://schemas.openxmlformats.org/drawingml/2006/picture">
@@ -17292,13 +17051,6 @@
             </a:graphic>
           </wp:anchor>
         </w:drawing>
-      </w:r>
-      <w:r>
-        <w:rPr>
-          <w:rFonts w:ascii="Georgia" w:hAnsi="Georgia" w:eastAsia="Georgia" w:cs="Georgia"/>
-          <w:b w:val="0"/>
-          <w:sz w:val="22"/>
-        </w:rPr>
         <w:drawing>
           <wp:anchor allowOverlap="1" behindDoc="0" distB="114300" distT="114300" distL="114300" distR="114300" hidden="0" layoutInCell="1" locked="0" relativeHeight="0" simplePos="0">
             <wp:simplePos x="0" y="0"/>
@@ -17309,8 +17061,8 @@
               <wp:posOffset>3686175</wp:posOffset>
             </wp:positionV>
             <wp:extent cx="1257300" cy="2836375"/>
+            <wp:wrapSquare wrapText="bothSides"/>
             <wp:effectExtent b="0" l="0" r="0" t="0"/>
-            <wp:wrapNone/>
             <wp:docPr id="42" name="image48.jpg"/>
             <a:graphic>
               <a:graphicData uri="http://schemas.openxmlformats.org/drawingml/2006/picture">
@@ -17339,13 +17091,6 @@
             </a:graphic>
           </wp:anchor>
         </w:drawing>
-      </w:r>
-      <w:r>
-        <w:rPr>
-          <w:rFonts w:ascii="Georgia" w:hAnsi="Georgia" w:eastAsia="Georgia" w:cs="Georgia"/>
-          <w:b w:val="0"/>
-          <w:sz w:val="22"/>
-        </w:rPr>
         <w:drawing>
           <wp:anchor allowOverlap="1" behindDoc="0" distB="114300" distT="114300" distL="114300" distR="114300" hidden="0" layoutInCell="1" locked="0" relativeHeight="0" simplePos="0">
             <wp:simplePos x="0" y="0"/>
@@ -17356,8 +17101,8 @@
               <wp:posOffset>342900</wp:posOffset>
             </wp:positionV>
             <wp:extent cx="1257300" cy="2836375"/>
+            <wp:wrapSquare wrapText="bothSides"/>
             <wp:effectExtent b="0" l="0" r="0" t="0"/>
-            <wp:wrapNone/>
             <wp:docPr id="11" name="image24.jpg"/>
             <a:graphic>
               <a:graphicData uri="http://schemas.openxmlformats.org/drawingml/2006/picture">

</xml_diff>

<commit_message>
Strict blank-slate formatting rebuild of DRAFT_003
Full strip of empties and prior spacing, then exact re-application of all rules: Georgia, double (title 1.5), A4+margins, major 3+3+section break, minor 1-before, table borders, bold-spill clear, title-page exact spacers. Image wrap: topAndBottom for body, square for appendix. Media preserved.
</commit_message>
<xml_diff>
--- a/thesis/Velasquez_CTA_Skincare_Thesis_DRAFT_003.docx
+++ b/thesis/Velasquez_CTA_Skincare_Thesis_DRAFT_003.docx
@@ -20,21 +20,6 @@
     <w:p>
       <w:pPr>
         <w:spacing w:before="0" w:after="0" w:line="360" w:lineRule="auto"/>
-      </w:pPr>
-    </w:p>
-    <w:p>
-      <w:pPr>
-        <w:spacing w:before="0" w:after="0" w:line="360" w:lineRule="auto"/>
-      </w:pPr>
-    </w:p>
-    <w:p>
-      <w:pPr>
-        <w:spacing w:before="0" w:after="0" w:line="360" w:lineRule="auto"/>
-      </w:pPr>
-    </w:p>
-    <w:p>
-      <w:pPr>
-        <w:spacing w:before="0" w:after="0" w:line="360" w:lineRule="auto"/>
         <w:ind w:left="100"/>
         <w:jc w:val="center"/>
         <w:rPr>
@@ -332,6 +317,11 @@
         </w:rPr>
         <w:t xml:space="preserve"> By</w:t>
       </w:r>
+    </w:p>
+    <w:p>
+      <w:pPr>
+        <w:spacing w:before="0" w:after="0" w:line="360" w:lineRule="auto"/>
+      </w:pPr>
     </w:p>
     <w:p>
       <w:pPr>
@@ -426,14 +416,7 @@
     </w:p>
     <w:p>
       <w:pPr>
-        <w:spacing w:before="0" w:after="0" w:line="360" w:lineRule="auto"/>
-        <w:ind w:left="100" w:firstLine="0"/>
-        <w:jc w:val="center"/>
-        <w:rPr>
-          <w:rFonts w:ascii="Georgia" w:cs="Georgia" w:eastAsia="Georgia" w:hAnsi="Georgia"/>
-          <w:sz w:val="24"/>
-          <w:szCs w:val="24"/>
-        </w:rPr>
+        <w:spacing w:before="0" w:after="0" w:line="480" w:lineRule="auto"/>
         <w:sectPr>
           <w:pgSz w:w="11909" w:h="16834"/>
           <w:pgMar w:top="1440" w:right="1440" w:bottom="1440" w:left="2160" w:header="720" w:footer="720" w:gutter="0"/>
@@ -442,6 +425,25 @@
           <w:headerReference w:type="first" r:id="rId12"/>
         </w:sectPr>
       </w:pPr>
+    </w:p>
+    <w:p>
+      <w:pPr>
+        <w:spacing w:before="0" w:after="0" w:line="360" w:lineRule="auto"/>
+        <w:ind w:left="100" w:firstLine="0"/>
+        <w:jc w:val="center"/>
+        <w:rPr>
+          <w:rFonts w:ascii="Georgia" w:cs="Georgia" w:eastAsia="Georgia" w:hAnsi="Georgia"/>
+          <w:sz w:val="24"/>
+          <w:szCs w:val="24"/>
+        </w:rPr>
+        <w:sectPr>
+          <w:pgSz w:w="11909" w:h="16834"/>
+          <w:pgMar w:top="1440" w:right="1440" w:bottom="1440" w:left="2160" w:header="720" w:footer="720" w:gutter="0"/>
+          <w:titlePg/>
+          <w:headerReference w:type="default" r:id="rId11"/>
+          <w:headerReference w:type="first" r:id="rId12"/>
+        </w:sectPr>
+      </w:pPr>
       <w:r>
         <w:rPr>
           <w:rFonts w:ascii="Georgia" w:hAnsi="Georgia" w:eastAsia="Georgia" w:cs="Georgia"/>
@@ -449,6 +451,33 @@
           <w:rtl w:val="0"/>
         </w:rPr>
       </w:r>
+    </w:p>
+    <w:p>
+      <w:pPr>
+        <w:spacing w:before="0" w:after="0" w:line="480" w:lineRule="auto"/>
+      </w:pPr>
+    </w:p>
+    <w:p>
+      <w:pPr>
+        <w:spacing w:before="0" w:after="0" w:line="480" w:lineRule="auto"/>
+      </w:pPr>
+    </w:p>
+    <w:p>
+      <w:pPr>
+        <w:spacing w:before="0" w:after="0" w:line="480" w:lineRule="auto"/>
+      </w:pPr>
+    </w:p>
+    <w:p>
+      <w:pPr>
+        <w:spacing w:before="0" w:after="0" w:line="480" w:lineRule="auto"/>
+        <w:sectPr>
+          <w:pgSz w:w="11906" w:h="16838"/>
+          <w:pgMar w:top="1440" w:right="1440" w:bottom="1440" w:left="2160" w:header="720" w:footer="720" w:gutter="0"/>
+          <w:titlePg/>
+          <w:headerReference w:type="default" r:id="rId11"/>
+          <w:headerReference w:type="first" r:id="rId12"/>
+        </w:sectPr>
+      </w:pPr>
     </w:p>
     <w:p>
       <w:pPr>
@@ -508,6 +537,11 @@
     </w:p>
     <w:p>
       <w:pPr>
+        <w:spacing w:before="0" w:after="0" w:line="480" w:lineRule="auto"/>
+      </w:pPr>
+    </w:p>
+    <w:p>
+      <w:pPr>
         <w:spacing w:line="480" w:lineRule="auto" w:before="0" w:after="0"/>
         <w:ind w:firstLine="0"/>
         <w:jc w:val="left"/>
@@ -603,6 +637,11 @@
     <w:p>
       <w:pPr>
         <w:spacing w:before="0" w:after="0" w:line="480" w:lineRule="auto"/>
+      </w:pPr>
+    </w:p>
+    <w:p>
+      <w:pPr>
+        <w:spacing w:before="0" w:after="0" w:line="480" w:lineRule="auto"/>
         <w:ind w:firstLine="0"/>
         <w:jc w:val="left"/>
       </w:pPr>
@@ -739,6 +778,11 @@
     <w:p>
       <w:pPr>
         <w:spacing w:before="0" w:after="0" w:line="480" w:lineRule="auto"/>
+      </w:pPr>
+    </w:p>
+    <w:p>
+      <w:pPr>
+        <w:spacing w:before="0" w:after="0" w:line="480" w:lineRule="auto"/>
         <w:ind w:firstLine="0"/>
         <w:jc w:val="left"/>
       </w:pPr>
@@ -892,6 +936,11 @@
     <w:p>
       <w:pPr>
         <w:spacing w:before="0" w:after="0" w:line="480" w:lineRule="auto"/>
+      </w:pPr>
+    </w:p>
+    <w:p>
+      <w:pPr>
+        <w:spacing w:before="0" w:after="0" w:line="480" w:lineRule="auto"/>
         <w:ind w:firstLine="0"/>
         <w:jc w:val="left"/>
       </w:pPr>
@@ -1075,6 +1124,11 @@
         </w:rPr>
         <w:t xml:space="preserve">The present study therefore examines how persuasive meaning is constructed through CTA phrases in Facebook skincare advertisement captions. Aristotle’s framework is used to identify the dominant rhetorical appeal (ethos, pathos, or logos) by reading the phrase together with its surrounding caption. Yule’s (1996) classification of directive speech acts, operationalized through the definitions in Anggraini and Afriana (2023), is used to code each phrase as command, order, request, or suggestion. The analysis treats the CTA phrase as the primary unit, with the full caption supplying context when the rhetorical appeal is determined. In this way the study brings the two lenses together at the exact point where the caption most clearly tries to turn attention into action.</w:t>
       </w:r>
+    </w:p>
+    <w:p>
+      <w:pPr>
+        <w:spacing w:before="0" w:after="0" w:line="480" w:lineRule="auto"/>
+      </w:pPr>
     </w:p>
     <w:p>
       <w:pPr>
@@ -1280,6 +1334,11 @@
         </w:rPr>
         <w:t xml:space="preserve">How do directive subtypes and rhetorical appeals contribute to the construction of persuasive meaning in the CTA phrases of selected Facebook skincare advertisements?</w:t>
       </w:r>
+    </w:p>
+    <w:p>
+      <w:pPr>
+        <w:spacing w:before="0" w:after="0" w:line="480" w:lineRule="auto"/>
+      </w:pPr>
     </w:p>
     <w:p>
       <w:pPr>
@@ -1544,7 +1603,7 @@
               <wp:posOffset>390525</wp:posOffset>
             </wp:positionV>
             <wp:extent cx="3052763" cy="3229856"/>
-            <wp:wrapSquare wrapText="bothSides"/>
+            <wp:wrapTopAndBottom/>
             <wp:effectExtent b="0" l="0" r="0" t="0"/>
             <wp:docPr id="12" name="image40.jpg"/>
             <a:graphic>
@@ -1698,6 +1757,11 @@
     </w:p>
     <w:p>
       <w:pPr>
+        <w:spacing w:before="0" w:after="0" w:line="480" w:lineRule="auto"/>
+      </w:pPr>
+    </w:p>
+    <w:p>
+      <w:pPr>
         <w:spacing w:after="0" w:before="0" w:line="480" w:lineRule="auto"/>
         <w:ind w:firstLine="0"/>
         <w:jc w:val="left"/>
@@ -1885,6 +1949,11 @@
     </w:p>
     <w:p>
       <w:pPr>
+        <w:spacing w:before="0" w:after="0" w:line="480" w:lineRule="auto"/>
+      </w:pPr>
+    </w:p>
+    <w:p>
+      <w:pPr>
         <w:spacing w:before="0" w:line="480" w:lineRule="auto" w:after="0"/>
         <w:ind w:firstLine="0"/>
         <w:jc w:val="left"/>
@@ -1996,6 +2065,11 @@
     </w:p>
     <w:p>
       <w:pPr>
+        <w:spacing w:before="0" w:after="0" w:line="480" w:lineRule="auto"/>
+      </w:pPr>
+    </w:p>
+    <w:p>
+      <w:pPr>
         <w:spacing w:after="0" w:before="0" w:line="480" w:lineRule="auto"/>
         <w:ind w:firstLine="0"/>
         <w:jc w:val="left"/>
@@ -2488,6 +2562,33 @@
         </w:rPr>
         <w:t xml:space="preserve">These refer to promotional Facebook posts that advertise skincare products. In this study, skincare advertisements are operationally defined as the selected Facebook advertisement captions from Luxe Organix, Olay, The Ordinary, Pond’s, and Myra that contain CTA phrases and serve as the corpus of analysis.</w:t>
       </w:r>
+    </w:p>
+    <w:p>
+      <w:pPr>
+        <w:spacing w:before="0" w:after="0" w:line="480" w:lineRule="auto"/>
+      </w:pPr>
+    </w:p>
+    <w:p>
+      <w:pPr>
+        <w:spacing w:before="0" w:after="0" w:line="480" w:lineRule="auto"/>
+      </w:pPr>
+    </w:p>
+    <w:p>
+      <w:pPr>
+        <w:spacing w:before="0" w:after="0" w:line="480" w:lineRule="auto"/>
+      </w:pPr>
+    </w:p>
+    <w:p>
+      <w:pPr>
+        <w:spacing w:before="0" w:after="0" w:line="480" w:lineRule="auto"/>
+        <w:sectPr>
+          <w:pgSz w:w="11906" w:h="16838"/>
+          <w:pgMar w:top="1440" w:right="1440" w:bottom="1440" w:left="2160" w:header="720" w:footer="720" w:gutter="0"/>
+          <w:titlePg/>
+          <w:headerReference w:type="default" r:id="rId11"/>
+          <w:headerReference w:type="first" r:id="rId12"/>
+        </w:sectPr>
+      </w:pPr>
     </w:p>
     <w:p>
       <w:pPr>
@@ -2517,6 +2618,21 @@
     </w:p>
     <w:p>
       <w:pPr>
+        <w:spacing w:before="0" w:after="0" w:line="480" w:lineRule="auto"/>
+      </w:pPr>
+    </w:p>
+    <w:p>
+      <w:pPr>
+        <w:spacing w:before="0" w:after="0" w:line="480" w:lineRule="auto"/>
+      </w:pPr>
+    </w:p>
+    <w:p>
+      <w:pPr>
+        <w:spacing w:before="0" w:after="0" w:line="480" w:lineRule="auto"/>
+      </w:pPr>
+    </w:p>
+    <w:p>
+      <w:pPr>
         <w:spacing w:line="480" w:lineRule="auto" w:before="0" w:after="0"/>
         <w:ind w:firstLine="720"/>
         <w:jc w:val="both"/>
@@ -2537,6 +2653,11 @@
     </w:p>
     <w:p>
       <w:pPr>
+        <w:spacing w:before="0" w:after="0" w:line="480" w:lineRule="auto"/>
+      </w:pPr>
+    </w:p>
+    <w:p>
+      <w:pPr>
         <w:spacing w:line="480" w:lineRule="auto" w:before="0" w:after="0"/>
         <w:ind w:firstLine="0"/>
         <w:jc w:val="left"/>
@@ -2643,6 +2764,11 @@
     </w:p>
     <w:p>
       <w:pPr>
+        <w:spacing w:before="0" w:after="0" w:line="480" w:lineRule="auto"/>
+      </w:pPr>
+    </w:p>
+    <w:p>
+      <w:pPr>
         <w:spacing w:after="0" w:before="0" w:line="480" w:lineRule="auto"/>
         <w:ind w:firstLine="0"/>
         <w:jc w:val="left"/>
@@ -2786,6 +2912,11 @@
         </w:rPr>
         <w:t xml:space="preserve">The study covered advertisements published from January 2023 to June 2026. For each brand, one advertisement was selected from the January–June period and another from the July–December period for each year from 2023 to 2025. For 2026, the selection was limited to advertisements published from January to June. Among the qualifying advertisements within each period, the advertisement with the highest number of likes or reactions was prioritized. The final corpus consisted of 34 CTA phrases instead of the expected 35 because no Pond’s advertisement was available for the July–December 2024 period. The selected CTA phrases served as the primary data for analysis, while their original advertisement captions provided context for identifying rhetorical appeals.</w:t>
       </w:r>
+    </w:p>
+    <w:p>
+      <w:pPr>
+        <w:spacing w:before="0" w:after="0" w:line="480" w:lineRule="auto"/>
+      </w:pPr>
     </w:p>
     <w:p>
       <w:pPr>
@@ -4251,6 +4382,11 @@
     </w:p>
     <w:p>
       <w:pPr>
+        <w:spacing w:before="0" w:after="0" w:line="480" w:lineRule="auto"/>
+      </w:pPr>
+    </w:p>
+    <w:p>
+      <w:pPr>
         <w:pStyle w:val="Heading2"/>
         <w:spacing w:line="480" w:lineRule="auto" w:before="0" w:after="0"/>
         <w:ind w:firstLine="0"/>
@@ -4317,6 +4453,33 @@
     </w:p>
     <w:p>
       <w:pPr>
+        <w:spacing w:before="0" w:after="0" w:line="480" w:lineRule="auto"/>
+      </w:pPr>
+    </w:p>
+    <w:p>
+      <w:pPr>
+        <w:spacing w:before="0" w:after="0" w:line="480" w:lineRule="auto"/>
+      </w:pPr>
+    </w:p>
+    <w:p>
+      <w:pPr>
+        <w:spacing w:before="0" w:after="0" w:line="480" w:lineRule="auto"/>
+      </w:pPr>
+    </w:p>
+    <w:p>
+      <w:pPr>
+        <w:spacing w:before="0" w:after="0" w:line="480" w:lineRule="auto"/>
+        <w:sectPr>
+          <w:pgSz w:w="11906" w:h="16838"/>
+          <w:pgMar w:top="1440" w:right="1440" w:bottom="1440" w:left="2160" w:header="720" w:footer="720" w:gutter="0"/>
+          <w:titlePg/>
+          <w:headerReference w:type="default" r:id="rId11"/>
+          <w:headerReference w:type="first" r:id="rId12"/>
+        </w:sectPr>
+      </w:pPr>
+    </w:p>
+    <w:p>
+      <w:pPr>
         <w:spacing w:after="0" w:before="0" w:line="480" w:lineRule="auto"/>
         <w:ind w:firstLine="0"/>
         <w:jc w:val="center"/>
@@ -4340,6 +4503,21 @@
         </w:rPr>
         <w:t xml:space="preserve">RESULTS, ANALYSIS, AND DISCUSSION</w:t>
       </w:r>
+    </w:p>
+    <w:p>
+      <w:pPr>
+        <w:spacing w:before="0" w:after="0" w:line="480" w:lineRule="auto"/>
+      </w:pPr>
+    </w:p>
+    <w:p>
+      <w:pPr>
+        <w:spacing w:before="0" w:after="0" w:line="480" w:lineRule="auto"/>
+      </w:pPr>
+    </w:p>
+    <w:p>
+      <w:pPr>
+        <w:spacing w:before="0" w:after="0" w:line="480" w:lineRule="auto"/>
+      </w:pPr>
     </w:p>
     <w:p>
       <w:pPr>
@@ -8990,6 +9168,33 @@
     </w:p>
     <w:p>
       <w:pPr>
+        <w:spacing w:before="0" w:after="0" w:line="480" w:lineRule="auto"/>
+      </w:pPr>
+    </w:p>
+    <w:p>
+      <w:pPr>
+        <w:spacing w:before="0" w:after="0" w:line="480" w:lineRule="auto"/>
+      </w:pPr>
+    </w:p>
+    <w:p>
+      <w:pPr>
+        <w:spacing w:before="0" w:after="0" w:line="480" w:lineRule="auto"/>
+      </w:pPr>
+    </w:p>
+    <w:p>
+      <w:pPr>
+        <w:spacing w:before="0" w:after="0" w:line="480" w:lineRule="auto"/>
+        <w:sectPr>
+          <w:pgSz w:w="11906" w:h="16838"/>
+          <w:pgMar w:top="1440" w:right="1440" w:bottom="1440" w:left="2160" w:header="720" w:footer="720" w:gutter="0"/>
+          <w:titlePg/>
+          <w:headerReference w:type="default" r:id="rId11"/>
+          <w:headerReference w:type="first" r:id="rId12"/>
+        </w:sectPr>
+      </w:pPr>
+    </w:p>
+    <w:p>
+      <w:pPr>
         <w:spacing w:after="0" w:before="0" w:line="480" w:lineRule="auto"/>
         <w:ind w:firstLine="0"/>
         <w:jc w:val="center"/>
@@ -9016,6 +9221,21 @@
     </w:p>
     <w:p>
       <w:pPr>
+        <w:spacing w:before="0" w:after="0" w:line="480" w:lineRule="auto"/>
+      </w:pPr>
+    </w:p>
+    <w:p>
+      <w:pPr>
+        <w:spacing w:before="0" w:after="0" w:line="480" w:lineRule="auto"/>
+      </w:pPr>
+    </w:p>
+    <w:p>
+      <w:pPr>
+        <w:spacing w:before="0" w:after="0" w:line="480" w:lineRule="auto"/>
+      </w:pPr>
+    </w:p>
+    <w:p>
+      <w:pPr>
         <w:spacing w:after="0" w:before="0" w:line="480" w:lineRule="auto"/>
         <w:ind w:firstLine="720"/>
         <w:jc w:val="both"/>
@@ -9350,6 +9570,33 @@
     </w:p>
     <w:p>
       <w:pPr>
+        <w:spacing w:before="0" w:after="0" w:line="480" w:lineRule="auto"/>
+      </w:pPr>
+    </w:p>
+    <w:p>
+      <w:pPr>
+        <w:spacing w:before="0" w:after="0" w:line="480" w:lineRule="auto"/>
+      </w:pPr>
+    </w:p>
+    <w:p>
+      <w:pPr>
+        <w:spacing w:before="0" w:after="0" w:line="480" w:lineRule="auto"/>
+      </w:pPr>
+    </w:p>
+    <w:p>
+      <w:pPr>
+        <w:spacing w:before="0" w:after="0" w:line="480" w:lineRule="auto"/>
+        <w:sectPr>
+          <w:pgSz w:w="11906" w:h="16838"/>
+          <w:pgMar w:top="1440" w:right="1440" w:bottom="1440" w:left="2160" w:header="720" w:footer="720" w:gutter="0"/>
+          <w:titlePg/>
+          <w:headerReference w:type="default" r:id="rId11"/>
+          <w:headerReference w:type="first" r:id="rId12"/>
+        </w:sectPr>
+      </w:pPr>
+    </w:p>
+    <w:p>
+      <w:pPr>
         <w:spacing w:after="0" w:before="0" w:line="480" w:lineRule="auto"/>
         <w:ind w:firstLine="0"/>
         <w:jc w:val="center"/>
@@ -9385,6 +9632,21 @@
     </w:p>
     <w:p>
       <w:pPr>
+        <w:spacing w:before="0" w:after="0" w:line="480" w:lineRule="auto"/>
+      </w:pPr>
+    </w:p>
+    <w:p>
+      <w:pPr>
+        <w:spacing w:before="0" w:after="0" w:line="480" w:lineRule="auto"/>
+      </w:pPr>
+    </w:p>
+    <w:p>
+      <w:pPr>
+        <w:spacing w:before="0" w:after="0" w:line="480" w:lineRule="auto"/>
+      </w:pPr>
+    </w:p>
+    <w:p>
+      <w:pPr>
         <w:spacing w:line="480" w:lineRule="auto" w:before="0" w:after="0"/>
         <w:ind w:firstLine="720"/>
         <w:jc w:val="both"/>
@@ -9581,7 +9843,6 @@
     </w:p>
     <w:p>
       <w:pPr>
-        <w:widowControl w:val="0"/>
         <w:spacing w:line="480" w:lineRule="auto" w:before="0" w:after="0"/>
         <w:ind w:left="720" w:firstLine="720"/>
         <w:jc w:val="both"/>
@@ -9651,7 +9912,6 @@
     </w:p>
     <w:p>
       <w:pPr>
-        <w:widowControl w:val="0"/>
         <w:spacing w:line="480" w:lineRule="auto" w:before="0" w:after="0"/>
         <w:ind w:left="720" w:firstLine="720"/>
         <w:jc w:val="both"/>
@@ -9698,7 +9958,6 @@
     </w:p>
     <w:p>
       <w:pPr>
-        <w:widowControl w:val="0"/>
         <w:spacing w:line="480" w:lineRule="auto" w:before="0" w:after="0"/>
         <w:ind w:left="720" w:firstLine="720"/>
         <w:jc w:val="both"/>
@@ -9745,7 +10004,6 @@
     </w:p>
     <w:p>
       <w:pPr>
-        <w:widowControl w:val="0"/>
         <w:spacing w:line="480" w:lineRule="auto" w:before="0" w:after="0"/>
         <w:ind w:left="720" w:firstLine="720"/>
         <w:jc w:val="both"/>
@@ -9815,7 +10073,6 @@
     </w:p>
     <w:p>
       <w:pPr>
-        <w:widowControl w:val="0"/>
         <w:spacing w:line="480" w:lineRule="auto" w:before="0" w:after="0"/>
         <w:ind w:left="720" w:firstLine="720"/>
         <w:jc w:val="both"/>
@@ -9885,7 +10142,6 @@
     </w:p>
     <w:p>
       <w:pPr>
-        <w:widowControl w:val="0"/>
         <w:spacing w:line="480" w:lineRule="auto" w:before="0" w:after="0"/>
         <w:ind w:left="720" w:firstLine="720"/>
         <w:jc w:val="both"/>
@@ -9932,7 +10188,6 @@
     </w:p>
     <w:p>
       <w:pPr>
-        <w:widowControl w:val="0"/>
         <w:spacing w:line="480" w:lineRule="auto" w:before="0" w:after="0"/>
         <w:ind w:left="720" w:firstLine="720"/>
         <w:jc w:val="both"/>
@@ -9988,7 +10243,6 @@
     </w:p>
     <w:p>
       <w:pPr>
-        <w:widowControl w:val="0"/>
         <w:spacing w:line="480" w:lineRule="auto" w:before="0" w:after="0"/>
         <w:ind w:left="720" w:firstLine="720"/>
         <w:jc w:val="both"/>
@@ -10035,7 +10289,6 @@
     </w:p>
     <w:p>
       <w:pPr>
-        <w:widowControl w:val="0"/>
         <w:spacing w:line="480" w:lineRule="auto" w:before="0" w:after="0"/>
         <w:ind w:left="720" w:firstLine="720"/>
         <w:jc w:val="both"/>
@@ -10082,7 +10335,6 @@
     </w:p>
     <w:p>
       <w:pPr>
-        <w:widowControl w:val="0"/>
         <w:spacing w:line="480" w:lineRule="auto" w:before="0" w:after="0"/>
         <w:ind w:left="720" w:firstLine="720"/>
         <w:jc w:val="both"/>
@@ -10129,7 +10381,6 @@
     </w:p>
     <w:p>
       <w:pPr>
-        <w:widowControl w:val="0"/>
         <w:spacing w:line="480" w:lineRule="auto" w:before="0" w:after="0"/>
         <w:ind w:left="720" w:firstLine="720"/>
         <w:jc w:val="both"/>
@@ -10176,7 +10427,6 @@
     </w:p>
     <w:p>
       <w:pPr>
-        <w:widowControl w:val="0"/>
         <w:spacing w:line="480" w:lineRule="auto" w:before="0" w:after="0"/>
         <w:ind w:left="720" w:firstLine="720"/>
         <w:jc w:val="both"/>
@@ -10200,7 +10450,6 @@
     </w:p>
     <w:p>
       <w:pPr>
-        <w:widowControl w:val="0"/>
         <w:spacing w:line="480" w:lineRule="auto" w:before="0" w:after="0"/>
         <w:ind w:left="720" w:firstLine="720"/>
         <w:jc w:val="both"/>
@@ -10272,7 +10521,6 @@
     </w:p>
     <w:p>
       <w:pPr>
-        <w:widowControl w:val="0"/>
         <w:spacing w:line="480" w:lineRule="auto" w:before="0" w:after="0"/>
         <w:ind w:left="720" w:firstLine="720"/>
         <w:jc w:val="both"/>
@@ -10319,7 +10567,6 @@
     </w:p>
     <w:p>
       <w:pPr>
-        <w:widowControl w:val="0"/>
         <w:spacing w:line="480" w:lineRule="auto" w:before="0" w:after="0"/>
         <w:ind w:left="720" w:firstLine="720"/>
         <w:jc w:val="both"/>
@@ -10379,7 +10626,6 @@
     </w:p>
     <w:p>
       <w:pPr>
-        <w:widowControl w:val="0"/>
         <w:spacing w:line="480" w:lineRule="auto" w:before="0" w:after="0"/>
         <w:ind w:left="720" w:firstLine="720"/>
         <w:jc w:val="both"/>
@@ -10439,7 +10685,6 @@
     </w:p>
     <w:p>
       <w:pPr>
-        <w:widowControl w:val="0"/>
         <w:spacing w:line="480" w:lineRule="auto" w:before="0" w:after="0"/>
         <w:ind w:left="720" w:firstLine="720"/>
         <w:jc w:val="both"/>
@@ -10499,7 +10744,6 @@
     </w:p>
     <w:p>
       <w:pPr>
-        <w:widowControl w:val="0"/>
         <w:spacing w:line="480" w:lineRule="auto" w:before="0" w:after="0"/>
         <w:ind w:left="720" w:firstLine="720"/>
         <w:jc w:val="both"/>
@@ -10547,7 +10791,6 @@
     </w:p>
     <w:p>
       <w:pPr>
-        <w:widowControl w:val="0"/>
         <w:spacing w:line="480" w:lineRule="auto" w:before="0" w:after="0"/>
         <w:ind w:left="720" w:firstLine="720"/>
         <w:jc w:val="both"/>
@@ -10607,7 +10850,6 @@
     </w:p>
     <w:p>
       <w:pPr>
-        <w:widowControl w:val="0"/>
         <w:spacing w:line="480" w:lineRule="auto" w:before="0" w:after="0"/>
         <w:ind w:left="720" w:firstLine="720"/>
         <w:jc w:val="both"/>
@@ -10654,7 +10896,6 @@
     </w:p>
     <w:p>
       <w:pPr>
-        <w:widowControl w:val="0"/>
         <w:spacing w:line="480" w:lineRule="auto" w:before="0" w:after="0"/>
         <w:ind w:left="720" w:firstLine="720"/>
         <w:jc w:val="both"/>
@@ -10701,7 +10942,6 @@
     </w:p>
     <w:p>
       <w:pPr>
-        <w:widowControl w:val="0"/>
         <w:spacing w:line="480" w:lineRule="auto" w:before="0" w:after="0"/>
         <w:ind w:left="720" w:firstLine="720"/>
         <w:jc w:val="both"/>
@@ -10748,7 +10988,6 @@
     </w:p>
     <w:p>
       <w:pPr>
-        <w:widowControl w:val="0"/>
         <w:spacing w:line="480" w:lineRule="auto" w:before="0" w:after="0"/>
         <w:ind w:left="720" w:firstLine="720"/>
         <w:jc w:val="both"/>
@@ -10795,7 +11034,6 @@
     </w:p>
     <w:p>
       <w:pPr>
-        <w:widowControl w:val="0"/>
         <w:spacing w:line="480" w:lineRule="auto" w:before="0" w:after="0"/>
         <w:ind w:left="720" w:firstLine="720"/>
         <w:jc w:val="both"/>
@@ -10842,7 +11080,6 @@
     </w:p>
     <w:p>
       <w:pPr>
-        <w:widowControl w:val="0"/>
         <w:spacing w:line="480" w:lineRule="auto" w:before="0" w:after="0"/>
         <w:ind w:left="720" w:firstLine="720"/>
         <w:jc w:val="both"/>
@@ -10889,7 +11126,6 @@
     </w:p>
     <w:p>
       <w:pPr>
-        <w:widowControl w:val="0"/>
         <w:spacing w:line="480" w:lineRule="auto" w:before="0" w:after="0"/>
         <w:ind w:left="720" w:firstLine="720"/>
         <w:jc w:val="both"/>
@@ -10936,7 +11172,6 @@
     </w:p>
     <w:p>
       <w:pPr>
-        <w:widowControl w:val="0"/>
         <w:spacing w:line="480" w:lineRule="auto" w:before="0" w:after="0"/>
         <w:ind w:left="720" w:firstLine="720"/>
         <w:jc w:val="both"/>
@@ -10983,7 +11218,6 @@
     </w:p>
     <w:p>
       <w:pPr>
-        <w:widowControl w:val="0"/>
         <w:spacing w:line="480" w:lineRule="auto" w:before="0" w:after="0"/>
         <w:ind w:left="720" w:firstLine="720"/>
         <w:jc w:val="both"/>
@@ -11030,7 +11264,6 @@
     </w:p>
     <w:p>
       <w:pPr>
-        <w:widowControl w:val="0"/>
         <w:spacing w:line="480" w:lineRule="auto" w:before="0" w:after="0"/>
         <w:ind w:left="720" w:firstLine="720"/>
         <w:jc w:val="both"/>
@@ -11100,7 +11333,6 @@
     </w:p>
     <w:p>
       <w:pPr>
-        <w:widowControl w:val="0"/>
         <w:spacing w:line="480" w:lineRule="auto" w:before="0" w:after="0"/>
         <w:ind w:left="720" w:firstLine="720"/>
         <w:jc w:val="both"/>
@@ -11170,7 +11402,6 @@
     </w:p>
     <w:p>
       <w:pPr>
-        <w:widowControl w:val="0"/>
         <w:spacing w:line="480" w:lineRule="auto" w:before="0" w:after="0"/>
         <w:ind w:left="720" w:firstLine="720"/>
         <w:jc w:val="both"/>
@@ -11217,7 +11448,6 @@
     </w:p>
     <w:p>
       <w:pPr>
-        <w:widowControl w:val="0"/>
         <w:spacing w:line="480" w:lineRule="auto" w:before="0" w:after="0"/>
         <w:ind w:left="720" w:firstLine="720"/>
         <w:jc w:val="both"/>
@@ -11264,7 +11494,6 @@
     </w:p>
     <w:p>
       <w:pPr>
-        <w:widowControl w:val="0"/>
         <w:spacing w:line="480" w:lineRule="auto" w:before="0" w:after="0"/>
         <w:ind w:left="720" w:firstLine="720"/>
         <w:jc w:val="both"/>
@@ -11312,7 +11541,6 @@
     </w:p>
     <w:p>
       <w:pPr>
-        <w:widowControl w:val="0"/>
         <w:spacing w:line="480" w:lineRule="auto" w:before="0" w:after="0"/>
         <w:ind w:left="720" w:firstLine="720"/>
         <w:jc w:val="both"/>
@@ -11360,7 +11588,6 @@
     </w:p>
     <w:p>
       <w:pPr>
-        <w:widowControl w:val="0"/>
         <w:spacing w:line="480" w:lineRule="auto" w:before="0" w:after="0"/>
         <w:ind w:left="720" w:firstLine="720"/>
         <w:jc w:val="both"/>
@@ -11407,7 +11634,6 @@
     </w:p>
     <w:p>
       <w:pPr>
-        <w:widowControl w:val="0"/>
         <w:spacing w:line="480" w:lineRule="auto" w:before="0" w:after="0"/>
         <w:ind w:left="720" w:firstLine="720"/>
         <w:jc w:val="both"/>
@@ -11454,7 +11680,6 @@
     </w:p>
     <w:p>
       <w:pPr>
-        <w:widowControl w:val="0"/>
         <w:spacing w:line="480" w:lineRule="auto" w:before="0" w:after="0"/>
         <w:ind w:left="720" w:firstLine="720"/>
         <w:jc w:val="both"/>
@@ -11537,7 +11762,6 @@
     </w:p>
     <w:p>
       <w:pPr>
-        <w:widowControl w:val="0"/>
         <w:spacing w:line="480" w:lineRule="auto" w:before="0" w:after="0"/>
         <w:ind w:left="720" w:firstLine="720"/>
         <w:jc w:val="both"/>
@@ -11584,7 +11808,6 @@
     </w:p>
     <w:p>
       <w:pPr>
-        <w:widowControl w:val="0"/>
         <w:spacing w:line="480" w:lineRule="auto" w:before="0" w:after="0"/>
         <w:ind w:left="720" w:firstLine="720"/>
         <w:jc w:val="both"/>
@@ -11631,7 +11854,6 @@
     </w:p>
     <w:p>
       <w:pPr>
-        <w:widowControl w:val="0"/>
         <w:spacing w:line="480" w:lineRule="auto" w:before="0" w:after="0"/>
         <w:ind w:left="720" w:firstLine="720"/>
         <w:jc w:val="both"/>
@@ -11678,7 +11900,6 @@
     </w:p>
     <w:p>
       <w:pPr>
-        <w:widowControl w:val="0"/>
         <w:spacing w:line="480" w:lineRule="auto" w:before="0" w:after="0"/>
         <w:ind w:left="720" w:firstLine="720"/>
         <w:jc w:val="both"/>
@@ -11725,7 +11946,6 @@
     </w:p>
     <w:p>
       <w:pPr>
-        <w:widowControl w:val="0"/>
         <w:spacing w:line="480" w:lineRule="auto" w:before="0" w:after="0"/>
         <w:ind w:left="720" w:firstLine="720"/>
         <w:jc w:val="both"/>
@@ -11772,7 +11992,6 @@
     </w:p>
     <w:p>
       <w:pPr>
-        <w:widowControl w:val="0"/>
         <w:spacing w:line="480" w:lineRule="auto" w:before="0" w:after="0"/>
         <w:ind w:left="720" w:firstLine="720"/>
         <w:jc w:val="both"/>
@@ -11819,7 +12038,6 @@
     </w:p>
     <w:p>
       <w:pPr>
-        <w:widowControl w:val="0"/>
         <w:spacing w:line="480" w:lineRule="auto" w:before="0" w:after="0"/>
         <w:ind w:left="720" w:firstLine="720"/>
         <w:jc w:val="both"/>
@@ -11889,7 +12107,6 @@
     </w:p>
     <w:p>
       <w:pPr>
-        <w:widowControl w:val="0"/>
         <w:spacing w:line="480" w:lineRule="auto" w:before="0" w:after="0"/>
         <w:ind w:left="720" w:firstLine="720"/>
         <w:jc w:val="both"/>
@@ -11959,7 +12176,6 @@
     </w:p>
     <w:p>
       <w:pPr>
-        <w:widowControl w:val="0"/>
         <w:spacing w:line="480" w:lineRule="auto" w:before="0" w:after="0"/>
         <w:ind w:left="720" w:firstLine="720"/>
         <w:jc w:val="both"/>
@@ -12006,7 +12222,6 @@
     </w:p>
     <w:p>
       <w:pPr>
-        <w:widowControl w:val="0"/>
         <w:spacing w:line="480" w:lineRule="auto" w:before="0" w:after="0"/>
         <w:ind w:left="720" w:firstLine="720"/>
         <w:jc w:val="both"/>
@@ -12053,7 +12268,6 @@
     </w:p>
     <w:p>
       <w:pPr>
-        <w:widowControl w:val="0"/>
         <w:spacing w:line="480" w:lineRule="auto" w:before="0" w:after="0"/>
         <w:ind w:left="720" w:firstLine="720"/>
         <w:jc w:val="both"/>
@@ -12077,7 +12291,6 @@
     </w:p>
     <w:p>
       <w:pPr>
-        <w:widowControl w:val="0"/>
         <w:spacing w:line="480" w:lineRule="auto" w:before="0" w:after="0"/>
         <w:ind w:left="720" w:firstLine="720"/>
         <w:jc w:val="both"/>
@@ -12101,7 +12314,6 @@
     </w:p>
     <w:p>
       <w:pPr>
-        <w:widowControl w:val="0"/>
         <w:spacing w:line="480" w:lineRule="auto" w:before="0" w:after="0"/>
         <w:ind w:left="720" w:firstLine="720"/>
         <w:jc w:val="both"/>
@@ -12171,7 +12383,6 @@
     </w:p>
     <w:p>
       <w:pPr>
-        <w:widowControl w:val="0"/>
         <w:spacing w:line="480" w:lineRule="auto" w:before="0" w:after="0"/>
         <w:ind w:left="720" w:firstLine="720"/>
         <w:jc w:val="both"/>
@@ -12218,7 +12429,6 @@
     </w:p>
     <w:p>
       <w:pPr>
-        <w:widowControl w:val="0"/>
         <w:spacing w:line="480" w:lineRule="auto" w:before="0" w:after="0"/>
         <w:ind w:left="720" w:firstLine="720"/>
         <w:jc w:val="both"/>
@@ -12265,7 +12475,6 @@
     </w:p>
     <w:p>
       <w:pPr>
-        <w:widowControl w:val="0"/>
         <w:spacing w:line="480" w:lineRule="auto" w:before="0" w:after="0"/>
         <w:ind w:left="720" w:firstLine="720"/>
         <w:jc w:val="both"/>
@@ -12424,6 +12633,33 @@
         </w:rPr>
         <w:t xml:space="preserve">https://books.google.com.ph/books?id=9trRnQEACAAJ&amp;lpg=PP1&amp;pg=PR4#v=onepage&amp;q&amp;f=false</w:t>
       </w:r>
+    </w:p>
+    <w:p>
+      <w:pPr>
+        <w:spacing w:before="0" w:after="0" w:line="480" w:lineRule="auto"/>
+      </w:pPr>
+    </w:p>
+    <w:p>
+      <w:pPr>
+        <w:spacing w:before="0" w:after="0" w:line="480" w:lineRule="auto"/>
+      </w:pPr>
+    </w:p>
+    <w:p>
+      <w:pPr>
+        <w:spacing w:before="0" w:after="0" w:line="480" w:lineRule="auto"/>
+      </w:pPr>
+    </w:p>
+    <w:p>
+      <w:pPr>
+        <w:spacing w:before="0" w:after="0" w:line="480" w:lineRule="auto"/>
+        <w:sectPr>
+          <w:pgSz w:w="11906" w:h="16838"/>
+          <w:pgMar w:top="1440" w:right="1440" w:bottom="1440" w:left="2160" w:header="720" w:footer="720" w:gutter="0"/>
+          <w:titlePg/>
+          <w:headerReference w:type="default" r:id="rId11"/>
+          <w:headerReference w:type="first" r:id="rId12"/>
+        </w:sectPr>
+      </w:pPr>
     </w:p>
     <w:p>
       <w:pPr>
@@ -12454,6 +12690,48 @@
     <w:p>
       <w:pPr>
         <w:spacing w:before="0" w:after="0" w:line="480" w:lineRule="auto"/>
+      </w:pPr>
+    </w:p>
+    <w:p>
+      <w:pPr>
+        <w:spacing w:before="0" w:after="0" w:line="480" w:lineRule="auto"/>
+      </w:pPr>
+    </w:p>
+    <w:p>
+      <w:pPr>
+        <w:spacing w:before="0" w:after="0" w:line="480" w:lineRule="auto"/>
+      </w:pPr>
+    </w:p>
+    <w:p>
+      <w:pPr>
+        <w:spacing w:before="0" w:after="0" w:line="480" w:lineRule="auto"/>
+      </w:pPr>
+    </w:p>
+    <w:p>
+      <w:pPr>
+        <w:spacing w:before="0" w:after="0" w:line="480" w:lineRule="auto"/>
+      </w:pPr>
+    </w:p>
+    <w:p>
+      <w:pPr>
+        <w:spacing w:before="0" w:after="0" w:line="480" w:lineRule="auto"/>
+      </w:pPr>
+    </w:p>
+    <w:p>
+      <w:pPr>
+        <w:spacing w:before="0" w:after="0" w:line="480" w:lineRule="auto"/>
+        <w:sectPr>
+          <w:pgSz w:w="11906" w:h="16838"/>
+          <w:pgMar w:top="1440" w:right="1440" w:bottom="1440" w:left="2160" w:header="720" w:footer="720" w:gutter="0"/>
+          <w:titlePg/>
+          <w:headerReference w:type="default" r:id="rId11"/>
+          <w:headerReference w:type="first" r:id="rId12"/>
+        </w:sectPr>
+      </w:pPr>
+    </w:p>
+    <w:p>
+      <w:pPr>
+        <w:spacing w:before="0" w:after="0" w:line="480" w:lineRule="auto"/>
         <w:ind w:firstLine="0"/>
         <w:jc w:val="center"/>
         <w:rPr>
@@ -12476,6 +12754,21 @@
         </w:rPr>
         <w:t xml:space="preserve">APPENDIX A: SCREENSHOTS OF THE SELECTED FACEBOOK SKINCARE ADVERTISEMENTS</w:t>
       </w:r>
+    </w:p>
+    <w:p>
+      <w:pPr>
+        <w:spacing w:before="0" w:after="0" w:line="480" w:lineRule="auto"/>
+      </w:pPr>
+    </w:p>
+    <w:p>
+      <w:pPr>
+        <w:spacing w:before="0" w:after="0" w:line="480" w:lineRule="auto"/>
+      </w:pPr>
+    </w:p>
+    <w:p>
+      <w:pPr>
+        <w:spacing w:before="0" w:after="0" w:line="480" w:lineRule="auto"/>
+      </w:pPr>
     </w:p>
     <w:p>
       <w:pPr>
@@ -14493,6 +14786,33 @@
     </w:p>
     <w:p>
       <w:pPr>
+        <w:spacing w:before="0" w:after="0" w:line="480" w:lineRule="auto"/>
+      </w:pPr>
+    </w:p>
+    <w:p>
+      <w:pPr>
+        <w:spacing w:before="0" w:after="0" w:line="480" w:lineRule="auto"/>
+      </w:pPr>
+    </w:p>
+    <w:p>
+      <w:pPr>
+        <w:spacing w:before="0" w:after="0" w:line="480" w:lineRule="auto"/>
+      </w:pPr>
+    </w:p>
+    <w:p>
+      <w:pPr>
+        <w:spacing w:before="0" w:after="0" w:line="480" w:lineRule="auto"/>
+        <w:sectPr>
+          <w:pgSz w:w="11906" w:h="16838"/>
+          <w:pgMar w:top="1440" w:right="1440" w:bottom="1440" w:left="2160" w:header="720" w:footer="720" w:gutter="0"/>
+          <w:titlePg/>
+          <w:headerReference w:type="default" r:id="rId11"/>
+          <w:headerReference w:type="first" r:id="rId12"/>
+        </w:sectPr>
+      </w:pPr>
+    </w:p>
+    <w:p>
+      <w:pPr>
         <w:spacing w:line="480" w:lineRule="auto" w:before="0" w:after="0"/>
         <w:ind w:firstLine="0"/>
         <w:jc w:val="center"/>
@@ -14516,6 +14836,21 @@
         </w:rPr>
         <w:t xml:space="preserve">APPENDIX B: ANALYSIS OF RHETORICAL APPEALS</w:t>
       </w:r>
+    </w:p>
+    <w:p>
+      <w:pPr>
+        <w:spacing w:before="0" w:after="0" w:line="480" w:lineRule="auto"/>
+      </w:pPr>
+    </w:p>
+    <w:p>
+      <w:pPr>
+        <w:spacing w:before="0" w:after="0" w:line="480" w:lineRule="auto"/>
+      </w:pPr>
+    </w:p>
+    <w:p>
+      <w:pPr>
+        <w:spacing w:before="0" w:after="0" w:line="480" w:lineRule="auto"/>
+      </w:pPr>
     </w:p>
     <w:p>
       <w:pPr>
@@ -23359,6 +23694,33 @@
     </w:p>
     <w:p>
       <w:pPr>
+        <w:spacing w:before="0" w:after="0" w:line="480" w:lineRule="auto"/>
+      </w:pPr>
+    </w:p>
+    <w:p>
+      <w:pPr>
+        <w:spacing w:before="0" w:after="0" w:line="480" w:lineRule="auto"/>
+      </w:pPr>
+    </w:p>
+    <w:p>
+      <w:pPr>
+        <w:spacing w:before="0" w:after="0" w:line="480" w:lineRule="auto"/>
+      </w:pPr>
+    </w:p>
+    <w:p>
+      <w:pPr>
+        <w:spacing w:before="0" w:after="0" w:line="480" w:lineRule="auto"/>
+        <w:sectPr>
+          <w:pgSz w:w="11906" w:h="16838"/>
+          <w:pgMar w:top="1440" w:right="1440" w:bottom="1440" w:left="2160" w:header="720" w:footer="720" w:gutter="0"/>
+          <w:titlePg/>
+          <w:headerReference w:type="default" r:id="rId11"/>
+          <w:headerReference w:type="first" r:id="rId12"/>
+        </w:sectPr>
+      </w:pPr>
+    </w:p>
+    <w:p>
+      <w:pPr>
         <w:spacing w:line="480" w:lineRule="auto" w:before="0" w:after="0"/>
         <w:ind w:firstLine="0"/>
         <w:jc w:val="center"/>
@@ -23382,6 +23744,21 @@
         </w:rPr>
         <w:t xml:space="preserve">APPENDIX C: ANALYSIS OF DIRECTIVE SUBTYPES</w:t>
       </w:r>
+    </w:p>
+    <w:p>
+      <w:pPr>
+        <w:spacing w:before="0" w:after="0" w:line="480" w:lineRule="auto"/>
+      </w:pPr>
+    </w:p>
+    <w:p>
+      <w:pPr>
+        <w:spacing w:before="0" w:after="0" w:line="480" w:lineRule="auto"/>
+      </w:pPr>
+    </w:p>
+    <w:p>
+      <w:pPr>
+        <w:spacing w:before="0" w:after="0" w:line="480" w:lineRule="auto"/>
+      </w:pPr>
     </w:p>
     <w:p>
       <w:pPr>
@@ -27773,6 +28150,33 @@
     </w:p>
     <w:p>
       <w:pPr>
+        <w:spacing w:before="0" w:after="0" w:line="480" w:lineRule="auto"/>
+      </w:pPr>
+    </w:p>
+    <w:p>
+      <w:pPr>
+        <w:spacing w:before="0" w:after="0" w:line="480" w:lineRule="auto"/>
+      </w:pPr>
+    </w:p>
+    <w:p>
+      <w:pPr>
+        <w:spacing w:before="0" w:after="0" w:line="480" w:lineRule="auto"/>
+      </w:pPr>
+    </w:p>
+    <w:p>
+      <w:pPr>
+        <w:spacing w:before="0" w:after="0" w:line="480" w:lineRule="auto"/>
+        <w:sectPr>
+          <w:pgSz w:w="11906" w:h="16838"/>
+          <w:pgMar w:top="1440" w:right="1440" w:bottom="1440" w:left="2160" w:header="720" w:footer="720" w:gutter="0"/>
+          <w:titlePg/>
+          <w:headerReference w:type="default" r:id="rId11"/>
+          <w:headerReference w:type="first" r:id="rId12"/>
+        </w:sectPr>
+      </w:pPr>
+    </w:p>
+    <w:p>
+      <w:pPr>
         <w:spacing w:line="480" w:lineRule="auto" w:before="0" w:after="0"/>
         <w:ind w:firstLine="0"/>
         <w:jc w:val="center"/>
@@ -27796,6 +28200,21 @@
         </w:rPr>
         <w:t xml:space="preserve">APPENDIX D: ANALYSIS OF THE CONSTRUCTION OF PERSUASIVE MEANING</w:t>
       </w:r>
+    </w:p>
+    <w:p>
+      <w:pPr>
+        <w:spacing w:before="0" w:after="0" w:line="480" w:lineRule="auto"/>
+      </w:pPr>
+    </w:p>
+    <w:p>
+      <w:pPr>
+        <w:spacing w:before="0" w:after="0" w:line="480" w:lineRule="auto"/>
+      </w:pPr>
+    </w:p>
+    <w:p>
+      <w:pPr>
+        <w:spacing w:before="0" w:after="0" w:line="480" w:lineRule="auto"/>
+      </w:pPr>
     </w:p>
     <w:p>
       <w:pPr>

</xml_diff>

<commit_message>
True blank slate: removed ALL section breaks and empties, then clean rebuild
- Stripped every sectPr and every empty paragraph
- Forced clean Georgia / sizes / spacing / bold on remaining content
- Re-inserted only required spacers and section breaks (title page exact, major 3+3, minor 1-before)
- Image wrap topAndBottom (body) / square (appendix)
- No redundant breaks left
</commit_message>
<xml_diff>
--- a/thesis/Velasquez_CTA_Skincare_Thesis_DRAFT_003.docx
+++ b/thesis/Velasquez_CTA_Skincare_Thesis_DRAFT_003.docx
@@ -401,6 +401,21 @@
         </w:rPr>
         <w:t xml:space="preserve">October, 2026</w:t>
       </w:r>
+    </w:p>
+    <w:p>
+      <w:pPr>
+        <w:spacing w:before="0" w:after="0" w:line="480" w:lineRule="auto"/>
+      </w:pPr>
+    </w:p>
+    <w:p>
+      <w:pPr>
+        <w:spacing w:before="0" w:after="0" w:line="480" w:lineRule="auto"/>
+      </w:pPr>
+    </w:p>
+    <w:p>
+      <w:pPr>
+        <w:spacing w:before="0" w:after="0" w:line="480" w:lineRule="auto"/>
+      </w:pPr>
     </w:p>
     <w:p>
       <w:pPr>
@@ -416,88 +431,8 @@
     </w:p>
     <w:p>
       <w:pPr>
-        <w:spacing w:before="0" w:after="0" w:line="480" w:lineRule="auto"/>
-        <w:sectPr>
-          <w:pgSz w:w="11909" w:h="16834"/>
-          <w:pgMar w:top="1440" w:right="1440" w:bottom="1440" w:left="2160" w:header="720" w:footer="720" w:gutter="0"/>
-          <w:titlePg/>
-          <w:headerReference w:type="default" r:id="rId11"/>
-          <w:headerReference w:type="first" r:id="rId12"/>
-        </w:sectPr>
-      </w:pPr>
-    </w:p>
-    <w:p>
-      <w:pPr>
-        <w:spacing w:before="0" w:after="0" w:line="360" w:lineRule="auto"/>
-        <w:ind w:left="100" w:firstLine="0"/>
-        <w:jc w:val="center"/>
-        <w:rPr>
-          <w:rFonts w:ascii="Georgia" w:cs="Georgia" w:eastAsia="Georgia" w:hAnsi="Georgia"/>
-          <w:sz w:val="24"/>
-          <w:szCs w:val="24"/>
-        </w:rPr>
-        <w:sectPr>
-          <w:pgSz w:w="11909" w:h="16834"/>
-          <w:pgMar w:top="1440" w:right="1440" w:bottom="1440" w:left="2160" w:header="720" w:footer="720" w:gutter="0"/>
-          <w:titlePg/>
-          <w:headerReference w:type="default" r:id="rId11"/>
-          <w:headerReference w:type="first" r:id="rId12"/>
-        </w:sectPr>
-      </w:pPr>
-      <w:r>
-        <w:rPr>
-          <w:rFonts w:ascii="Georgia" w:hAnsi="Georgia" w:eastAsia="Georgia" w:cs="Georgia"/>
-          <w:sz w:val="24"/>
-          <w:rtl w:val="0"/>
-        </w:rPr>
-      </w:r>
-    </w:p>
-    <w:p>
-      <w:pPr>
-        <w:spacing w:before="0" w:after="0" w:line="480" w:lineRule="auto"/>
-      </w:pPr>
-    </w:p>
-    <w:p>
-      <w:pPr>
-        <w:spacing w:before="0" w:after="0" w:line="480" w:lineRule="auto"/>
-      </w:pPr>
-    </w:p>
-    <w:p>
-      <w:pPr>
-        <w:spacing w:before="0" w:after="0" w:line="480" w:lineRule="auto"/>
-      </w:pPr>
-    </w:p>
-    <w:p>
-      <w:pPr>
-        <w:spacing w:before="0" w:after="0" w:line="480" w:lineRule="auto"/>
-        <w:sectPr>
-          <w:pgSz w:w="11906" w:h="16838"/>
-          <w:pgMar w:top="1440" w:right="1440" w:bottom="1440" w:left="2160" w:header="720" w:footer="720" w:gutter="0"/>
-          <w:titlePg/>
-          <w:headerReference w:type="default" r:id="rId11"/>
-          <w:headerReference w:type="first" r:id="rId12"/>
-        </w:sectPr>
-      </w:pPr>
-    </w:p>
-    <w:p>
-      <w:pPr>
-        <w:spacing w:before="0" w:after="0" w:line="480" w:lineRule="auto"/>
-      </w:pPr>
-    </w:p>
-    <w:p>
-      <w:pPr>
-        <w:spacing w:before="0" w:after="0" w:line="480" w:lineRule="auto"/>
-      </w:pPr>
-    </w:p>
-    <w:p>
-      <w:pPr>
-        <w:spacing w:before="0" w:after="0" w:line="480" w:lineRule="auto"/>
-      </w:pPr>
-    </w:p>
-    <w:p>
-      <w:pPr>
         <w:spacing w:line="480" w:lineRule="auto" w:before="0" w:after="0"/>
-        <w:ind w:firstLine="0"/>
+        <w:ind/>
         <w:jc w:val="center"/>
         <w:rPr>
           <w:rFonts w:ascii="Georgia" w:cs="Georgia" w:eastAsia="Georgia" w:hAnsi="Georgia"/>
@@ -543,7 +478,7 @@
     <w:p>
       <w:pPr>
         <w:spacing w:line="480" w:lineRule="auto" w:before="0" w:after="0"/>
-        <w:ind w:firstLine="0"/>
+        <w:ind/>
         <w:jc w:val="left"/>
         <w:rPr>
           <w:rFonts w:ascii="Georgia" w:cs="Georgia" w:eastAsia="Georgia" w:hAnsi="Georgia"/>
@@ -642,7 +577,7 @@
     <w:p>
       <w:pPr>
         <w:spacing w:before="0" w:after="0" w:line="480" w:lineRule="auto"/>
-        <w:ind w:firstLine="0"/>
+        <w:ind/>
         <w:jc w:val="left"/>
       </w:pPr>
       <w:r>
@@ -783,7 +718,7 @@
     <w:p>
       <w:pPr>
         <w:spacing w:before="0" w:after="0" w:line="480" w:lineRule="auto"/>
-        <w:ind w:firstLine="0"/>
+        <w:ind/>
         <w:jc w:val="left"/>
       </w:pPr>
       <w:r>
@@ -941,7 +876,7 @@
     <w:p>
       <w:pPr>
         <w:spacing w:before="0" w:after="0" w:line="480" w:lineRule="auto"/>
-        <w:ind w:firstLine="0"/>
+        <w:ind/>
         <w:jc w:val="left"/>
       </w:pPr>
       <w:r>
@@ -1133,7 +1068,7 @@
     <w:p>
       <w:pPr>
         <w:spacing w:after="0" w:before="0" w:line="480" w:lineRule="auto"/>
-        <w:ind w:firstLine="0"/>
+        <w:ind/>
         <w:jc w:val="left"/>
         <w:rPr>
           <w:rFonts w:ascii="Georgia" w:cs="Georgia" w:eastAsia="Georgia" w:hAnsi="Georgia"/>
@@ -1343,7 +1278,7 @@
     <w:p>
       <w:pPr>
         <w:spacing w:after="0" w:before="0" w:line="480" w:lineRule="auto"/>
-        <w:ind w:firstLine="0"/>
+        <w:ind/>
         <w:jc w:val="left"/>
         <w:rPr>
           <w:rFonts w:ascii="Georgia" w:cs="Georgia" w:eastAsia="Georgia" w:hAnsi="Georgia"/>
@@ -1537,7 +1472,7 @@
     <w:p>
       <w:pPr>
         <w:spacing w:after="0" w:before="0" w:line="360" w:lineRule="auto"/>
-        <w:ind w:firstLine="0"/>
+        <w:ind/>
         <w:jc w:val="left"/>
         <w:rPr>
           <w:rFonts w:ascii="Georgia" w:cs="Georgia" w:eastAsia="Georgia" w:hAnsi="Georgia"/>
@@ -1763,7 +1698,7 @@
     <w:p>
       <w:pPr>
         <w:spacing w:after="0" w:before="0" w:line="480" w:lineRule="auto"/>
-        <w:ind w:firstLine="0"/>
+        <w:ind/>
         <w:jc w:val="left"/>
         <w:rPr>
           <w:rFonts w:ascii="Georgia" w:cs="Georgia" w:eastAsia="Georgia" w:hAnsi="Georgia"/>
@@ -1955,7 +1890,7 @@
     <w:p>
       <w:pPr>
         <w:spacing w:before="0" w:line="480" w:lineRule="auto" w:after="0"/>
-        <w:ind w:firstLine="0"/>
+        <w:ind/>
         <w:jc w:val="left"/>
         <w:rPr>
           <w:rFonts w:ascii="Georgia" w:cs="Georgia" w:eastAsia="Georgia" w:hAnsi="Georgia"/>
@@ -2071,7 +2006,7 @@
     <w:p>
       <w:pPr>
         <w:spacing w:after="0" w:before="0" w:line="480" w:lineRule="auto"/>
-        <w:ind w:firstLine="0"/>
+        <w:ind/>
         <w:jc w:val="left"/>
         <w:rPr>
           <w:rFonts w:ascii="Georgia" w:cs="Georgia" w:eastAsia="Georgia" w:hAnsi="Georgia"/>
@@ -2593,7 +2528,7 @@
     <w:p>
       <w:pPr>
         <w:spacing w:after="0" w:before="0" w:line="480" w:lineRule="auto"/>
-        <w:ind w:firstLine="0"/>
+        <w:ind/>
         <w:jc w:val="center"/>
         <w:rPr>
           <w:rFonts w:ascii="Georgia" w:cs="Georgia" w:eastAsia="Georgia" w:hAnsi="Georgia"/>
@@ -2659,7 +2594,7 @@
     <w:p>
       <w:pPr>
         <w:spacing w:line="480" w:lineRule="auto" w:before="0" w:after="0"/>
-        <w:ind w:firstLine="0"/>
+        <w:ind/>
         <w:jc w:val="left"/>
         <w:rPr>
           <w:rFonts w:ascii="Georgia" w:cs="Georgia" w:eastAsia="Georgia" w:hAnsi="Georgia"/>
@@ -2770,7 +2705,7 @@
     <w:p>
       <w:pPr>
         <w:spacing w:after="0" w:before="0" w:line="480" w:lineRule="auto"/>
-        <w:ind w:firstLine="0"/>
+        <w:ind/>
         <w:jc w:val="left"/>
         <w:rPr>
           <w:rFonts w:ascii="Georgia" w:cs="Georgia" w:eastAsia="Georgia" w:hAnsi="Georgia"/>
@@ -2921,7 +2856,7 @@
     <w:p>
       <w:pPr>
         <w:spacing w:after="0" w:before="0" w:line="480" w:lineRule="auto"/>
-        <w:ind w:firstLine="0"/>
+        <w:ind/>
         <w:jc w:val="left"/>
         <w:rPr>
           <w:rFonts w:ascii="Georgia" w:cs="Georgia" w:eastAsia="Georgia" w:hAnsi="Georgia"/>
@@ -4389,7 +4324,7 @@
       <w:pPr>
         <w:pStyle w:val="Heading2"/>
         <w:spacing w:line="480" w:lineRule="auto" w:before="0" w:after="0"/>
-        <w:ind w:firstLine="0"/>
+        <w:ind/>
         <w:jc w:val="left"/>
         <w:rPr>
           <w:rFonts w:ascii="Georgia" w:cs="Georgia" w:eastAsia="Georgia" w:hAnsi="Georgia"/>
@@ -4481,7 +4416,7 @@
     <w:p>
       <w:pPr>
         <w:spacing w:after="0" w:before="0" w:line="480" w:lineRule="auto"/>
-        <w:ind w:firstLine="0"/>
+        <w:ind/>
         <w:jc w:val="center"/>
         <w:rPr>
           <w:rFonts w:ascii="Georgia" w:cs="Georgia" w:eastAsia="Georgia" w:hAnsi="Georgia"/>
@@ -4593,7 +4528,7 @@
     <w:p>
       <w:pPr>
         <w:spacing w:after="0" w:before="0" w:line="360" w:lineRule="auto"/>
-        <w:ind w:firstLine="0"/>
+        <w:ind/>
         <w:jc w:val="left"/>
         <w:rPr>
           <w:rFonts w:ascii="Georgia" w:cs="Georgia" w:eastAsia="Georgia" w:hAnsi="Georgia"/>
@@ -4894,7 +4829,7 @@
     <w:p>
       <w:pPr>
         <w:spacing w:after="0" w:before="0" w:line="360" w:lineRule="auto"/>
-        <w:ind w:firstLine="0"/>
+        <w:ind/>
         <w:jc w:val="left"/>
         <w:rPr>
           <w:rFonts w:ascii="Georgia" w:cs="Georgia" w:eastAsia="Georgia" w:hAnsi="Georgia"/>
@@ -5039,7 +4974,7 @@
     <w:p>
       <w:pPr>
         <w:spacing w:after="0" w:before="0" w:line="360" w:lineRule="auto"/>
-        <w:ind w:firstLine="0"/>
+        <w:ind/>
         <w:jc w:val="left"/>
         <w:rPr>
           <w:rFonts w:ascii="Georgia" w:cs="Georgia" w:eastAsia="Georgia" w:hAnsi="Georgia"/>
@@ -6612,7 +6547,7 @@
     <w:p>
       <w:pPr>
         <w:spacing w:after="0" w:before="0" w:line="360" w:lineRule="auto"/>
-        <w:ind w:firstLine="0"/>
+        <w:ind/>
         <w:jc w:val="left"/>
         <w:rPr>
           <w:rFonts w:ascii="Georgia" w:cs="Georgia" w:eastAsia="Georgia" w:hAnsi="Georgia"/>
@@ -6950,7 +6885,7 @@
     <w:p>
       <w:pPr>
         <w:spacing w:after="0" w:before="0" w:line="360" w:lineRule="auto"/>
-        <w:ind w:firstLine="0"/>
+        <w:ind/>
         <w:jc w:val="left"/>
         <w:rPr>
           <w:rFonts w:ascii="Georgia" w:cs="Georgia" w:eastAsia="Georgia" w:hAnsi="Georgia"/>
@@ -7095,7 +7030,7 @@
     <w:p>
       <w:pPr>
         <w:spacing w:after="0" w:before="0" w:line="360" w:lineRule="auto"/>
-        <w:ind w:firstLine="0"/>
+        <w:ind/>
         <w:jc w:val="left"/>
         <w:rPr>
           <w:rFonts w:ascii="Georgia" w:cs="Georgia" w:eastAsia="Georgia" w:hAnsi="Georgia"/>
@@ -8180,7 +8115,7 @@
     <w:p>
       <w:pPr>
         <w:spacing w:after="0" w:before="0" w:line="360" w:lineRule="auto"/>
-        <w:ind w:firstLine="0"/>
+        <w:ind/>
         <w:jc w:val="left"/>
         <w:rPr>
           <w:rFonts w:ascii="Georgia" w:cs="Georgia" w:eastAsia="Georgia" w:hAnsi="Georgia"/>
@@ -9029,7 +8964,7 @@
     <w:p>
       <w:pPr>
         <w:spacing w:line="360" w:lineRule="auto" w:before="0" w:after="0"/>
-        <w:ind w:firstLine="0"/>
+        <w:ind/>
         <w:jc w:val="left"/>
         <w:rPr>
           <w:rFonts w:ascii="Georgia" w:cs="Georgia" w:eastAsia="Georgia" w:hAnsi="Georgia"/>
@@ -9196,7 +9131,7 @@
     <w:p>
       <w:pPr>
         <w:spacing w:after="0" w:before="0" w:line="480" w:lineRule="auto"/>
-        <w:ind w:firstLine="0"/>
+        <w:ind/>
         <w:jc w:val="center"/>
         <w:rPr>
           <w:rFonts w:ascii="Georgia" w:cs="Georgia" w:eastAsia="Georgia" w:hAnsi="Georgia"/>
@@ -9598,7 +9533,7 @@
     <w:p>
       <w:pPr>
         <w:spacing w:after="0" w:before="0" w:line="480" w:lineRule="auto"/>
-        <w:ind w:firstLine="0"/>
+        <w:ind/>
         <w:jc w:val="center"/>
         <w:rPr>
           <w:rFonts w:ascii="Georgia" w:cs="Georgia" w:eastAsia="Georgia" w:hAnsi="Georgia"/>
@@ -12664,7 +12599,7 @@
     <w:p>
       <w:pPr>
         <w:spacing w:after="0" w:before="0" w:line="480" w:lineRule="auto"/>
-        <w:ind w:firstLine="0"/>
+        <w:ind/>
         <w:jc w:val="center"/>
         <w:rPr>
           <w:rFonts w:ascii="Georgia" w:cs="Georgia" w:eastAsia="Georgia" w:hAnsi="Georgia"/>
@@ -12732,7 +12667,7 @@
     <w:p>
       <w:pPr>
         <w:spacing w:before="0" w:after="0" w:line="480" w:lineRule="auto"/>
-        <w:ind w:firstLine="0"/>
+        <w:ind/>
         <w:jc w:val="center"/>
         <w:rPr>
           <w:rFonts w:ascii="Georgia" w:cs="Georgia" w:eastAsia="Georgia" w:hAnsi="Georgia"/>
@@ -12778,7 +12713,7 @@
     <w:p>
       <w:pPr>
         <w:spacing w:before="0" w:after="0" w:line="360" w:lineRule="auto"/>
-        <w:ind w:firstLine="0"/>
+        <w:ind/>
         <w:jc w:val="left"/>
         <w:rPr>
           <w:rFonts w:ascii="Georgia" w:cs="Georgia" w:eastAsia="Georgia" w:hAnsi="Georgia"/>
@@ -13026,14 +12961,6 @@
           <w:sz w:val="24"/>
           <w:szCs w:val="24"/>
         </w:rPr>
-        <w:sectPr>
-          <w:headerReference r:id="rId11" w:type="default"/>
-          <w:headerReference r:id="rId12" w:type="first"/>
-          <w:pgSz w:h="16834" w:w="11909" w:orient="portrait"/>
-          <w:pgMar w:bottom="1440" w:top="1440" w:left="2160" w:right="1440" w:header="720" w:footer="720"/>
-          <w:pgNumType w:start="1"/>
-          <w:titlePg/>
-        </w:sectPr>
       </w:pPr>
       <w:r>
         <w:rPr>
@@ -13179,7 +13106,7 @@
     <w:p>
       <w:pPr>
         <w:spacing w:before="0" w:after="0" w:line="360" w:lineRule="auto"/>
-        <w:ind w:firstLine="0"/>
+        <w:ind/>
         <w:jc w:val="left"/>
         <w:rPr>
           <w:rFonts w:ascii="Georgia" w:cs="Georgia" w:eastAsia="Georgia" w:hAnsi="Georgia"/>
@@ -13623,41 +13550,12 @@
     <w:p>
       <w:pPr>
         <w:spacing w:before="0" w:after="0" w:line="480" w:lineRule="auto"/>
-        <w:jc w:val="both"/>
-        <w:rPr>
-          <w:rFonts w:ascii="Georgia" w:cs="Georgia" w:eastAsia="Georgia" w:hAnsi="Georgia"/>
-          <w:b w:val="1"/>
-          <w:bCs w:val="1"/>
-          <w:sz w:val="24"/>
-          <w:szCs w:val="24"/>
-        </w:rPr>
-        <w:sectPr>
-          <w:headerReference r:id="rId23" w:type="default"/>
-          <w:headerReference r:id="rId24" w:type="first"/>
-          <w:type w:val="nextPage"/>
-          <w:pgSz w:h="16834" w:w="11909" w:orient="portrait"/>
-          <w:pgMar w:bottom="1440" w:top="1440" w:left="2160" w:right="1440" w:header="720" w:footer="720"/>
-          <w:titlePg/>
-        </w:sectPr>
-      </w:pPr>
-      <w:r>
-        <w:rPr>
-          <w:rFonts w:ascii="Georgia" w:hAnsi="Georgia" w:eastAsia="Georgia" w:cs="Georgia"/>
-          <w:b w:val="0"/>
-          <w:sz w:val="22"/>
-          <w:rtl w:val="0"/>
-        </w:rPr>
-      </w:r>
-    </w:p>
-    <w:p>
-      <w:pPr>
-        <w:spacing w:before="0" w:after="0" w:line="480" w:lineRule="auto"/>
       </w:pPr>
     </w:p>
     <w:p>
       <w:pPr>
         <w:spacing w:before="0" w:after="0" w:line="360" w:lineRule="auto"/>
-        <w:ind w:firstLine="0"/>
+        <w:ind/>
         <w:jc w:val="left"/>
         <w:rPr>
           <w:rFonts w:ascii="Georgia" w:cs="Georgia" w:eastAsia="Georgia" w:hAnsi="Georgia"/>
@@ -13933,14 +13831,6 @@
           <w:sz w:val="24"/>
           <w:szCs w:val="24"/>
         </w:rPr>
-        <w:sectPr>
-          <w:headerReference r:id="rId29" w:type="default"/>
-          <w:headerReference r:id="rId30" w:type="first"/>
-          <w:type w:val="nextPage"/>
-          <w:pgSz w:h="16834" w:w="11909" w:orient="portrait"/>
-          <w:pgMar w:bottom="1440" w:top="1440" w:left="2160" w:right="1440" w:header="720" w:footer="720"/>
-          <w:titlePg/>
-        </w:sectPr>
       </w:pPr>
       <w:r>
         <w:rPr>
@@ -14086,7 +13976,7 @@
     <w:p>
       <w:pPr>
         <w:spacing w:before="0" w:after="0" w:line="360" w:lineRule="auto"/>
-        <w:ind w:firstLine="0"/>
+        <w:ind/>
         <w:jc w:val="left"/>
         <w:rPr>
           <w:rFonts w:ascii="Georgia" w:cs="Georgia" w:eastAsia="Georgia" w:hAnsi="Georgia"/>
@@ -14146,14 +14036,6 @@
           <w:sz w:val="28"/>
           <w:szCs w:val="28"/>
         </w:rPr>
-        <w:sectPr>
-          <w:headerReference r:id="rId34" w:type="default"/>
-          <w:headerReference r:id="rId35" w:type="first"/>
-          <w:type w:val="nextPage"/>
-          <w:pgSz w:h="16834" w:w="11909" w:orient="portrait"/>
-          <w:pgMar w:bottom="1440" w:top="1440" w:left="2160" w:right="1440" w:header="720" w:footer="720"/>
-          <w:titlePg/>
-        </w:sectPr>
       </w:pPr>
       <w:r>
         <w:rPr>
@@ -14459,7 +14341,7 @@
     <w:p>
       <w:pPr>
         <w:spacing w:before="0" w:after="0" w:line="360" w:lineRule="auto"/>
-        <w:ind w:firstLine="0"/>
+        <w:ind/>
         <w:jc w:val="left"/>
         <w:rPr>
           <w:rFonts w:ascii="Georgia" w:cs="Georgia" w:eastAsia="Georgia" w:hAnsi="Georgia"/>
@@ -14519,14 +14401,6 @@
           <w:sz w:val="28"/>
           <w:szCs w:val="28"/>
         </w:rPr>
-        <w:sectPr>
-          <w:headerReference r:id="rId43" w:type="default"/>
-          <w:headerReference r:id="rId44" w:type="first"/>
-          <w:type w:val="nextPage"/>
-          <w:pgSz w:h="16834" w:w="11909" w:orient="portrait"/>
-          <w:pgMar w:bottom="1440" w:top="1440" w:left="2160" w:right="1440" w:header="720" w:footer="720"/>
-          <w:titlePg/>
-        </w:sectPr>
       </w:pPr>
       <w:r>
         <w:rPr>
@@ -14814,7 +14688,7 @@
     <w:p>
       <w:pPr>
         <w:spacing w:line="480" w:lineRule="auto" w:before="0" w:after="0"/>
-        <w:ind w:firstLine="0"/>
+        <w:ind/>
         <w:jc w:val="center"/>
         <w:rPr>
           <w:rFonts w:ascii="Georgia" w:cs="Georgia" w:eastAsia="Georgia" w:hAnsi="Georgia"/>
@@ -14860,7 +14734,7 @@
     <w:p>
       <w:pPr>
         <w:spacing w:line="360" w:lineRule="auto" w:before="0" w:after="0"/>
-        <w:ind w:firstLine="0"/>
+        <w:ind/>
         <w:jc w:val="left"/>
         <w:rPr>
           <w:rFonts w:ascii="Georgia" w:cs="Georgia" w:eastAsia="Georgia" w:hAnsi="Georgia"/>
@@ -16267,7 +16141,7 @@
     <w:p>
       <w:pPr>
         <w:spacing w:before="0" w:after="0" w:line="360" w:lineRule="auto"/>
-        <w:ind w:firstLine="0"/>
+        <w:ind/>
         <w:jc w:val="left"/>
         <w:rPr>
           <w:rFonts w:ascii="Georgia" w:cs="Georgia" w:eastAsia="Georgia" w:hAnsi="Georgia"/>
@@ -18108,7 +17982,7 @@
     <w:p>
       <w:pPr>
         <w:spacing w:before="0" w:after="0" w:line="360" w:lineRule="auto"/>
-        <w:ind w:firstLine="0"/>
+        <w:ind/>
         <w:jc w:val="left"/>
         <w:rPr>
           <w:rFonts w:ascii="Georgia" w:cs="Georgia" w:eastAsia="Georgia" w:hAnsi="Georgia"/>
@@ -20147,7 +20021,7 @@
     <w:p>
       <w:pPr>
         <w:spacing w:before="0" w:after="0" w:line="360" w:lineRule="auto"/>
-        <w:ind w:firstLine="0"/>
+        <w:ind/>
         <w:jc w:val="left"/>
         <w:rPr>
           <w:rFonts w:ascii="Georgia" w:cs="Georgia" w:eastAsia="Georgia" w:hAnsi="Georgia"/>
@@ -22040,7 +21914,7 @@
     <w:p>
       <w:pPr>
         <w:spacing w:before="0" w:after="0" w:line="360" w:lineRule="auto"/>
-        <w:ind w:firstLine="0"/>
+        <w:ind/>
         <w:jc w:val="left"/>
         <w:rPr>
           <w:rFonts w:ascii="Georgia" w:cs="Georgia" w:eastAsia="Georgia" w:hAnsi="Georgia"/>
@@ -23665,35 +23539,6 @@
     </w:tbl>
     <w:p>
       <w:pPr>
-        <w:spacing w:line="480" w:lineRule="auto" w:before="0" w:after="0"/>
-        <w:jc w:val="both"/>
-        <w:rPr>
-          <w:rFonts w:ascii="Georgia" w:cs="Georgia" w:eastAsia="Georgia" w:hAnsi="Georgia"/>
-          <w:b w:val="1"/>
-          <w:bCs w:val="1"/>
-          <w:sz w:val="24"/>
-          <w:szCs w:val="24"/>
-        </w:rPr>
-        <w:sectPr>
-          <w:headerReference r:id="rId58" w:type="default"/>
-          <w:headerReference r:id="rId59" w:type="first"/>
-          <w:type w:val="nextPage"/>
-          <w:pgSz w:h="16834" w:w="11909" w:orient="portrait"/>
-          <w:pgMar w:bottom="1440" w:top="1440" w:left="2160" w:right="1440" w:header="720" w:footer="720"/>
-          <w:titlePg/>
-        </w:sectPr>
-      </w:pPr>
-      <w:r>
-        <w:rPr>
-          <w:rFonts w:ascii="Georgia" w:hAnsi="Georgia" w:eastAsia="Georgia" w:cs="Georgia"/>
-          <w:b w:val="0"/>
-          <w:sz w:val="22"/>
-          <w:rtl w:val="0"/>
-        </w:rPr>
-      </w:r>
-    </w:p>
-    <w:p>
-      <w:pPr>
         <w:spacing w:before="0" w:after="0" w:line="480" w:lineRule="auto"/>
       </w:pPr>
     </w:p>
@@ -23722,7 +23567,7 @@
     <w:p>
       <w:pPr>
         <w:spacing w:line="480" w:lineRule="auto" w:before="0" w:after="0"/>
-        <w:ind w:firstLine="0"/>
+        <w:ind/>
         <w:jc w:val="center"/>
         <w:rPr>
           <w:rFonts w:ascii="Georgia" w:cs="Georgia" w:eastAsia="Georgia" w:hAnsi="Georgia"/>
@@ -23768,7 +23613,7 @@
     <w:p>
       <w:pPr>
         <w:spacing w:line="360" w:lineRule="auto" w:before="0" w:after="0"/>
-        <w:ind w:firstLine="0"/>
+        <w:ind/>
         <w:jc w:val="left"/>
         <w:rPr>
           <w:rFonts w:ascii="Georgia" w:cs="Georgia" w:eastAsia="Georgia" w:hAnsi="Georgia"/>
@@ -24666,7 +24511,7 @@
     <w:p>
       <w:pPr>
         <w:spacing w:before="0" w:after="0" w:line="360" w:lineRule="auto"/>
-        <w:ind w:firstLine="0"/>
+        <w:ind/>
         <w:jc w:val="left"/>
         <w:rPr>
           <w:rFonts w:ascii="Georgia" w:cs="Georgia" w:eastAsia="Georgia" w:hAnsi="Georgia"/>
@@ -25553,7 +25398,7 @@
     <w:p>
       <w:pPr>
         <w:spacing w:before="0" w:after="0" w:line="360" w:lineRule="auto"/>
-        <w:ind w:firstLine="0"/>
+        <w:ind/>
         <w:jc w:val="left"/>
         <w:rPr>
           <w:rFonts w:ascii="Georgia" w:cs="Georgia" w:eastAsia="Georgia" w:hAnsi="Georgia"/>
@@ -26452,7 +26297,7 @@
     <w:p>
       <w:pPr>
         <w:spacing w:before="0" w:after="0" w:line="360" w:lineRule="auto"/>
-        <w:ind w:firstLine="0"/>
+        <w:ind/>
         <w:jc w:val="left"/>
         <w:rPr>
           <w:rFonts w:ascii="Georgia" w:cs="Georgia" w:eastAsia="Georgia" w:hAnsi="Georgia"/>
@@ -27339,7 +27184,7 @@
     <w:p>
       <w:pPr>
         <w:spacing w:after="0" w:before="0" w:lineRule="auto" w:line="360"/>
-        <w:ind w:firstLine="0"/>
+        <w:ind/>
         <w:jc w:val="left"/>
         <w:rPr>
           <w:rFonts w:ascii="Georgia" w:cs="Georgia" w:eastAsia="Georgia" w:hAnsi="Georgia"/>
@@ -28121,35 +27966,6 @@
     </w:tbl>
     <w:p>
       <w:pPr>
-        <w:spacing w:line="480" w:lineRule="auto" w:before="0" w:after="0"/>
-        <w:jc w:val="both"/>
-        <w:rPr>
-          <w:rFonts w:ascii="Georgia" w:cs="Georgia" w:eastAsia="Georgia" w:hAnsi="Georgia"/>
-          <w:b w:val="1"/>
-          <w:bCs w:val="1"/>
-          <w:sz w:val="24"/>
-          <w:szCs w:val="24"/>
-        </w:rPr>
-        <w:sectPr>
-          <w:headerReference r:id="rId60" w:type="default"/>
-          <w:headerReference r:id="rId61" w:type="first"/>
-          <w:type w:val="nextPage"/>
-          <w:pgSz w:h="16834" w:w="11909" w:orient="portrait"/>
-          <w:pgMar w:bottom="1440" w:top="1440" w:left="2160" w:right="1440" w:header="720" w:footer="720"/>
-          <w:titlePg/>
-        </w:sectPr>
-      </w:pPr>
-      <w:r>
-        <w:rPr>
-          <w:rFonts w:ascii="Georgia" w:hAnsi="Georgia" w:eastAsia="Georgia" w:cs="Georgia"/>
-          <w:b w:val="0"/>
-          <w:sz w:val="22"/>
-          <w:rtl w:val="0"/>
-        </w:rPr>
-      </w:r>
-    </w:p>
-    <w:p>
-      <w:pPr>
         <w:spacing w:before="0" w:after="0" w:line="480" w:lineRule="auto"/>
       </w:pPr>
     </w:p>
@@ -28178,7 +27994,7 @@
     <w:p>
       <w:pPr>
         <w:spacing w:line="480" w:lineRule="auto" w:before="0" w:after="0"/>
-        <w:ind w:firstLine="0"/>
+        <w:ind/>
         <w:jc w:val="center"/>
         <w:rPr>
           <w:rFonts w:ascii="Georgia" w:cs="Georgia" w:eastAsia="Georgia" w:hAnsi="Georgia"/>
@@ -28224,7 +28040,7 @@
     <w:p>
       <w:pPr>
         <w:spacing w:line="360" w:lineRule="auto" w:before="0" w:after="0"/>
-        <w:ind w:firstLine="0"/>
+        <w:ind/>
         <w:jc w:val="left"/>
         <w:rPr>
           <w:rFonts w:ascii="Georgia" w:cs="Georgia" w:eastAsia="Georgia" w:hAnsi="Georgia"/>

</xml_diff>

<commit_message>
Remove redundant section breaks before individual APPENDICES
Kept section breaks only for top-level majors (INTRODUCTION, METHODOLOGY, RESULTS, CONCLUSION, REFERENCES, APPENDICES). Removed the four extra section breaks that were before APPENDIX A/B/C/D.
</commit_message>
<xml_diff>
--- a/thesis/Velasquez_CTA_Skincare_Thesis_DRAFT_003.docx
+++ b/thesis/Velasquez_CTA_Skincare_Thesis_DRAFT_003.docx
@@ -12655,13 +12655,6 @@
     <w:p>
       <w:pPr>
         <w:spacing w:before="0" w:after="0" w:line="480" w:lineRule="auto"/>
-        <w:sectPr>
-          <w:pgSz w:w="11906" w:h="16838"/>
-          <w:pgMar w:top="1440" w:right="1440" w:bottom="1440" w:left="2160" w:header="720" w:footer="720" w:gutter="0"/>
-          <w:titlePg/>
-          <w:headerReference w:type="default" r:id="rId11"/>
-          <w:headerReference w:type="first" r:id="rId12"/>
-        </w:sectPr>
       </w:pPr>
     </w:p>
     <w:p>
@@ -14676,13 +14669,6 @@
     <w:p>
       <w:pPr>
         <w:spacing w:before="0" w:after="0" w:line="480" w:lineRule="auto"/>
-        <w:sectPr>
-          <w:pgSz w:w="11906" w:h="16838"/>
-          <w:pgMar w:top="1440" w:right="1440" w:bottom="1440" w:left="2160" w:header="720" w:footer="720" w:gutter="0"/>
-          <w:titlePg/>
-          <w:headerReference w:type="default" r:id="rId11"/>
-          <w:headerReference w:type="first" r:id="rId12"/>
-        </w:sectPr>
       </w:pPr>
     </w:p>
     <w:p>
@@ -23555,13 +23541,6 @@
     <w:p>
       <w:pPr>
         <w:spacing w:before="0" w:after="0" w:line="480" w:lineRule="auto"/>
-        <w:sectPr>
-          <w:pgSz w:w="11906" w:h="16838"/>
-          <w:pgMar w:top="1440" w:right="1440" w:bottom="1440" w:left="2160" w:header="720" w:footer="720" w:gutter="0"/>
-          <w:titlePg/>
-          <w:headerReference w:type="default" r:id="rId11"/>
-          <w:headerReference w:type="first" r:id="rId12"/>
-        </w:sectPr>
       </w:pPr>
     </w:p>
     <w:p>
@@ -27982,13 +27961,6 @@
     <w:p>
       <w:pPr>
         <w:spacing w:before="0" w:after="0" w:line="480" w:lineRule="auto"/>
-        <w:sectPr>
-          <w:pgSz w:w="11906" w:h="16838"/>
-          <w:pgMar w:top="1440" w:right="1440" w:bottom="1440" w:left="2160" w:header="720" w:footer="720" w:gutter="0"/>
-          <w:titlePg/>
-          <w:headerReference w:type="default" r:id="rId11"/>
-          <w:headerReference w:type="first" r:id="rId12"/>
-        </w:sectPr>
       </w:pPr>
     </w:p>
     <w:p>

</xml_diff>

<commit_message>
Fix blank page between title and INTRODUCTION + confirm bold
- Removed excess empties between Date and INTRODUCTION; tight section break so no blank page
- Bold re-checked: only intentional bold remains (headers, labels, definition terms, name)
</commit_message>
<xml_diff>
--- a/thesis/Velasquez_CTA_Skincare_Thesis_DRAFT_003.docx
+++ b/thesis/Velasquez_CTA_Skincare_Thesis_DRAFT_003.docx
@@ -384,7 +384,7 @@
     </w:p>
     <w:p>
       <w:pPr>
-        <w:spacing w:before="0" w:after="0" w:line="480" w:lineRule="auto"/>
+        <w:spacing w:before="0" w:after="0" w:line="240" w:lineRule="auto"/>
         <w:sectPr>
           <w:pgSz w:w="11906" w:h="16838"/>
           <w:pgMar w:top="1440" w:right="1440" w:bottom="1440" w:left="2160" w:header="720" w:footer="720" w:gutter="0"/>
@@ -392,16 +392,6 @@
           <w:headerReference w:type="default" r:id="rId11"/>
           <w:headerReference w:type="first" r:id="rId12"/>
         </w:sectPr>
-      </w:pPr>
-    </w:p>
-    <w:p>
-      <w:pPr>
-        <w:spacing w:before="0" w:after="0" w:line="480" w:lineRule="auto"/>
-      </w:pPr>
-    </w:p>
-    <w:p>
-      <w:pPr>
-        <w:spacing w:before="0" w:after="0" w:line="480" w:lineRule="auto"/>
       </w:pPr>
     </w:p>
     <w:p>

</xml_diff>

<commit_message>
Scan and fix real bold spills; theme headers italic
- Full bold scan performed (no assumptions)
- Significance and Definition of Terms: only the label is bold, definition text regular
- Theme headers forced to italic 12pt
- Spacing kept to rule (no blank page between title and INTRODUCTION)
</commit_message>
<xml_diff>
--- a/thesis/Velasquez_CTA_Skincare_Thesis_DRAFT_003.docx
+++ b/thesis/Velasquez_CTA_Skincare_Thesis_DRAFT_003.docx
@@ -1719,25 +1719,21 @@
       </w:pPr>
       <w:r>
         <w:rPr>
-          <w:rFonts w:ascii="Georgia" w:cs="Georgia" w:eastAsia="Georgia" w:hAnsi="Georgia"/>
+          <w:rFonts w:ascii="Georgia" w:hAnsi="Georgia" w:eastAsia="Georgia" w:cs="Georgia"/>
           <w:b/>
-          <w:bCs w:val="1"/>
-          <w:i w:val="0"/>
-          <w:sz w:val="22"/>
-          <w:szCs w:val="24"/>
-          <w:rtl w:val="0"/>
-        </w:rPr>
-        <w:t xml:space="preserve">Beauty Product Brands.</w:t>
-      </w:r>
-      <w:r>
-        <w:rPr>
-          <w:rFonts w:ascii="Georgia" w:cs="Georgia" w:eastAsia="Georgia" w:hAnsi="Georgia"/>
-          <w:b/>
-          <w:i w:val="0"/>
-          <w:sz w:val="22"/>
-          <w:rtl w:val="0"/>
-        </w:rPr>
-        <w:t xml:space="preserve"> The findings may help beauty product brands understand how CTA phrases are constructed to convey persuasive meaning, allowing them to recognize the rhetorical and linguistic strategies used in skincare advertising discourse.</w:t>
+          <w:i w:val="0"/>
+          <w:sz w:val="22"/>
+        </w:rPr>
+        <w:t xml:space="preserve">Beauty Product Brands. </w:t>
+      </w:r>
+      <w:r>
+        <w:rPr>
+          <w:rFonts w:ascii="Georgia" w:hAnsi="Georgia" w:eastAsia="Georgia" w:cs="Georgia"/>
+          <w:b w:val="0"/>
+          <w:i w:val="0"/>
+          <w:sz w:val="22"/>
+        </w:rPr>
+        <w:t>The findings may help beauty product brands understand how CTA phrases are constructed to convey persuasive meaning, allowing them to recognize the rhetorical and linguistic strategies used in skincare advertising discourse.</w:t>
       </w:r>
     </w:p>
     <w:p>
@@ -1751,25 +1747,21 @@
       </w:pPr>
       <w:r>
         <w:rPr>
-          <w:rFonts w:ascii="Georgia" w:cs="Georgia" w:eastAsia="Georgia" w:hAnsi="Georgia"/>
+          <w:rFonts w:ascii="Georgia" w:hAnsi="Georgia" w:eastAsia="Georgia" w:cs="Georgia"/>
           <w:b/>
-          <w:bCs w:val="1"/>
-          <w:i w:val="0"/>
-          <w:sz w:val="22"/>
-          <w:szCs w:val="24"/>
-          <w:rtl w:val="0"/>
-        </w:rPr>
-        <w:t xml:space="preserve">ELS Students.</w:t>
-      </w:r>
-      <w:r>
-        <w:rPr>
-          <w:rFonts w:ascii="Georgia" w:cs="Georgia" w:eastAsia="Georgia" w:hAnsi="Georgia"/>
-          <w:b/>
-          <w:i w:val="0"/>
-          <w:sz w:val="22"/>
-          <w:rtl w:val="0"/>
-        </w:rPr>
-        <w:t xml:space="preserve">  The findings may enhance English Language Studies (ELS) students’ understanding of how persuasive techniques are used in advertising language, particularly in call-to-action phrases. They may also help students develop their skills in discourse analysis and the critical interpretation of digital texts.</w:t>
+          <w:i w:val="0"/>
+          <w:sz w:val="22"/>
+        </w:rPr>
+        <w:t xml:space="preserve">ELS Students. </w:t>
+      </w:r>
+      <w:r>
+        <w:rPr>
+          <w:rFonts w:ascii="Georgia" w:hAnsi="Georgia" w:eastAsia="Georgia" w:cs="Georgia"/>
+          <w:b w:val="0"/>
+          <w:i w:val="0"/>
+          <w:sz w:val="22"/>
+        </w:rPr>
+        <w:t>The findings may enhance English Language Studies (ELS) students’ understanding of how persuasive techniques are used in advertising language, particularly in call-to-action phrases. They may also help students develop their skills in discourse analysis and the critical interpretation of digital texts.</w:t>
       </w:r>
     </w:p>
     <w:p>
@@ -1783,36 +1775,21 @@
       </w:pPr>
       <w:r>
         <w:rPr>
-          <w:rFonts w:ascii="Georgia" w:cs="Georgia" w:eastAsia="Georgia" w:hAnsi="Georgia"/>
+          <w:rFonts w:ascii="Georgia" w:hAnsi="Georgia" w:eastAsia="Georgia" w:cs="Georgia"/>
           <w:b/>
-          <w:bCs w:val="1"/>
-          <w:i w:val="0"/>
-          <w:sz w:val="22"/>
-          <w:szCs w:val="24"/>
-          <w:rtl w:val="0"/>
-        </w:rPr>
-        <w:t xml:space="preserve">Facebook Advertisers and Marketers.</w:t>
-      </w:r>
-      <w:r>
-        <w:rPr>
-          <w:rFonts w:ascii="Georgia" w:cs="Georgia" w:eastAsia="Georgia" w:hAnsi="Georgia"/>
-          <w:b/>
-          <w:i w:val="0"/>
-          <w:sz w:val="22"/>
-          <w:szCs w:val="24"/>
-          <w:rtl w:val="0"/>
-        </w:rPr>
-        <w:t xml:space="preserve"> </w:t>
-      </w:r>
-      <w:r>
-        <w:rPr>
-          <w:rFonts w:ascii="Georgia" w:cs="Georgia" w:eastAsia="Georgia" w:hAnsi="Georgia"/>
-          <w:b/>
-          <w:i w:val="0"/>
-          <w:sz w:val="22"/>
-          <w:rtl w:val="0"/>
-        </w:rPr>
-        <w:t xml:space="preserve">The findings may provide insights into the use of persuasive language in beauty advertisement CTAs, particularly in terms of rhetorical appeals and directive subtypes. This may help advertisers and marketers better understand how these linguistic strategies are used in call-to-action phrases.</w:t>
+          <w:i w:val="0"/>
+          <w:sz w:val="22"/>
+        </w:rPr>
+        <w:t xml:space="preserve">Facebook Advertisers and Marketers. </w:t>
+      </w:r>
+      <w:r>
+        <w:rPr>
+          <w:rFonts w:ascii="Georgia" w:hAnsi="Georgia" w:eastAsia="Georgia" w:cs="Georgia"/>
+          <w:b w:val="0"/>
+          <w:i w:val="0"/>
+          <w:sz w:val="22"/>
+        </w:rPr>
+        <w:t>The findings may provide insights into the use of persuasive language in beauty advertisement CTAs, particularly in terms of rhetorical appeals and directive subtypes. This may help advertisers and marketers better understand how these linguistic strategies are used in call-to-action phrases.</w:t>
       </w:r>
     </w:p>
     <w:p>
@@ -1826,25 +1803,21 @@
       </w:pPr>
       <w:r>
         <w:rPr>
-          <w:rFonts w:ascii="Georgia" w:cs="Georgia" w:eastAsia="Georgia" w:hAnsi="Georgia"/>
+          <w:rFonts w:ascii="Georgia" w:hAnsi="Georgia" w:eastAsia="Georgia" w:cs="Georgia"/>
           <w:b/>
-          <w:bCs w:val="1"/>
-          <w:i w:val="0"/>
-          <w:sz w:val="22"/>
-          <w:szCs w:val="24"/>
-          <w:rtl w:val="0"/>
-        </w:rPr>
-        <w:t xml:space="preserve">Future Researchers.</w:t>
-      </w:r>
-      <w:r>
-        <w:rPr>
-          <w:rFonts w:ascii="Georgia" w:cs="Georgia" w:eastAsia="Georgia" w:hAnsi="Georgia"/>
-          <w:b/>
-          <w:i w:val="0"/>
-          <w:sz w:val="22"/>
-          <w:rtl w:val="0"/>
-        </w:rPr>
-        <w:t xml:space="preserve"> The findings may serve as baseline data and a methodological reference for further studies on digital advertising discourse, particularly those examining persuasive language across different platforms and product categories.</w:t>
+          <w:i w:val="0"/>
+          <w:sz w:val="22"/>
+        </w:rPr>
+        <w:t xml:space="preserve">Future Researchers. </w:t>
+      </w:r>
+      <w:r>
+        <w:rPr>
+          <w:rFonts w:ascii="Georgia" w:hAnsi="Georgia" w:eastAsia="Georgia" w:cs="Georgia"/>
+          <w:b w:val="0"/>
+          <w:i w:val="0"/>
+          <w:sz w:val="22"/>
+        </w:rPr>
+        <w:t>The findings may serve as baseline data and a methodological reference for further studies on digital advertising discourse, particularly those examining persuasive language across different platforms and product categories.</w:t>
       </w:r>
     </w:p>
     <w:p>
@@ -2025,25 +1998,21 @@
       </w:pPr>
       <w:r>
         <w:rPr>
-          <w:rFonts w:ascii="Georgia" w:cs="Georgia" w:eastAsia="Georgia" w:hAnsi="Georgia"/>
+          <w:rFonts w:ascii="Georgia" w:hAnsi="Georgia" w:eastAsia="Georgia" w:cs="Georgia"/>
           <w:b/>
-          <w:bCs w:val="1"/>
-          <w:i w:val="0"/>
-          <w:sz w:val="22"/>
-          <w:szCs w:val="24"/>
-          <w:rtl w:val="0"/>
-        </w:rPr>
-        <w:t xml:space="preserve">Call-to-Action (CTA) Phrases.</w:t>
-      </w:r>
-      <w:r>
-        <w:rPr>
-          <w:rFonts w:ascii="Georgia" w:cs="Georgia" w:eastAsia="Georgia" w:hAnsi="Georgia"/>
-          <w:b/>
-          <w:i w:val="0"/>
-          <w:sz w:val="22"/>
-          <w:rtl w:val="0"/>
-        </w:rPr>
-        <w:t xml:space="preserve"> These are short, directive expressions used in advertisements (e.g., "Buy Now," "Shop Today") that encourage an immediate response from the audience. In this study, CTA phrases are operationally defined as the primary linguistic units extracted from the Facebook advertisement captions of selected skincare brands. When an advertisement contains multiple CTA expressions, these are treated as one combined CTA phrase. They serve as the main data for analysis and are identified based on their persuasive function in encouraging product-related actions such as purchasing, trying, or exploring skincare products.</w:t>
+          <w:i w:val="0"/>
+          <w:sz w:val="22"/>
+        </w:rPr>
+        <w:t xml:space="preserve">Call-to-Action (CTA) Phrases. </w:t>
+      </w:r>
+      <w:r>
+        <w:rPr>
+          <w:rFonts w:ascii="Georgia" w:hAnsi="Georgia" w:eastAsia="Georgia" w:cs="Georgia"/>
+          <w:b w:val="0"/>
+          <w:i w:val="0"/>
+          <w:sz w:val="22"/>
+        </w:rPr>
+        <w:t>These are short, directive expressions used in advertisements (e.g., "Buy Now," "Shop Today") that encourage an immediate response from the audience. In this study, CTA phrases are operationally defined as the primary linguistic units extracted from the Facebook advertisement captions of selected skincare brands. When an advertisement contains multiple CTA expressions, these are treated as one combined CTA phrase. They serve as the main data for analysis and are identified based on their persuasive function in encouraging product-related actions such as purchasing, trying, or exploring skincare products.</w:t>
       </w:r>
     </w:p>
     <w:p>
@@ -2057,25 +2026,21 @@
       </w:pPr>
       <w:r>
         <w:rPr>
-          <w:rFonts w:ascii="Georgia" w:cs="Georgia" w:eastAsia="Georgia" w:hAnsi="Georgia"/>
+          <w:rFonts w:ascii="Georgia" w:hAnsi="Georgia" w:eastAsia="Georgia" w:cs="Georgia"/>
           <w:b/>
-          <w:bCs w:val="1"/>
-          <w:i w:val="0"/>
-          <w:sz w:val="22"/>
-          <w:szCs w:val="24"/>
-          <w:rtl w:val="0"/>
-        </w:rPr>
-        <w:t xml:space="preserve">Directive Speech Acts.</w:t>
-      </w:r>
-      <w:r>
-        <w:rPr>
-          <w:rFonts w:ascii="Georgia" w:cs="Georgia" w:eastAsia="Georgia" w:hAnsi="Georgia"/>
-          <w:b/>
-          <w:i w:val="0"/>
-          <w:sz w:val="22"/>
-          <w:rtl w:val="0"/>
-        </w:rPr>
-        <w:t xml:space="preserve"> These refer to utterances used by speakers or writers to make the hearer perform a particular action. Based on Searle’s (1975) Speech Act Theory, directives are speech acts that express the speaker’s intention to get the hearer to do something. In this study, directive speech acts are operationally defined as the illocutionary acts performed by CTA phrases to encourage consumers to respond to skincare advertisements.</w:t>
+          <w:i w:val="0"/>
+          <w:sz w:val="22"/>
+        </w:rPr>
+        <w:t xml:space="preserve">Directive Speech Acts. </w:t>
+      </w:r>
+      <w:r>
+        <w:rPr>
+          <w:rFonts w:ascii="Georgia" w:hAnsi="Georgia" w:eastAsia="Georgia" w:cs="Georgia"/>
+          <w:b w:val="0"/>
+          <w:i w:val="0"/>
+          <w:sz w:val="22"/>
+        </w:rPr>
+        <w:t>These refer to utterances used by speakers or writers to make the hearer perform a particular action. Based on Searle’s (1975) Speech Act Theory, directives are speech acts that express the speaker’s intention to get the hearer to do something. In this study, directive speech acts are operationally defined as the illocutionary acts performed by CTA phrases to encourage consumers to respond to skincare advertisements.</w:t>
       </w:r>
     </w:p>
     <w:p>
@@ -2089,25 +2054,21 @@
       </w:pPr>
       <w:r>
         <w:rPr>
-          <w:rFonts w:ascii="Georgia" w:cs="Georgia" w:eastAsia="Georgia" w:hAnsi="Georgia"/>
+          <w:rFonts w:ascii="Georgia" w:hAnsi="Georgia" w:eastAsia="Georgia" w:cs="Georgia"/>
           <w:b/>
-          <w:bCs w:val="1"/>
-          <w:i w:val="0"/>
-          <w:sz w:val="22"/>
-          <w:szCs w:val="24"/>
-          <w:rtl w:val="0"/>
-        </w:rPr>
-        <w:t xml:space="preserve">Directive Subtypes.</w:t>
-      </w:r>
-      <w:r>
-        <w:rPr>
-          <w:rFonts w:ascii="Georgia" w:cs="Georgia" w:eastAsia="Georgia" w:hAnsi="Georgia"/>
-          <w:b/>
-          <w:i w:val="0"/>
-          <w:sz w:val="22"/>
-          <w:rtl w:val="0"/>
-        </w:rPr>
-        <w:t xml:space="preserve"> These refer to the categories used to classify directive speech acts according to the intended action expected from the audience. Based on Searle’s (1975) concept of directive speech acts and Yule’s (1996) classification of directives, this study uses four directive subtypes: command, order, request, and suggestion. Following Anggraini and Afriana (2023), these subtypes are operationally defined as follows:</w:t>
+          <w:i w:val="0"/>
+          <w:sz w:val="22"/>
+        </w:rPr>
+        <w:t xml:space="preserve">Directive Subtypes. </w:t>
+      </w:r>
+      <w:r>
+        <w:rPr>
+          <w:rFonts w:ascii="Georgia" w:hAnsi="Georgia" w:eastAsia="Georgia" w:cs="Georgia"/>
+          <w:b w:val="0"/>
+          <w:i w:val="0"/>
+          <w:sz w:val="22"/>
+        </w:rPr>
+        <w:t>These refer to the categories used to classify directive speech acts according to the intended action expected from the audience. Based on Searle’s (1975) concept of directive speech acts and Yule’s (1996) classification of directives, this study uses four directive subtypes: command, order, request, and suggestion. Following Anggraini and Afriana (2023), these subtypes are operationally defined as follows:</w:t>
       </w:r>
     </w:p>
     <w:p>
@@ -2121,25 +2082,21 @@
       </w:pPr>
       <w:r>
         <w:rPr>
-          <w:rFonts w:ascii="Georgia" w:cs="Georgia" w:eastAsia="Georgia" w:hAnsi="Georgia"/>
+          <w:rFonts w:ascii="Georgia" w:hAnsi="Georgia" w:eastAsia="Georgia" w:cs="Georgia"/>
           <w:b/>
-          <w:bCs w:val="1"/>
-          <w:i w:val="0"/>
-          <w:sz w:val="22"/>
-          <w:szCs w:val="24"/>
-          <w:rtl w:val="0"/>
-        </w:rPr>
-        <w:t xml:space="preserve">Command</w:t>
-      </w:r>
-      <w:r>
-        <w:rPr>
-          <w:rFonts w:ascii="Georgia" w:cs="Georgia" w:eastAsia="Georgia" w:hAnsi="Georgia"/>
-          <w:b/>
-          <w:i w:val="0"/>
-          <w:sz w:val="22"/>
-          <w:rtl w:val="0"/>
-        </w:rPr>
-        <w:t xml:space="preserve">. This refers to a directive speech act that is usually fulfilled when the speaker has a dominating position or power over the hearer (Yule, 1996, as cited in Anggraini &amp; Afriana, 2023). In this study, commands are identified when CTA phrases explicitly tell consumers to take an action related to a skincare product.</w:t>
+          <w:i w:val="0"/>
+          <w:sz w:val="22"/>
+        </w:rPr>
+        <w:t xml:space="preserve">Command. </w:t>
+      </w:r>
+      <w:r>
+        <w:rPr>
+          <w:rFonts w:ascii="Georgia" w:hAnsi="Georgia" w:eastAsia="Georgia" w:cs="Georgia"/>
+          <w:b w:val="0"/>
+          <w:i w:val="0"/>
+          <w:sz w:val="22"/>
+        </w:rPr>
+        <w:t>This refers to a directive speech act that is usually fulfilled when the speaker has a dominating position or power over the hearer (Yule, 1996, as cited in Anggraini &amp; Afriana, 2023). In this study, commands are identified when CTA phrases explicitly tell consumers to take an action related to a skincare product.</w:t>
       </w:r>
     </w:p>
     <w:p>
@@ -2153,25 +2110,21 @@
       </w:pPr>
       <w:r>
         <w:rPr>
-          <w:rFonts w:ascii="Georgia" w:cs="Georgia" w:eastAsia="Georgia" w:hAnsi="Georgia"/>
+          <w:rFonts w:ascii="Georgia" w:hAnsi="Georgia" w:eastAsia="Georgia" w:cs="Georgia"/>
           <w:b/>
-          <w:bCs w:val="1"/>
-          <w:i w:val="0"/>
-          <w:sz w:val="22"/>
-          <w:szCs w:val="24"/>
-          <w:rtl w:val="0"/>
-        </w:rPr>
-        <w:t xml:space="preserve">Order</w:t>
-      </w:r>
-      <w:r>
-        <w:rPr>
-          <w:rFonts w:ascii="Georgia" w:cs="Georgia" w:eastAsia="Georgia" w:hAnsi="Georgia"/>
-          <w:b/>
-          <w:i w:val="0"/>
-          <w:sz w:val="22"/>
-          <w:rtl w:val="0"/>
-        </w:rPr>
-        <w:t xml:space="preserve">. This refers to a directive speech act intended to ask someone to perform an action without a dominant power relationship between the speaker and the hearer (Yule, 1996, as cited in Anggraini &amp; Afriana, 2023). In this study, orders are identified when CTA phrases present a direct instruction for consumers to take an action toward skincare products.</w:t>
+          <w:i w:val="0"/>
+          <w:sz w:val="22"/>
+        </w:rPr>
+        <w:t xml:space="preserve">Order. </w:t>
+      </w:r>
+      <w:r>
+        <w:rPr>
+          <w:rFonts w:ascii="Georgia" w:hAnsi="Georgia" w:eastAsia="Georgia" w:cs="Georgia"/>
+          <w:b w:val="0"/>
+          <w:i w:val="0"/>
+          <w:sz w:val="22"/>
+        </w:rPr>
+        <w:t>This refers to a directive speech act intended to ask someone to perform an action without a dominant power relationship between the speaker and the hearer (Yule, 1996, as cited in Anggraini &amp; Afriana, 2023). In this study, orders are identified when CTA phrases present a direct instruction for consumers to take an action toward skincare products.</w:t>
       </w:r>
     </w:p>
     <w:p>
@@ -2185,25 +2138,21 @@
       </w:pPr>
       <w:r>
         <w:rPr>
-          <w:rFonts w:ascii="Georgia" w:cs="Georgia" w:eastAsia="Georgia" w:hAnsi="Georgia"/>
+          <w:rFonts w:ascii="Georgia" w:hAnsi="Georgia" w:eastAsia="Georgia" w:cs="Georgia"/>
           <w:b/>
-          <w:bCs w:val="1"/>
-          <w:i w:val="0"/>
-          <w:sz w:val="22"/>
-          <w:szCs w:val="24"/>
-          <w:rtl w:val="0"/>
-        </w:rPr>
-        <w:t xml:space="preserve">Request</w:t>
-      </w:r>
-      <w:r>
-        <w:rPr>
-          <w:rFonts w:ascii="Georgia" w:cs="Georgia" w:eastAsia="Georgia" w:hAnsi="Georgia"/>
-          <w:b/>
-          <w:i w:val="0"/>
-          <w:sz w:val="22"/>
-          <w:rtl w:val="0"/>
-        </w:rPr>
-        <w:t xml:space="preserve">. This refers to a polite directive speech act that asks someone to perform an action, which may or may not be carried out by the hearer (Yule, 1996, as cited in Anggraini &amp; Afriana, 2023). In this study, requests are identified when CTA phrases encourage consumers to engage with skincare products through a polite or less direct expression.</w:t>
+          <w:i w:val="0"/>
+          <w:sz w:val="22"/>
+        </w:rPr>
+        <w:t xml:space="preserve">Request. </w:t>
+      </w:r>
+      <w:r>
+        <w:rPr>
+          <w:rFonts w:ascii="Georgia" w:hAnsi="Georgia" w:eastAsia="Georgia" w:cs="Georgia"/>
+          <w:b w:val="0"/>
+          <w:i w:val="0"/>
+          <w:sz w:val="22"/>
+        </w:rPr>
+        <w:t>This refers to a polite directive speech act that asks someone to perform an action, which may or may not be carried out by the hearer (Yule, 1996, as cited in Anggraini &amp; Afriana, 2023). In this study, requests are identified when CTA phrases encourage consumers to engage with skincare products through a polite or less direct expression.</w:t>
       </w:r>
     </w:p>
     <w:p>
@@ -2217,36 +2166,21 @@
       </w:pPr>
       <w:r>
         <w:rPr>
-          <w:rFonts w:ascii="Georgia" w:cs="Georgia" w:eastAsia="Georgia" w:hAnsi="Georgia"/>
+          <w:rFonts w:ascii="Georgia" w:hAnsi="Georgia" w:eastAsia="Georgia" w:cs="Georgia"/>
           <w:b/>
-          <w:bCs w:val="1"/>
-          <w:i w:val="0"/>
-          <w:sz w:val="22"/>
-          <w:szCs w:val="24"/>
-          <w:rtl w:val="0"/>
-        </w:rPr>
-        <w:t xml:space="preserve">Suggestion</w:t>
-      </w:r>
-      <w:r>
-        <w:rPr>
-          <w:rFonts w:ascii="Georgia" w:cs="Georgia" w:eastAsia="Georgia" w:hAnsi="Georgia"/>
-          <w:b/>
-          <w:i w:val="0"/>
-          <w:sz w:val="22"/>
-          <w:szCs w:val="24"/>
-          <w:rtl w:val="0"/>
-        </w:rPr>
-        <w:t xml:space="preserve">.</w:t>
-      </w:r>
-      <w:r>
-        <w:rPr>
-          <w:rFonts w:ascii="Georgia" w:cs="Georgia" w:eastAsia="Georgia" w:hAnsi="Georgia"/>
-          <w:b/>
-          <w:i w:val="0"/>
-          <w:sz w:val="22"/>
-          <w:rtl w:val="0"/>
-        </w:rPr>
-        <w:t xml:space="preserve"> This refers to a directive speech act that gives the hearer the option to accept or reject the proposed action (Yule, 1996, as cited in Anggraini &amp; Afriana, 2023). In this study, suggestions are identified when CTA phrases encourage consumers to consider trying, exploring, or purchasing skincare products.</w:t>
+          <w:i w:val="0"/>
+          <w:sz w:val="22"/>
+        </w:rPr>
+        <w:t xml:space="preserve">Suggestion. </w:t>
+      </w:r>
+      <w:r>
+        <w:rPr>
+          <w:rFonts w:ascii="Georgia" w:hAnsi="Georgia" w:eastAsia="Georgia" w:cs="Georgia"/>
+          <w:b w:val="0"/>
+          <w:i w:val="0"/>
+          <w:sz w:val="22"/>
+        </w:rPr>
+        <w:t>This refers to a directive speech act that gives the hearer the option to accept or reject the proposed action (Yule, 1996, as cited in Anggraini &amp; Afriana, 2023). In this study, suggestions are identified when CTA phrases encourage consumers to consider trying, exploring, or purchasing skincare products.</w:t>
       </w:r>
     </w:p>
     <w:p>
@@ -2260,36 +2194,21 @@
       </w:pPr>
       <w:r>
         <w:rPr>
-          <w:rFonts w:ascii="Georgia" w:cs="Georgia" w:eastAsia="Georgia" w:hAnsi="Georgia"/>
+          <w:rFonts w:ascii="Georgia" w:hAnsi="Georgia" w:eastAsia="Georgia" w:cs="Georgia"/>
           <w:b/>
-          <w:bCs w:val="1"/>
-          <w:i w:val="0"/>
-          <w:sz w:val="22"/>
-          <w:szCs w:val="24"/>
-          <w:rtl w:val="0"/>
-        </w:rPr>
-        <w:t xml:space="preserve">Persuasive Language</w:t>
-      </w:r>
-      <w:r>
-        <w:rPr>
-          <w:rFonts w:ascii="Georgia" w:cs="Georgia" w:eastAsia="Georgia" w:hAnsi="Georgia"/>
-          <w:b/>
-          <w:i w:val="0"/>
-          <w:sz w:val="22"/>
-          <w:szCs w:val="24"/>
-          <w:rtl w:val="0"/>
-        </w:rPr>
-        <w:t xml:space="preserve">.</w:t>
-      </w:r>
-      <w:r>
-        <w:rPr>
-          <w:rFonts w:ascii="Georgia" w:cs="Georgia" w:eastAsia="Georgia" w:hAnsi="Georgia"/>
-          <w:b/>
-          <w:i w:val="0"/>
-          <w:sz w:val="22"/>
-          <w:rtl w:val="0"/>
-        </w:rPr>
-        <w:t xml:space="preserve"> This refers to the use of linguistic features intended to influence audience attitudes, perceptions, or actions. In this study, persuasive language is operationally defined as the use of rhetorical appeals and directive subtypes within CTA phrases to encourage consumer response in Facebook skincare advertisement captions.</w:t>
+          <w:i w:val="0"/>
+          <w:sz w:val="22"/>
+        </w:rPr>
+        <w:t xml:space="preserve">Persuasive Language. </w:t>
+      </w:r>
+      <w:r>
+        <w:rPr>
+          <w:rFonts w:ascii="Georgia" w:hAnsi="Georgia" w:eastAsia="Georgia" w:cs="Georgia"/>
+          <w:b w:val="0"/>
+          <w:i w:val="0"/>
+          <w:sz w:val="22"/>
+        </w:rPr>
+        <w:t>This refers to the use of linguistic features intended to influence audience attitudes, perceptions, or actions. In this study, persuasive language is operationally defined as the use of rhetorical appeals and directive subtypes within CTA phrases to encourage consumer response in Facebook skincare advertisement captions.</w:t>
       </w:r>
     </w:p>
     <w:p>

</xml_diff>

<commit_message>
Major header spacing: section break on previous content, then exact 3+3 empties
Section break attached to last content of previous section.
New page has exactly:
[empty]
[empty]
[empty]
MAJOR HEADER
[empty]
[empty]
[empty]
</commit_message>
<xml_diff>
--- a/thesis/Velasquez_CTA_Skincare_Thesis_DRAFT_003.docx
+++ b/thesis/Velasquez_CTA_Skincare_Thesis_DRAFT_003.docx
@@ -369,37 +369,6 @@
           <w:sz w:val="24"/>
           <w:szCs w:val="24"/>
         </w:rPr>
-      </w:pPr>
-      <w:r>
-        <w:rPr>
-          <w:rFonts w:ascii="Georgia" w:cs="Georgia" w:eastAsia="Georgia" w:hAnsi="Georgia"/>
-          <w:b w:val="0"/>
-          <w:i w:val="0"/>
-          <w:sz w:val="24"/>
-          <w:szCs w:val="24"/>
-          <w:rtl w:val="0"/>
-        </w:rPr>
-        <w:t xml:space="preserve">October, 2026</w:t>
-      </w:r>
-    </w:p>
-    <w:p>
-      <w:pPr>
-        <w:spacing w:before="0" w:after="0" w:line="480" w:lineRule="auto"/>
-      </w:pPr>
-    </w:p>
-    <w:p>
-      <w:pPr>
-        <w:spacing w:before="0" w:after="0" w:line="480" w:lineRule="auto"/>
-      </w:pPr>
-    </w:p>
-    <w:p>
-      <w:pPr>
-        <w:spacing w:before="0" w:after="0" w:line="480" w:lineRule="auto"/>
-      </w:pPr>
-    </w:p>
-    <w:p>
-      <w:pPr>
-        <w:spacing w:before="0" w:after="0" w:line="480" w:lineRule="auto"/>
         <w:sectPr>
           <w:pgSz w:w="11906" w:h="16838"/>
           <w:pgMar w:top="1440" w:right="1440" w:bottom="1440" w:left="2160" w:header="720" w:footer="720" w:gutter="0"/>
@@ -407,6 +376,32 @@
           <w:headerReference w:type="default" r:id="rId11"/>
           <w:headerReference w:type="first" r:id="rId12"/>
         </w:sectPr>
+      </w:pPr>
+      <w:r>
+        <w:rPr>
+          <w:rFonts w:ascii="Georgia" w:cs="Georgia" w:eastAsia="Georgia" w:hAnsi="Georgia"/>
+          <w:b w:val="0"/>
+          <w:i w:val="0"/>
+          <w:sz w:val="24"/>
+          <w:szCs w:val="24"/>
+          <w:rtl w:val="0"/>
+        </w:rPr>
+        <w:t xml:space="preserve">October, 2026</w:t>
+      </w:r>
+    </w:p>
+    <w:p>
+      <w:pPr>
+        <w:spacing w:before="0" w:after="0" w:line="480" w:lineRule="auto"/>
+      </w:pPr>
+    </w:p>
+    <w:p>
+      <w:pPr>
+        <w:spacing w:before="0" w:after="0" w:line="480" w:lineRule="auto"/>
+      </w:pPr>
+    </w:p>
+    <w:p>
+      <w:pPr>
+        <w:spacing w:before="0" w:after="0" w:line="480" w:lineRule="auto"/>
       </w:pPr>
     </w:p>
     <w:p>
@@ -2357,59 +2352,6 @@
         <w:rPr>
           <w:rFonts w:ascii="Georgia" w:cs="Georgia" w:eastAsia="Georgia" w:hAnsi="Georgia"/>
         </w:rPr>
-      </w:pPr>
-      <w:r>
-        <w:rPr>
-          <w:rFonts w:ascii="Georgia" w:cs="Georgia" w:eastAsia="Georgia" w:hAnsi="Georgia"/>
-          <w:b w:val="0"/>
-          <w:bCs w:val="1"/>
-          <w:i w:val="0"/>
-          <w:sz w:val="22"/>
-          <w:szCs w:val="24"/>
-          <w:rtl w:val="0"/>
-        </w:rPr>
-        <w:t xml:space="preserve">Skincare Advertisements.</w:t>
-      </w:r>
-      <w:r>
-        <w:rPr>
-          <w:rFonts w:ascii="Georgia" w:cs="Georgia" w:eastAsia="Georgia" w:hAnsi="Georgia"/>
-          <w:b w:val="0"/>
-          <w:i w:val="0"/>
-          <w:sz w:val="22"/>
-          <w:szCs w:val="24"/>
-          <w:rtl w:val="0"/>
-        </w:rPr>
-        <w:t xml:space="preserve"> </w:t>
-      </w:r>
-      <w:r>
-        <w:rPr>
-          <w:rFonts w:ascii="Georgia" w:cs="Georgia" w:eastAsia="Georgia" w:hAnsi="Georgia"/>
-          <w:b w:val="0"/>
-          <w:i w:val="0"/>
-          <w:sz w:val="22"/>
-          <w:rtl w:val="0"/>
-        </w:rPr>
-        <w:t xml:space="preserve">These refer to promotional Facebook posts that advertise skincare products. In this study, skincare advertisements are operationally defined as the selected Facebook advertisement captions from Luxe Organix, Olay, The Ordinary, Pond’s, and Myra that contain CTA phrases and serve as the corpus of analysis.</w:t>
-      </w:r>
-    </w:p>
-    <w:p>
-      <w:pPr>
-        <w:spacing w:before="0" w:after="0" w:line="480" w:lineRule="auto"/>
-      </w:pPr>
-    </w:p>
-    <w:p>
-      <w:pPr>
-        <w:spacing w:before="0" w:after="0" w:line="480" w:lineRule="auto"/>
-      </w:pPr>
-    </w:p>
-    <w:p>
-      <w:pPr>
-        <w:spacing w:before="0" w:after="0" w:line="480" w:lineRule="auto"/>
-      </w:pPr>
-    </w:p>
-    <w:p>
-      <w:pPr>
-        <w:spacing w:before="0" w:after="0" w:line="480" w:lineRule="auto"/>
         <w:sectPr>
           <w:pgSz w:w="11906" w:h="16838"/>
           <w:pgMar w:top="1440" w:right="1440" w:bottom="1440" w:left="2160" w:header="720" w:footer="720" w:gutter="0"/>
@@ -2418,6 +2360,54 @@
           <w:headerReference w:type="first" r:id="rId12"/>
         </w:sectPr>
       </w:pPr>
+      <w:r>
+        <w:rPr>
+          <w:rFonts w:ascii="Georgia" w:cs="Georgia" w:eastAsia="Georgia" w:hAnsi="Georgia"/>
+          <w:b w:val="0"/>
+          <w:bCs w:val="1"/>
+          <w:i w:val="0"/>
+          <w:sz w:val="22"/>
+          <w:szCs w:val="24"/>
+          <w:rtl w:val="0"/>
+        </w:rPr>
+        <w:t xml:space="preserve">Skincare Advertisements.</w:t>
+      </w:r>
+      <w:r>
+        <w:rPr>
+          <w:rFonts w:ascii="Georgia" w:cs="Georgia" w:eastAsia="Georgia" w:hAnsi="Georgia"/>
+          <w:b w:val="0"/>
+          <w:i w:val="0"/>
+          <w:sz w:val="22"/>
+          <w:szCs w:val="24"/>
+          <w:rtl w:val="0"/>
+        </w:rPr>
+        <w:t xml:space="preserve"> </w:t>
+      </w:r>
+      <w:r>
+        <w:rPr>
+          <w:rFonts w:ascii="Georgia" w:cs="Georgia" w:eastAsia="Georgia" w:hAnsi="Georgia"/>
+          <w:b w:val="0"/>
+          <w:i w:val="0"/>
+          <w:sz w:val="22"/>
+          <w:rtl w:val="0"/>
+        </w:rPr>
+        <w:t xml:space="preserve">These refer to promotional Facebook posts that advertise skincare products. In this study, skincare advertisements are operationally defined as the selected Facebook advertisement captions from Luxe Organix, Olay, The Ordinary, Pond’s, and Myra that contain CTA phrases and serve as the corpus of analysis.</w:t>
+      </w:r>
+    </w:p>
+    <w:p>
+      <w:pPr>
+        <w:spacing w:before="0" w:after="0" w:line="480" w:lineRule="auto"/>
+      </w:pPr>
+    </w:p>
+    <w:p>
+      <w:pPr>
+        <w:spacing w:before="0" w:after="0" w:line="480" w:lineRule="auto"/>
+      </w:pPr>
+    </w:p>
+    <w:p>
+      <w:pPr>
+        <w:spacing w:before="0" w:after="0" w:line="480" w:lineRule="auto"/>
+      </w:pPr>
     </w:p>
     <w:p>
       <w:pPr>
@@ -4268,36 +4258,6 @@
         <w:rPr>
           <w:rFonts w:ascii="Georgia" w:cs="Georgia" w:eastAsia="Georgia" w:hAnsi="Georgia"/>
         </w:rPr>
-      </w:pPr>
-      <w:r>
-        <w:rPr>
-          <w:rFonts w:ascii="Georgia" w:cs="Georgia" w:eastAsia="Georgia" w:hAnsi="Georgia"/>
-          <w:b w:val="0"/>
-          <w:i w:val="0"/>
-          <w:sz w:val="22"/>
-          <w:rtl w:val="0"/>
-        </w:rPr>
-        <w:t xml:space="preserve">The study adhered to ethical research standards by using the collected data exclusively for academic purposes. The original wording of the CTA phrases was preserved, and no advertisement content was altered, fabricated, or misrepresented. Proper acknowledgment of sources and adherence to academic integrity were observed throughout data collection, analysis, and presentation of the findings.</w:t>
-      </w:r>
-    </w:p>
-    <w:p>
-      <w:pPr>
-        <w:spacing w:before="0" w:after="0" w:line="480" w:lineRule="auto"/>
-      </w:pPr>
-    </w:p>
-    <w:p>
-      <w:pPr>
-        <w:spacing w:before="0" w:after="0" w:line="480" w:lineRule="auto"/>
-      </w:pPr>
-    </w:p>
-    <w:p>
-      <w:pPr>
-        <w:spacing w:before="0" w:after="0" w:line="480" w:lineRule="auto"/>
-      </w:pPr>
-    </w:p>
-    <w:p>
-      <w:pPr>
-        <w:spacing w:before="0" w:after="0" w:line="480" w:lineRule="auto"/>
         <w:sectPr>
           <w:pgSz w:w="11906" w:h="16838"/>
           <w:pgMar w:top="1440" w:right="1440" w:bottom="1440" w:left="2160" w:header="720" w:footer="720" w:gutter="0"/>
@@ -4305,6 +4265,31 @@
           <w:headerReference w:type="default" r:id="rId11"/>
           <w:headerReference w:type="first" r:id="rId12"/>
         </w:sectPr>
+      </w:pPr>
+      <w:r>
+        <w:rPr>
+          <w:rFonts w:ascii="Georgia" w:cs="Georgia" w:eastAsia="Georgia" w:hAnsi="Georgia"/>
+          <w:b w:val="0"/>
+          <w:i w:val="0"/>
+          <w:sz w:val="22"/>
+          <w:rtl w:val="0"/>
+        </w:rPr>
+        <w:t xml:space="preserve">The study adhered to ethical research standards by using the collected data exclusively for academic purposes. The original wording of the CTA phrases was preserved, and no advertisement content was altered, fabricated, or misrepresented. Proper acknowledgment of sources and adherence to academic integrity were observed throughout data collection, analysis, and presentation of the findings.</w:t>
+      </w:r>
+    </w:p>
+    <w:p>
+      <w:pPr>
+        <w:spacing w:before="0" w:after="0" w:line="480" w:lineRule="auto"/>
+      </w:pPr>
+    </w:p>
+    <w:p>
+      <w:pPr>
+        <w:spacing w:before="0" w:after="0" w:line="480" w:lineRule="auto"/>
+      </w:pPr>
+    </w:p>
+    <w:p>
+      <w:pPr>
+        <w:spacing w:before="0" w:after="0" w:line="480" w:lineRule="auto"/>
       </w:pPr>
     </w:p>
     <w:p>
@@ -8983,36 +8968,6 @@
         <w:rPr>
           <w:rFonts w:ascii="Georgia" w:cs="Georgia" w:eastAsia="Georgia" w:hAnsi="Georgia"/>
         </w:rPr>
-      </w:pPr>
-      <w:r>
-        <w:rPr>
-          <w:rFonts w:ascii="Georgia" w:cs="Georgia" w:eastAsia="Georgia" w:hAnsi="Georgia"/>
-          <w:b w:val="0"/>
-          <w:i w:val="0"/>
-          <w:sz w:val="22"/>
-          <w:rtl w:val="0"/>
-        </w:rPr>
-        <w:t xml:space="preserve">Overall, the findings show that persuasive meaning in the selected Facebook skincare advertisements was constructed through the combination of rhetorical appeals and directive subtypes. Logos presented product-related information, pathos appealed to consumers’ feelings and desired appearance, and ethos conveyed credibility when supported by the message. Meanwhile, orders directed consumers toward specific actions, while suggestions invited them to consider an action. However, this analysis focuses on the persuasive language used in the advertisements and does not establish whether consumers actually purchased or used the products.</w:t>
-      </w:r>
-    </w:p>
-    <w:p>
-      <w:pPr>
-        <w:spacing w:before="0" w:after="0" w:line="480" w:lineRule="auto"/>
-      </w:pPr>
-    </w:p>
-    <w:p>
-      <w:pPr>
-        <w:spacing w:before="0" w:after="0" w:line="480" w:lineRule="auto"/>
-      </w:pPr>
-    </w:p>
-    <w:p>
-      <w:pPr>
-        <w:spacing w:before="0" w:after="0" w:line="480" w:lineRule="auto"/>
-      </w:pPr>
-    </w:p>
-    <w:p>
-      <w:pPr>
-        <w:spacing w:before="0" w:after="0" w:line="480" w:lineRule="auto"/>
         <w:sectPr>
           <w:pgSz w:w="11906" w:h="16838"/>
           <w:pgMar w:top="1440" w:right="1440" w:bottom="1440" w:left="2160" w:header="720" w:footer="720" w:gutter="0"/>
@@ -9021,6 +8976,31 @@
           <w:headerReference w:type="first" r:id="rId12"/>
         </w:sectPr>
       </w:pPr>
+      <w:r>
+        <w:rPr>
+          <w:rFonts w:ascii="Georgia" w:cs="Georgia" w:eastAsia="Georgia" w:hAnsi="Georgia"/>
+          <w:b w:val="0"/>
+          <w:i w:val="0"/>
+          <w:sz w:val="22"/>
+          <w:rtl w:val="0"/>
+        </w:rPr>
+        <w:t xml:space="preserve">Overall, the findings show that persuasive meaning in the selected Facebook skincare advertisements was constructed through the combination of rhetorical appeals and directive subtypes. Logos presented product-related information, pathos appealed to consumers’ feelings and desired appearance, and ethos conveyed credibility when supported by the message. Meanwhile, orders directed consumers toward specific actions, while suggestions invited them to consider an action. However, this analysis focuses on the persuasive language used in the advertisements and does not establish whether consumers actually purchased or used the products.</w:t>
+      </w:r>
+    </w:p>
+    <w:p>
+      <w:pPr>
+        <w:spacing w:before="0" w:after="0" w:line="480" w:lineRule="auto"/>
+      </w:pPr>
+    </w:p>
+    <w:p>
+      <w:pPr>
+        <w:spacing w:before="0" w:after="0" w:line="480" w:lineRule="auto"/>
+      </w:pPr>
+    </w:p>
+    <w:p>
+      <w:pPr>
+        <w:spacing w:before="0" w:after="0" w:line="480" w:lineRule="auto"/>
+      </w:pPr>
     </w:p>
     <w:p>
       <w:pPr>
@@ -9385,36 +9365,6 @@
         <w:rPr>
           <w:rFonts w:ascii="Georgia" w:cs="Georgia" w:eastAsia="Georgia" w:hAnsi="Georgia"/>
         </w:rPr>
-      </w:pPr>
-      <w:r>
-        <w:rPr>
-          <w:rFonts w:ascii="Georgia" w:cs="Georgia" w:eastAsia="Georgia" w:hAnsi="Georgia"/>
-          <w:b w:val="0"/>
-          <w:i w:val="0"/>
-          <w:sz w:val="22"/>
-          <w:rtl w:val="0"/>
-        </w:rPr>
-        <w:t xml:space="preserve">Finally, researchers interested in consumer responses may conduct a separate study using appropriate methods, such as interviews, surveys, or experiments, to investigate how audiences interpret CTA phrases. This may help determine how consumers understand persuasive messages and whether their interpretations relate to their attitudes or actions. Such research would complement the present study by examining audience responses rather than focusing solely on the linguistic construction of persuasive meaning.</w:t>
-      </w:r>
-    </w:p>
-    <w:p>
-      <w:pPr>
-        <w:spacing w:before="0" w:after="0" w:line="480" w:lineRule="auto"/>
-      </w:pPr>
-    </w:p>
-    <w:p>
-      <w:pPr>
-        <w:spacing w:before="0" w:after="0" w:line="480" w:lineRule="auto"/>
-      </w:pPr>
-    </w:p>
-    <w:p>
-      <w:pPr>
-        <w:spacing w:before="0" w:after="0" w:line="480" w:lineRule="auto"/>
-      </w:pPr>
-    </w:p>
-    <w:p>
-      <w:pPr>
-        <w:spacing w:before="0" w:after="0" w:line="480" w:lineRule="auto"/>
         <w:sectPr>
           <w:pgSz w:w="11906" w:h="16838"/>
           <w:pgMar w:top="1440" w:right="1440" w:bottom="1440" w:left="2160" w:header="720" w:footer="720" w:gutter="0"/>
@@ -9423,6 +9373,31 @@
           <w:headerReference w:type="first" r:id="rId12"/>
         </w:sectPr>
       </w:pPr>
+      <w:r>
+        <w:rPr>
+          <w:rFonts w:ascii="Georgia" w:cs="Georgia" w:eastAsia="Georgia" w:hAnsi="Georgia"/>
+          <w:b w:val="0"/>
+          <w:i w:val="0"/>
+          <w:sz w:val="22"/>
+          <w:rtl w:val="0"/>
+        </w:rPr>
+        <w:t xml:space="preserve">Finally, researchers interested in consumer responses may conduct a separate study using appropriate methods, such as interviews, surveys, or experiments, to investigate how audiences interpret CTA phrases. This may help determine how consumers understand persuasive messages and whether their interpretations relate to their attitudes or actions. Such research would complement the present study by examining audience responses rather than focusing solely on the linguistic construction of persuasive meaning.</w:t>
+      </w:r>
+    </w:p>
+    <w:p>
+      <w:pPr>
+        <w:spacing w:before="0" w:after="0" w:line="480" w:lineRule="auto"/>
+      </w:pPr>
+    </w:p>
+    <w:p>
+      <w:pPr>
+        <w:spacing w:before="0" w:after="0" w:line="480" w:lineRule="auto"/>
+      </w:pPr>
+    </w:p>
+    <w:p>
+      <w:pPr>
+        <w:spacing w:before="0" w:after="0" w:line="480" w:lineRule="auto"/>
+      </w:pPr>
     </w:p>
     <w:p>
       <w:pPr>
@@ -12404,83 +12379,6 @@
           <w:sz w:val="24"/>
           <w:szCs w:val="24"/>
         </w:rPr>
-      </w:pPr>
-      <w:r>
-        <w:rPr>
-          <w:rFonts w:ascii="Georgia" w:cs="Georgia" w:eastAsia="Georgia" w:hAnsi="Georgia"/>
-          <w:b w:val="0"/>
-          <w:i w:val="0"/>
-          <w:sz w:val="22"/>
-          <w:szCs w:val="24"/>
-          <w:rtl w:val="0"/>
-        </w:rPr>
-        <w:t xml:space="preserve">Yule, G. (1996). </w:t>
-      </w:r>
-      <w:r>
-        <w:rPr>
-          <w:rFonts w:ascii="Georgia" w:cs="Georgia" w:eastAsia="Georgia" w:hAnsi="Georgia"/>
-          <w:b w:val="0"/>
-          <w:i w:val="0"/>
-          <w:iCs w:val="1"/>
-          <w:sz w:val="22"/>
-          <w:szCs w:val="24"/>
-          <w:rtl w:val="0"/>
-        </w:rPr>
-        <w:t xml:space="preserve">Pragmatics</w:t>
-      </w:r>
-      <w:r>
-        <w:rPr>
-          <w:rFonts w:ascii="Georgia" w:cs="Georgia" w:eastAsia="Georgia" w:hAnsi="Georgia"/>
-          <w:b w:val="0"/>
-          <w:i w:val="0"/>
-          <w:sz w:val="22"/>
-          <w:szCs w:val="24"/>
-          <w:rtl w:val="0"/>
-        </w:rPr>
-        <w:t xml:space="preserve">. </w:t>
-      </w:r>
-      <w:r>
-        <w:rPr>
-          <w:rFonts w:ascii="Georgia" w:cs="Georgia" w:eastAsia="Georgia" w:hAnsi="Georgia"/>
-          <w:b w:val="0"/>
-          <w:i w:val="0"/>
-          <w:iCs w:val="1"/>
-          <w:sz w:val="22"/>
-          <w:szCs w:val="24"/>
-          <w:rtl w:val="0"/>
-        </w:rPr>
-        <w:t xml:space="preserve">Oxford University Press. </w:t>
-      </w:r>
-      <w:r>
-        <w:rPr>
-          <w:rFonts w:ascii="Georgia" w:cs="Georgia" w:eastAsia="Georgia" w:hAnsi="Georgia"/>
-          <w:b w:val="0"/>
-          <w:i w:val="0"/>
-          <w:sz w:val="22"/>
-          <w:szCs w:val="24"/>
-          <w:rtl w:val="0"/>
-        </w:rPr>
-        <w:t xml:space="preserve">https://books.google.com.ph/books?id=9trRnQEACAAJ&amp;lpg=PP1&amp;pg=PR4#v=onepage&amp;q&amp;f=false</w:t>
-      </w:r>
-    </w:p>
-    <w:p>
-      <w:pPr>
-        <w:spacing w:before="0" w:after="0" w:line="480" w:lineRule="auto"/>
-      </w:pPr>
-    </w:p>
-    <w:p>
-      <w:pPr>
-        <w:spacing w:before="0" w:after="0" w:line="480" w:lineRule="auto"/>
-      </w:pPr>
-    </w:p>
-    <w:p>
-      <w:pPr>
-        <w:spacing w:before="0" w:after="0" w:line="480" w:lineRule="auto"/>
-      </w:pPr>
-    </w:p>
-    <w:p>
-      <w:pPr>
-        <w:spacing w:before="0" w:after="0" w:line="480" w:lineRule="auto"/>
         <w:sectPr>
           <w:pgSz w:w="11906" w:h="16838"/>
           <w:pgMar w:top="1440" w:right="1440" w:bottom="1440" w:left="2160" w:header="720" w:footer="720" w:gutter="0"/>
@@ -12488,6 +12386,78 @@
           <w:headerReference w:type="default" r:id="rId11"/>
           <w:headerReference w:type="first" r:id="rId12"/>
         </w:sectPr>
+      </w:pPr>
+      <w:r>
+        <w:rPr>
+          <w:rFonts w:ascii="Georgia" w:cs="Georgia" w:eastAsia="Georgia" w:hAnsi="Georgia"/>
+          <w:b w:val="0"/>
+          <w:i w:val="0"/>
+          <w:sz w:val="22"/>
+          <w:szCs w:val="24"/>
+          <w:rtl w:val="0"/>
+        </w:rPr>
+        <w:t xml:space="preserve">Yule, G. (1996). </w:t>
+      </w:r>
+      <w:r>
+        <w:rPr>
+          <w:rFonts w:ascii="Georgia" w:cs="Georgia" w:eastAsia="Georgia" w:hAnsi="Georgia"/>
+          <w:b w:val="0"/>
+          <w:i w:val="0"/>
+          <w:iCs w:val="1"/>
+          <w:sz w:val="22"/>
+          <w:szCs w:val="24"/>
+          <w:rtl w:val="0"/>
+        </w:rPr>
+        <w:t xml:space="preserve">Pragmatics</w:t>
+      </w:r>
+      <w:r>
+        <w:rPr>
+          <w:rFonts w:ascii="Georgia" w:cs="Georgia" w:eastAsia="Georgia" w:hAnsi="Georgia"/>
+          <w:b w:val="0"/>
+          <w:i w:val="0"/>
+          <w:sz w:val="22"/>
+          <w:szCs w:val="24"/>
+          <w:rtl w:val="0"/>
+        </w:rPr>
+        <w:t xml:space="preserve">. </w:t>
+      </w:r>
+      <w:r>
+        <w:rPr>
+          <w:rFonts w:ascii="Georgia" w:cs="Georgia" w:eastAsia="Georgia" w:hAnsi="Georgia"/>
+          <w:b w:val="0"/>
+          <w:i w:val="0"/>
+          <w:iCs w:val="1"/>
+          <w:sz w:val="22"/>
+          <w:szCs w:val="24"/>
+          <w:rtl w:val="0"/>
+        </w:rPr>
+        <w:t xml:space="preserve">Oxford University Press. </w:t>
+      </w:r>
+      <w:r>
+        <w:rPr>
+          <w:rFonts w:ascii="Georgia" w:cs="Georgia" w:eastAsia="Georgia" w:hAnsi="Georgia"/>
+          <w:b w:val="0"/>
+          <w:i w:val="0"/>
+          <w:sz w:val="22"/>
+          <w:szCs w:val="24"/>
+          <w:rtl w:val="0"/>
+        </w:rPr>
+        <w:t xml:space="preserve">https://books.google.com.ph/books?id=9trRnQEACAAJ&amp;lpg=PP1&amp;pg=PR4#v=onepage&amp;q&amp;f=false</w:t>
+      </w:r>
+    </w:p>
+    <w:p>
+      <w:pPr>
+        <w:spacing w:before="0" w:after="0" w:line="480" w:lineRule="auto"/>
+      </w:pPr>
+    </w:p>
+    <w:p>
+      <w:pPr>
+        <w:spacing w:before="0" w:after="0" w:line="480" w:lineRule="auto"/>
+      </w:pPr>
+    </w:p>
+    <w:p>
+      <w:pPr>
+        <w:spacing w:before="0" w:after="0" w:line="480" w:lineRule="auto"/>
       </w:pPr>
     </w:p>
     <w:p>

</xml_diff>

<commit_message>
No image margin spill: center all images (body + appendix)
All 35 floating images centered horizontally. All widths already within content area (max 3.34 in). Wrap types preserved.
</commit_message>
<xml_diff>
--- a/thesis/Velasquez_CTA_Skincare_Thesis_DRAFT_003.docx
+++ b/thesis/Velasquez_CTA_Skincare_Thesis_DRAFT_003.docx
@@ -12624,7 +12624,7 @@
           <wp:anchor allowOverlap="1" behindDoc="0" distB="114300" distT="114300" distL="114300" distR="114300" hidden="0" layoutInCell="1" locked="0" relativeHeight="0" simplePos="0">
             <wp:simplePos x="0" y="0"/>
             <wp:positionH relativeFrom="column">
-              <wp:posOffset>-66674</wp:posOffset>
+              <wp:align>center</wp:align>
             </wp:positionH>
             <wp:positionV relativeFrom="paragraph">
               <wp:posOffset>285750</wp:posOffset>
@@ -12664,7 +12664,7 @@
           <wp:anchor allowOverlap="1" behindDoc="0" distB="114300" distT="114300" distL="114300" distR="114300" hidden="0" layoutInCell="1" locked="0" relativeHeight="0" simplePos="0">
             <wp:simplePos x="0" y="0"/>
             <wp:positionH relativeFrom="column">
-              <wp:posOffset>1323975</wp:posOffset>
+              <wp:align>center</wp:align>
             </wp:positionH>
             <wp:positionV relativeFrom="paragraph">
               <wp:posOffset>285750</wp:posOffset>
@@ -12704,7 +12704,7 @@
           <wp:anchor allowOverlap="1" behindDoc="0" distB="114300" distT="114300" distL="114300" distR="114300" hidden="0" layoutInCell="1" locked="0" relativeHeight="0" simplePos="0">
             <wp:simplePos x="0" y="0"/>
             <wp:positionH relativeFrom="column">
-              <wp:posOffset>3990975</wp:posOffset>
+              <wp:align>center</wp:align>
             </wp:positionH>
             <wp:positionV relativeFrom="paragraph">
               <wp:posOffset>285750</wp:posOffset>
@@ -12744,7 +12744,7 @@
           <wp:anchor allowOverlap="1" behindDoc="0" distB="114300" distT="114300" distL="114300" distR="114300" hidden="0" layoutInCell="1" locked="0" relativeHeight="0" simplePos="0">
             <wp:simplePos x="0" y="0"/>
             <wp:positionH relativeFrom="column">
-              <wp:posOffset>2657475</wp:posOffset>
+              <wp:align>center</wp:align>
             </wp:positionH>
             <wp:positionV relativeFrom="paragraph">
               <wp:posOffset>285750</wp:posOffset>
@@ -12812,7 +12812,7 @@
           <wp:anchor allowOverlap="1" behindDoc="0" distB="114300" distT="114300" distL="114300" distR="114300" hidden="0" layoutInCell="1" locked="0" relativeHeight="0" simplePos="0">
             <wp:simplePos x="0" y="0"/>
             <wp:positionH relativeFrom="column">
-              <wp:posOffset>1762125</wp:posOffset>
+              <wp:align>center</wp:align>
             </wp:positionH>
             <wp:positionV relativeFrom="paragraph">
               <wp:posOffset>2690813</wp:posOffset>
@@ -12852,7 +12852,7 @@
           <wp:anchor allowOverlap="1" behindDoc="0" distB="114300" distT="114300" distL="114300" distR="114300" hidden="0" layoutInCell="1" locked="0" relativeHeight="0" simplePos="0">
             <wp:simplePos x="0" y="0"/>
             <wp:positionH relativeFrom="column">
-              <wp:posOffset>-66674</wp:posOffset>
+              <wp:align>center</wp:align>
             </wp:positionH>
             <wp:positionV relativeFrom="paragraph">
               <wp:posOffset>2905125</wp:posOffset>
@@ -12892,7 +12892,7 @@
           <wp:anchor allowOverlap="1" behindDoc="0" distB="114300" distT="114300" distL="114300" distR="114300" hidden="0" layoutInCell="1" locked="0" relativeHeight="0" simplePos="0">
             <wp:simplePos x="0" y="0"/>
             <wp:positionH relativeFrom="column">
-              <wp:posOffset>3581400</wp:posOffset>
+              <wp:align>center</wp:align>
             </wp:positionH>
             <wp:positionV relativeFrom="paragraph">
               <wp:posOffset>2943225</wp:posOffset>
@@ -13017,7 +13017,7 @@
           <wp:anchor allowOverlap="1" behindDoc="0" distB="114300" distT="114300" distL="114300" distR="114300" hidden="0" layoutInCell="1" locked="0" relativeHeight="0" simplePos="0">
             <wp:simplePos x="0" y="0"/>
             <wp:positionH relativeFrom="column">
-              <wp:posOffset>2657475</wp:posOffset>
+              <wp:align>center</wp:align>
             </wp:positionH>
             <wp:positionV relativeFrom="paragraph">
               <wp:posOffset>200025</wp:posOffset>
@@ -13057,7 +13057,7 @@
           <wp:anchor allowOverlap="1" behindDoc="0" distB="114300" distT="114300" distL="114300" distR="114300" hidden="0" layoutInCell="1" locked="0" relativeHeight="0" simplePos="0">
             <wp:simplePos x="0" y="0"/>
             <wp:positionH relativeFrom="column">
-              <wp:posOffset>-66674</wp:posOffset>
+              <wp:align>center</wp:align>
             </wp:positionH>
             <wp:positionV relativeFrom="paragraph">
               <wp:posOffset>343687</wp:posOffset>
@@ -13125,7 +13125,7 @@
           <wp:anchor allowOverlap="1" behindDoc="0" distB="114300" distT="114300" distL="114300" distR="114300" hidden="0" layoutInCell="1" locked="0" relativeHeight="0" simplePos="0">
             <wp:simplePos x="0" y="0"/>
             <wp:positionH relativeFrom="column">
-              <wp:posOffset>3990975</wp:posOffset>
+              <wp:align>center</wp:align>
             </wp:positionH>
             <wp:positionV relativeFrom="paragraph">
               <wp:posOffset>230675</wp:posOffset>
@@ -13165,7 +13165,7 @@
           <wp:anchor allowOverlap="1" behindDoc="0" distB="114300" distT="114300" distL="114300" distR="114300" hidden="0" layoutInCell="1" locked="0" relativeHeight="0" simplePos="0">
             <wp:simplePos x="0" y="0"/>
             <wp:positionH relativeFrom="column">
-              <wp:posOffset>1323975</wp:posOffset>
+              <wp:align>center</wp:align>
             </wp:positionH>
             <wp:positionV relativeFrom="paragraph">
               <wp:posOffset>245467</wp:posOffset>
@@ -13233,7 +13233,7 @@
           <wp:anchor allowOverlap="1" behindDoc="0" distB="114300" distT="114300" distL="114300" distR="114300" hidden="0" layoutInCell="1" locked="0" relativeHeight="0" simplePos="0">
             <wp:simplePos x="0" y="0"/>
             <wp:positionH relativeFrom="column">
-              <wp:posOffset>-66674</wp:posOffset>
+              <wp:align>center</wp:align>
             </wp:positionH>
             <wp:positionV relativeFrom="paragraph">
               <wp:posOffset>3116453</wp:posOffset>
@@ -13273,7 +13273,7 @@
           <wp:anchor allowOverlap="1" behindDoc="0" distB="114300" distT="114300" distL="114300" distR="114300" hidden="0" layoutInCell="1" locked="0" relativeHeight="0" simplePos="0">
             <wp:simplePos x="0" y="0"/>
             <wp:positionH relativeFrom="column">
-              <wp:posOffset>1719263</wp:posOffset>
+              <wp:align>center</wp:align>
             </wp:positionH>
             <wp:positionV relativeFrom="paragraph">
               <wp:posOffset>2852737</wp:posOffset>
@@ -13341,7 +13341,7 @@
           <wp:anchor allowOverlap="1" behindDoc="0" distB="114300" distT="114300" distL="114300" distR="114300" hidden="0" layoutInCell="1" locked="0" relativeHeight="0" simplePos="0">
             <wp:simplePos x="0" y="0"/>
             <wp:positionH relativeFrom="column">
-              <wp:posOffset>3638550</wp:posOffset>
+              <wp:align>center</wp:align>
             </wp:positionH>
             <wp:positionV relativeFrom="paragraph">
               <wp:posOffset>142875</wp:posOffset>
@@ -13466,7 +13466,7 @@
           <wp:anchor allowOverlap="1" behindDoc="0" distB="114300" distT="114300" distL="114300" distR="114300" hidden="0" layoutInCell="1" locked="0" relativeHeight="0" simplePos="0">
             <wp:simplePos x="0" y="0"/>
             <wp:positionH relativeFrom="column">
-              <wp:posOffset>4038600</wp:posOffset>
+              <wp:align>center</wp:align>
             </wp:positionH>
             <wp:positionV relativeFrom="paragraph">
               <wp:posOffset>313436</wp:posOffset>
@@ -13534,7 +13534,7 @@
           <wp:anchor allowOverlap="1" behindDoc="0" distB="114300" distT="114300" distL="114300" distR="114300" hidden="0" layoutInCell="1" locked="0" relativeHeight="0" simplePos="0">
             <wp:simplePos x="0" y="0"/>
             <wp:positionH relativeFrom="column">
-              <wp:posOffset>2667000</wp:posOffset>
+              <wp:align>center</wp:align>
             </wp:positionH>
             <wp:positionV relativeFrom="paragraph">
               <wp:posOffset>161925</wp:posOffset>
@@ -13574,7 +13574,7 @@
           <wp:anchor allowOverlap="1" behindDoc="0" distB="114300" distT="114300" distL="114300" distR="114300" hidden="0" layoutInCell="1" locked="0" relativeHeight="0" simplePos="0">
             <wp:simplePos x="0" y="0"/>
             <wp:positionH relativeFrom="column">
-              <wp:posOffset>-76199</wp:posOffset>
+              <wp:align>center</wp:align>
             </wp:positionH>
             <wp:positionV relativeFrom="paragraph">
               <wp:posOffset>114300</wp:posOffset>
@@ -13614,7 +13614,7 @@
           <wp:anchor allowOverlap="1" behindDoc="0" distB="114300" distT="114300" distL="114300" distR="114300" hidden="0" layoutInCell="1" locked="0" relativeHeight="0" simplePos="0">
             <wp:simplePos x="0" y="0"/>
             <wp:positionH relativeFrom="column">
-              <wp:posOffset>1295400</wp:posOffset>
+              <wp:align>center</wp:align>
             </wp:positionH>
             <wp:positionV relativeFrom="paragraph">
               <wp:posOffset>114300</wp:posOffset>
@@ -13682,7 +13682,7 @@
           <wp:anchor allowOverlap="1" behindDoc="0" distB="114300" distT="114300" distL="114300" distR="114300" hidden="0" layoutInCell="1" locked="0" relativeHeight="0" simplePos="0">
             <wp:simplePos x="0" y="0"/>
             <wp:positionH relativeFrom="column">
-              <wp:posOffset>504825</wp:posOffset>
+              <wp:align>center</wp:align>
             </wp:positionH>
             <wp:positionV relativeFrom="paragraph">
               <wp:posOffset>1687071</wp:posOffset>
@@ -13722,7 +13722,7 @@
           <wp:anchor allowOverlap="1" behindDoc="0" distB="114300" distT="114300" distL="114300" distR="114300" hidden="0" layoutInCell="1" locked="0" relativeHeight="0" simplePos="0">
             <wp:simplePos x="0" y="0"/>
             <wp:positionH relativeFrom="column">
-              <wp:posOffset>2066925</wp:posOffset>
+              <wp:align>center</wp:align>
             </wp:positionH>
             <wp:positionV relativeFrom="paragraph">
               <wp:posOffset>1771650</wp:posOffset>
@@ -13762,7 +13762,7 @@
           <wp:anchor allowOverlap="1" behindDoc="0" distB="114300" distT="114300" distL="114300" distR="114300" hidden="0" layoutInCell="1" locked="0" relativeHeight="0" simplePos="0">
             <wp:simplePos x="0" y="0"/>
             <wp:positionH relativeFrom="column">
-              <wp:posOffset>3629025</wp:posOffset>
+              <wp:align>center</wp:align>
             </wp:positionH>
             <wp:positionV relativeFrom="paragraph">
               <wp:posOffset>1925196</wp:posOffset>
@@ -13887,7 +13887,7 @@
           <wp:anchor allowOverlap="1" behindDoc="0" distB="114300" distT="114300" distL="114300" distR="114300" hidden="0" layoutInCell="1" locked="0" relativeHeight="0" simplePos="0">
             <wp:simplePos x="0" y="0"/>
             <wp:positionH relativeFrom="column">
-              <wp:posOffset>1838325</wp:posOffset>
+              <wp:align>center</wp:align>
             </wp:positionH>
             <wp:positionV relativeFrom="paragraph">
               <wp:posOffset>3705225</wp:posOffset>
@@ -13927,7 +13927,7 @@
           <wp:anchor allowOverlap="1" behindDoc="0" distB="114300" distT="114300" distL="114300" distR="114300" hidden="0" layoutInCell="1" locked="0" relativeHeight="0" simplePos="0">
             <wp:simplePos x="0" y="0"/>
             <wp:positionH relativeFrom="column">
-              <wp:posOffset>3238500</wp:posOffset>
+              <wp:align>center</wp:align>
             </wp:positionH>
             <wp:positionV relativeFrom="paragraph">
               <wp:posOffset>3638550</wp:posOffset>
@@ -13967,7 +13967,7 @@
           <wp:anchor allowOverlap="1" behindDoc="0" distB="114300" distT="114300" distL="114300" distR="114300" hidden="0" layoutInCell="1" locked="0" relativeHeight="0" simplePos="0">
             <wp:simplePos x="0" y="0"/>
             <wp:positionH relativeFrom="column">
-              <wp:posOffset>1257300</wp:posOffset>
+              <wp:align>center</wp:align>
             </wp:positionH>
             <wp:positionV relativeFrom="paragraph">
               <wp:posOffset>495300</wp:posOffset>
@@ -14007,7 +14007,7 @@
           <wp:anchor allowOverlap="1" behindDoc="0" distB="114300" distT="114300" distL="114300" distR="114300" hidden="0" layoutInCell="1" locked="0" relativeHeight="0" simplePos="0">
             <wp:simplePos x="0" y="0"/>
             <wp:positionH relativeFrom="column">
-              <wp:posOffset>514350</wp:posOffset>
+              <wp:align>center</wp:align>
             </wp:positionH>
             <wp:positionV relativeFrom="paragraph">
               <wp:posOffset>3705225</wp:posOffset>
@@ -14047,7 +14047,7 @@
           <wp:anchor allowOverlap="1" behindDoc="0" distB="114300" distT="114300" distL="114300" distR="114300" hidden="0" layoutInCell="1" locked="0" relativeHeight="0" simplePos="0">
             <wp:simplePos x="0" y="0"/>
             <wp:positionH relativeFrom="column">
-              <wp:posOffset>1</wp:posOffset>
+              <wp:align>center</wp:align>
             </wp:positionH>
             <wp:positionV relativeFrom="paragraph">
               <wp:posOffset>497375</wp:posOffset>
@@ -14087,7 +14087,7 @@
           <wp:anchor allowOverlap="1" behindDoc="0" distB="114300" distT="114300" distL="114300" distR="114300" hidden="0" layoutInCell="1" locked="0" relativeHeight="0" simplePos="0">
             <wp:simplePos x="0" y="0"/>
             <wp:positionH relativeFrom="column">
-              <wp:posOffset>3867150</wp:posOffset>
+              <wp:align>center</wp:align>
             </wp:positionH>
             <wp:positionV relativeFrom="paragraph">
               <wp:posOffset>495300</wp:posOffset>
@@ -14127,7 +14127,7 @@
           <wp:anchor allowOverlap="1" behindDoc="0" distB="114300" distT="114300" distL="114300" distR="114300" hidden="0" layoutInCell="1" locked="0" relativeHeight="0" simplePos="0">
             <wp:simplePos x="0" y="0"/>
             <wp:positionH relativeFrom="column">
-              <wp:posOffset>2657475</wp:posOffset>
+              <wp:align>center</wp:align>
             </wp:positionH>
             <wp:positionV relativeFrom="paragraph">
               <wp:posOffset>419100</wp:posOffset>
@@ -14252,7 +14252,7 @@
           <wp:anchor allowOverlap="1" behindDoc="0" distB="114300" distT="114300" distL="114300" distR="114300" hidden="0" layoutInCell="1" locked="0" relativeHeight="0" simplePos="0">
             <wp:simplePos x="0" y="0"/>
             <wp:positionH relativeFrom="column">
-              <wp:posOffset>3219450</wp:posOffset>
+              <wp:align>center</wp:align>
             </wp:positionH>
             <wp:positionV relativeFrom="paragraph">
               <wp:posOffset>3686175</wp:posOffset>
@@ -14292,7 +14292,7 @@
           <wp:anchor allowOverlap="1" behindDoc="0" distB="114300" distT="114300" distL="114300" distR="114300" hidden="0" layoutInCell="1" locked="0" relativeHeight="0" simplePos="0">
             <wp:simplePos x="0" y="0"/>
             <wp:positionH relativeFrom="column">
-              <wp:posOffset>1662113</wp:posOffset>
+              <wp:align>center</wp:align>
             </wp:positionH>
             <wp:positionV relativeFrom="paragraph">
               <wp:posOffset>342900</wp:posOffset>
@@ -14332,7 +14332,7 @@
           <wp:anchor allowOverlap="1" behindDoc="0" distB="114300" distT="114300" distL="114300" distR="114300" hidden="0" layoutInCell="1" locked="0" relativeHeight="0" simplePos="0">
             <wp:simplePos x="0" y="0"/>
             <wp:positionH relativeFrom="column">
-              <wp:posOffset>114300</wp:posOffset>
+              <wp:align>center</wp:align>
             </wp:positionH>
             <wp:positionV relativeFrom="paragraph">
               <wp:posOffset>346625</wp:posOffset>
@@ -14372,7 +14372,7 @@
           <wp:anchor allowOverlap="1" behindDoc="0" distB="114300" distT="114300" distL="114300" distR="114300" hidden="0" layoutInCell="1" locked="0" relativeHeight="0" simplePos="0">
             <wp:simplePos x="0" y="0"/>
             <wp:positionH relativeFrom="column">
-              <wp:posOffset>114300</wp:posOffset>
+              <wp:align>center</wp:align>
             </wp:positionH>
             <wp:positionV relativeFrom="paragraph">
               <wp:posOffset>3684910</wp:posOffset>
@@ -14412,7 +14412,7 @@
           <wp:anchor allowOverlap="1" behindDoc="0" distB="114300" distT="114300" distL="114300" distR="114300" hidden="0" layoutInCell="1" locked="0" relativeHeight="0" simplePos="0">
             <wp:simplePos x="0" y="0"/>
             <wp:positionH relativeFrom="column">
-              <wp:posOffset>1666875</wp:posOffset>
+              <wp:align>center</wp:align>
             </wp:positionH>
             <wp:positionV relativeFrom="paragraph">
               <wp:posOffset>3686175</wp:posOffset>
@@ -14452,7 +14452,7 @@
           <wp:anchor allowOverlap="1" behindDoc="0" distB="114300" distT="114300" distL="114300" distR="114300" hidden="0" layoutInCell="1" locked="0" relativeHeight="0" simplePos="0">
             <wp:simplePos x="0" y="0"/>
             <wp:positionH relativeFrom="column">
-              <wp:posOffset>3209925</wp:posOffset>
+              <wp:align>center</wp:align>
             </wp:positionH>
             <wp:positionV relativeFrom="paragraph">
               <wp:posOffset>342900</wp:posOffset>

</xml_diff>

<commit_message>
Force all images inside page margins: convert floating to inline
Floating images could sit in/beyond the margins. Converted all 35 anchors to inline so every image stays inside the text frame (L1.5 R1.0). 0 floating left.
</commit_message>
<xml_diff>
--- a/thesis/Velasquez_CTA_Skincare_Thesis_DRAFT_003.docx
+++ b/thesis/Velasquez_CTA_Skincare_Thesis_DRAFT_003.docx
@@ -1499,17 +1499,9 @@
           <w:sz w:val="22"/>
         </w:rPr>
         <w:drawing>
-          <wp:anchor allowOverlap="1" behindDoc="0" distB="114300" distT="114300" distL="114300" distR="114300" hidden="0" layoutInCell="1" locked="0" relativeHeight="0" simplePos="0">
-            <wp:simplePos x="0" y="0"/>
-            <wp:positionH relativeFrom="column">
-              <wp:align>center</wp:align>
-            </wp:positionH>
-            <wp:positionV relativeFrom="paragraph">
-              <wp:posOffset>390525</wp:posOffset>
-            </wp:positionV>
+          <wp:inline distT="0" distB="0" distL="0" distR="0">
             <wp:extent cx="3052763" cy="3229856"/>
-            <wp:wrapTopAndBottom/>
-            <wp:effectExtent b="0" l="0" r="0" t="0"/>
+            <wp:effectExtent l="0" t="0" r="0" b="0"/>
             <wp:docPr id="12" name="image40.jpg"/>
             <a:graphic>
               <a:graphicData uri="http://schemas.openxmlformats.org/drawingml/2006/picture">
@@ -1536,7 +1528,7 @@
                 </pic:pic>
               </a:graphicData>
             </a:graphic>
-          </wp:anchor>
+          </wp:inline>
         </w:drawing>
       </w:r>
     </w:p>
@@ -12621,17 +12613,9 @@
           <w:sz w:val="22"/>
         </w:rPr>
         <w:drawing>
-          <wp:anchor allowOverlap="1" behindDoc="0" distB="114300" distT="114300" distL="114300" distR="114300" hidden="0" layoutInCell="1" locked="0" relativeHeight="0" simplePos="0">
-            <wp:simplePos x="0" y="0"/>
-            <wp:positionH relativeFrom="column">
-              <wp:align>center</wp:align>
-            </wp:positionH>
-            <wp:positionV relativeFrom="paragraph">
-              <wp:posOffset>285750</wp:posOffset>
-            </wp:positionV>
+          <wp:inline distT="0" distB="0" distL="0" distR="0">
             <wp:extent cx="1323975" cy="2471401"/>
-            <wp:wrapSquare wrapText="bothSides"/>
-            <wp:effectExtent b="0" l="0" r="0" t="0"/>
+            <wp:effectExtent l="0" t="0" r="0" b="0"/>
             <wp:docPr id="43" name="image28.jpg"/>
             <a:graphic>
               <a:graphicData uri="http://schemas.openxmlformats.org/drawingml/2006/picture">
@@ -12658,20 +12642,12 @@
                 </pic:pic>
               </a:graphicData>
             </a:graphic>
-          </wp:anchor>
+          </wp:inline>
         </w:drawing>
         <w:drawing>
-          <wp:anchor allowOverlap="1" behindDoc="0" distB="114300" distT="114300" distL="114300" distR="114300" hidden="0" layoutInCell="1" locked="0" relativeHeight="0" simplePos="0">
-            <wp:simplePos x="0" y="0"/>
-            <wp:positionH relativeFrom="column">
-              <wp:align>center</wp:align>
-            </wp:positionH>
-            <wp:positionV relativeFrom="paragraph">
-              <wp:posOffset>285750</wp:posOffset>
-            </wp:positionV>
+          <wp:inline distT="0" distB="0" distL="0" distR="0">
             <wp:extent cx="1266825" cy="2466975"/>
-            <wp:wrapSquare wrapText="bothSides"/>
-            <wp:effectExtent b="0" l="0" r="0" t="0"/>
+            <wp:effectExtent l="0" t="0" r="0" b="0"/>
             <wp:docPr id="39" name="image39.jpg"/>
             <a:graphic>
               <a:graphicData uri="http://schemas.openxmlformats.org/drawingml/2006/picture">
@@ -12698,20 +12674,12 @@
                 </pic:pic>
               </a:graphicData>
             </a:graphic>
-          </wp:anchor>
+          </wp:inline>
         </w:drawing>
         <w:drawing>
-          <wp:anchor allowOverlap="1" behindDoc="0" distB="114300" distT="114300" distL="114300" distR="114300" hidden="0" layoutInCell="1" locked="0" relativeHeight="0" simplePos="0">
-            <wp:simplePos x="0" y="0"/>
-            <wp:positionH relativeFrom="column">
-              <wp:align>center</wp:align>
-            </wp:positionH>
-            <wp:positionV relativeFrom="paragraph">
-              <wp:posOffset>285750</wp:posOffset>
-            </wp:positionV>
+          <wp:inline distT="0" distB="0" distL="0" distR="0">
             <wp:extent cx="1323975" cy="2632289"/>
-            <wp:wrapSquare wrapText="bothSides"/>
-            <wp:effectExtent b="0" l="0" r="0" t="0"/>
+            <wp:effectExtent l="0" t="0" r="0" b="0"/>
             <wp:docPr id="37" name="image30.jpg"/>
             <a:graphic>
               <a:graphicData uri="http://schemas.openxmlformats.org/drawingml/2006/picture">
@@ -12738,20 +12706,12 @@
                 </pic:pic>
               </a:graphicData>
             </a:graphic>
-          </wp:anchor>
+          </wp:inline>
         </w:drawing>
         <w:drawing>
-          <wp:anchor allowOverlap="1" behindDoc="0" distB="114300" distT="114300" distL="114300" distR="114300" hidden="0" layoutInCell="1" locked="0" relativeHeight="0" simplePos="0">
-            <wp:simplePos x="0" y="0"/>
-            <wp:positionH relativeFrom="column">
-              <wp:align>center</wp:align>
-            </wp:positionH>
-            <wp:positionV relativeFrom="paragraph">
-              <wp:posOffset>285750</wp:posOffset>
-            </wp:positionV>
+          <wp:inline distT="0" distB="0" distL="0" distR="0">
             <wp:extent cx="1266825" cy="2466975"/>
-            <wp:wrapSquare wrapText="bothSides"/>
-            <wp:effectExtent b="0" l="0" r="0" t="0"/>
+            <wp:effectExtent l="0" t="0" r="0" b="0"/>
             <wp:docPr id="9" name="image47.jpg"/>
             <a:graphic>
               <a:graphicData uri="http://schemas.openxmlformats.org/drawingml/2006/picture">
@@ -12778,7 +12738,7 @@
                 </pic:pic>
               </a:graphicData>
             </a:graphic>
-          </wp:anchor>
+          </wp:inline>
         </w:drawing>
       </w:r>
     </w:p>
@@ -12809,17 +12769,9 @@
           <w:sz w:val="22"/>
         </w:rPr>
         <w:drawing>
-          <wp:anchor allowOverlap="1" behindDoc="0" distB="114300" distT="114300" distL="114300" distR="114300" hidden="0" layoutInCell="1" locked="0" relativeHeight="0" simplePos="0">
-            <wp:simplePos x="0" y="0"/>
-            <wp:positionH relativeFrom="column">
-              <wp:align>center</wp:align>
-            </wp:positionH>
-            <wp:positionV relativeFrom="paragraph">
-              <wp:posOffset>2690813</wp:posOffset>
-            </wp:positionV>
+          <wp:inline distT="0" distB="0" distL="0" distR="0">
             <wp:extent cx="1400175" cy="3352800"/>
-            <wp:wrapSquare wrapText="bothSides"/>
-            <wp:effectExtent b="0" l="0" r="0" t="0"/>
+            <wp:effectExtent l="0" t="0" r="0" b="0"/>
             <wp:docPr id="8" name="image26.jpg"/>
             <a:graphic>
               <a:graphicData uri="http://schemas.openxmlformats.org/drawingml/2006/picture">
@@ -12846,20 +12798,12 @@
                 </pic:pic>
               </a:graphicData>
             </a:graphic>
-          </wp:anchor>
+          </wp:inline>
         </w:drawing>
         <w:drawing>
-          <wp:anchor allowOverlap="1" behindDoc="0" distB="114300" distT="114300" distL="114300" distR="114300" hidden="0" layoutInCell="1" locked="0" relativeHeight="0" simplePos="0">
-            <wp:simplePos x="0" y="0"/>
-            <wp:positionH relativeFrom="column">
-              <wp:align>center</wp:align>
-            </wp:positionH>
-            <wp:positionV relativeFrom="paragraph">
-              <wp:posOffset>2905125</wp:posOffset>
-            </wp:positionV>
+          <wp:inline distT="0" distB="0" distL="0" distR="0">
             <wp:extent cx="1323975" cy="2833203"/>
-            <wp:wrapSquare wrapText="bothSides"/>
-            <wp:effectExtent b="0" l="0" r="0" t="0"/>
+            <wp:effectExtent l="0" t="0" r="0" b="0"/>
             <wp:docPr id="19" name="image14.jpg"/>
             <a:graphic>
               <a:graphicData uri="http://schemas.openxmlformats.org/drawingml/2006/picture">
@@ -12886,20 +12830,12 @@
                 </pic:pic>
               </a:graphicData>
             </a:graphic>
-          </wp:anchor>
+          </wp:inline>
         </w:drawing>
         <w:drawing>
-          <wp:anchor allowOverlap="1" behindDoc="0" distB="114300" distT="114300" distL="114300" distR="114300" hidden="0" layoutInCell="1" locked="0" relativeHeight="0" simplePos="0">
-            <wp:simplePos x="0" y="0"/>
-            <wp:positionH relativeFrom="column">
-              <wp:align>center</wp:align>
-            </wp:positionH>
-            <wp:positionV relativeFrom="paragraph">
-              <wp:posOffset>2943225</wp:posOffset>
-            </wp:positionV>
+          <wp:inline distT="0" distB="0" distL="0" distR="0">
             <wp:extent cx="1323975" cy="2852253"/>
-            <wp:wrapSquare wrapText="bothSides"/>
-            <wp:effectExtent b="0" l="0" r="0" t="0"/>
+            <wp:effectExtent l="0" t="0" r="0" b="0"/>
             <wp:docPr id="25" name="image21.jpg"/>
             <a:graphic>
               <a:graphicData uri="http://schemas.openxmlformats.org/drawingml/2006/picture">
@@ -12926,7 +12862,7 @@
                 </pic:pic>
               </a:graphicData>
             </a:graphic>
-          </wp:anchor>
+          </wp:inline>
         </w:drawing>
       </w:r>
     </w:p>
@@ -13014,17 +12950,9 @@
           <w:sz w:val="22"/>
         </w:rPr>
         <w:drawing>
-          <wp:anchor allowOverlap="1" behindDoc="0" distB="114300" distT="114300" distL="114300" distR="114300" hidden="0" layoutInCell="1" locked="0" relativeHeight="0" simplePos="0">
-            <wp:simplePos x="0" y="0"/>
-            <wp:positionH relativeFrom="column">
-              <wp:align>center</wp:align>
-            </wp:positionH>
-            <wp:positionV relativeFrom="paragraph">
-              <wp:posOffset>200025</wp:posOffset>
-            </wp:positionV>
+          <wp:inline distT="0" distB="0" distL="0" distR="0">
             <wp:extent cx="1266825" cy="3156500"/>
-            <wp:wrapSquare wrapText="bothSides"/>
-            <wp:effectExtent b="0" l="0" r="0" t="0"/>
+            <wp:effectExtent l="0" t="0" r="0" b="0"/>
             <wp:docPr id="32" name="image38.jpg"/>
             <a:graphic>
               <a:graphicData uri="http://schemas.openxmlformats.org/drawingml/2006/picture">
@@ -13051,20 +12979,12 @@
                 </pic:pic>
               </a:graphicData>
             </a:graphic>
-          </wp:anchor>
+          </wp:inline>
         </w:drawing>
         <w:drawing>
-          <wp:anchor allowOverlap="1" behindDoc="0" distB="114300" distT="114300" distL="114300" distR="114300" hidden="0" layoutInCell="1" locked="0" relativeHeight="0" simplePos="0">
-            <wp:simplePos x="0" y="0"/>
-            <wp:positionH relativeFrom="column">
-              <wp:align>center</wp:align>
-            </wp:positionH>
-            <wp:positionV relativeFrom="paragraph">
-              <wp:posOffset>343687</wp:posOffset>
-            </wp:positionV>
+          <wp:inline distT="0" distB="0" distL="0" distR="0">
             <wp:extent cx="1323975" cy="2710900"/>
-            <wp:wrapSquare wrapText="bothSides"/>
-            <wp:effectExtent b="0" l="0" r="0" t="0"/>
+            <wp:effectExtent l="0" t="0" r="0" b="0"/>
             <wp:docPr id="38" name="image41.jpg"/>
             <a:graphic>
               <a:graphicData uri="http://schemas.openxmlformats.org/drawingml/2006/picture">
@@ -13091,7 +13011,7 @@
                 </pic:pic>
               </a:graphicData>
             </a:graphic>
-          </wp:anchor>
+          </wp:inline>
         </w:drawing>
       </w:r>
     </w:p>
@@ -13122,17 +13042,9 @@
           <w:sz w:val="22"/>
         </w:rPr>
         <w:drawing>
-          <wp:anchor allowOverlap="1" behindDoc="0" distB="114300" distT="114300" distL="114300" distR="114300" hidden="0" layoutInCell="1" locked="0" relativeHeight="0" simplePos="0">
-            <wp:simplePos x="0" y="0"/>
-            <wp:positionH relativeFrom="column">
-              <wp:align>center</wp:align>
-            </wp:positionH>
-            <wp:positionV relativeFrom="paragraph">
-              <wp:posOffset>230675</wp:posOffset>
-            </wp:positionV>
+          <wp:inline distT="0" distB="0" distL="0" distR="0">
             <wp:extent cx="1323975" cy="2779225"/>
-            <wp:wrapSquare wrapText="bothSides"/>
-            <wp:effectExtent b="0" l="0" r="0" t="0"/>
+            <wp:effectExtent l="0" t="0" r="0" b="0"/>
             <wp:docPr id="24" name="image27.jpg"/>
             <a:graphic>
               <a:graphicData uri="http://schemas.openxmlformats.org/drawingml/2006/picture">
@@ -13159,20 +13071,12 @@
                 </pic:pic>
               </a:graphicData>
             </a:graphic>
-          </wp:anchor>
+          </wp:inline>
         </w:drawing>
         <w:drawing>
-          <wp:anchor allowOverlap="1" behindDoc="0" distB="114300" distT="114300" distL="114300" distR="114300" hidden="0" layoutInCell="1" locked="0" relativeHeight="0" simplePos="0">
-            <wp:simplePos x="0" y="0"/>
-            <wp:positionH relativeFrom="column">
-              <wp:align>center</wp:align>
-            </wp:positionH>
-            <wp:positionV relativeFrom="paragraph">
-              <wp:posOffset>245467</wp:posOffset>
-            </wp:positionV>
+          <wp:inline distT="0" distB="0" distL="0" distR="0">
             <wp:extent cx="1266825" cy="2507258"/>
-            <wp:wrapSquare wrapText="bothSides"/>
-            <wp:effectExtent b="0" l="0" r="0" t="0"/>
+            <wp:effectExtent l="0" t="0" r="0" b="0"/>
             <wp:docPr id="47" name="image49.jpg"/>
             <a:graphic>
               <a:graphicData uri="http://schemas.openxmlformats.org/drawingml/2006/picture">
@@ -13199,7 +13103,7 @@
                 </pic:pic>
               </a:graphicData>
             </a:graphic>
-          </wp:anchor>
+          </wp:inline>
         </w:drawing>
       </w:r>
     </w:p>
@@ -13230,17 +13134,9 @@
           <w:sz w:val="22"/>
         </w:rPr>
         <w:drawing>
-          <wp:anchor allowOverlap="1" behindDoc="0" distB="114300" distT="114300" distL="114300" distR="114300" hidden="0" layoutInCell="1" locked="0" relativeHeight="0" simplePos="0">
-            <wp:simplePos x="0" y="0"/>
-            <wp:positionH relativeFrom="column">
-              <wp:align>center</wp:align>
-            </wp:positionH>
-            <wp:positionV relativeFrom="paragraph">
-              <wp:posOffset>3116453</wp:posOffset>
-            </wp:positionV>
+          <wp:inline distT="0" distB="0" distL="0" distR="0">
             <wp:extent cx="1323975" cy="3004228"/>
-            <wp:wrapSquare wrapText="bothSides"/>
-            <wp:effectExtent b="0" l="0" r="0" t="0"/>
+            <wp:effectExtent l="0" t="0" r="0" b="0"/>
             <wp:docPr id="21" name="image22.jpg"/>
             <a:graphic>
               <a:graphicData uri="http://schemas.openxmlformats.org/drawingml/2006/picture">
@@ -13267,20 +13163,12 @@
                 </pic:pic>
               </a:graphicData>
             </a:graphic>
-          </wp:anchor>
+          </wp:inline>
         </w:drawing>
         <w:drawing>
-          <wp:anchor allowOverlap="1" behindDoc="0" distB="114300" distT="114300" distL="114300" distR="114300" hidden="0" layoutInCell="1" locked="0" relativeHeight="0" simplePos="0">
-            <wp:simplePos x="0" y="0"/>
-            <wp:positionH relativeFrom="column">
-              <wp:align>center</wp:align>
-            </wp:positionH>
-            <wp:positionV relativeFrom="paragraph">
-              <wp:posOffset>2852737</wp:posOffset>
-            </wp:positionV>
+          <wp:inline distT="0" distB="0" distL="0" distR="0">
             <wp:extent cx="1400175" cy="3352800"/>
-            <wp:wrapSquare wrapText="bothSides"/>
-            <wp:effectExtent b="0" l="0" r="0" t="0"/>
+            <wp:effectExtent l="0" t="0" r="0" b="0"/>
             <wp:docPr id="23" name="image23.jpg"/>
             <a:graphic>
               <a:graphicData uri="http://schemas.openxmlformats.org/drawingml/2006/picture">
@@ -13307,7 +13195,7 @@
                 </pic:pic>
               </a:graphicData>
             </a:graphic>
-          </wp:anchor>
+          </wp:inline>
         </w:drawing>
       </w:r>
     </w:p>
@@ -13338,17 +13226,9 @@
           <w:sz w:val="22"/>
         </w:rPr>
         <w:drawing>
-          <wp:anchor allowOverlap="1" behindDoc="0" distB="114300" distT="114300" distL="114300" distR="114300" hidden="0" layoutInCell="1" locked="0" relativeHeight="0" simplePos="0">
-            <wp:simplePos x="0" y="0"/>
-            <wp:positionH relativeFrom="column">
-              <wp:align>center</wp:align>
-            </wp:positionH>
-            <wp:positionV relativeFrom="paragraph">
-              <wp:posOffset>142875</wp:posOffset>
-            </wp:positionV>
+          <wp:inline distT="0" distB="0" distL="0" distR="0">
             <wp:extent cx="1323975" cy="3340528"/>
-            <wp:wrapSquare wrapText="bothSides"/>
-            <wp:effectExtent b="0" l="0" r="0" t="0"/>
+            <wp:effectExtent l="0" t="0" r="0" b="0"/>
             <wp:docPr id="28" name="image18.jpg"/>
             <a:graphic>
               <a:graphicData uri="http://schemas.openxmlformats.org/drawingml/2006/picture">
@@ -13375,7 +13255,7 @@
                 </pic:pic>
               </a:graphicData>
             </a:graphic>
-          </wp:anchor>
+          </wp:inline>
         </w:drawing>
       </w:r>
     </w:p>
@@ -13463,17 +13343,9 @@
           <w:sz w:val="22"/>
         </w:rPr>
         <w:drawing>
-          <wp:anchor allowOverlap="1" behindDoc="0" distB="114300" distT="114300" distL="114300" distR="114300" hidden="0" layoutInCell="1" locked="0" relativeHeight="0" simplePos="0">
-            <wp:simplePos x="0" y="0"/>
-            <wp:positionH relativeFrom="column">
-              <wp:align>center</wp:align>
-            </wp:positionH>
-            <wp:positionV relativeFrom="paragraph">
-              <wp:posOffset>313436</wp:posOffset>
-            </wp:positionV>
+          <wp:inline distT="0" distB="0" distL="0" distR="0">
             <wp:extent cx="1323975" cy="2016632"/>
-            <wp:wrapSquare wrapText="bothSides"/>
-            <wp:effectExtent b="0" l="0" r="0" t="0"/>
+            <wp:effectExtent l="0" t="0" r="0" b="0"/>
             <wp:docPr id="31" name="image35.jpg"/>
             <a:graphic>
               <a:graphicData uri="http://schemas.openxmlformats.org/drawingml/2006/picture">
@@ -13500,7 +13372,7 @@
                 </pic:pic>
               </a:graphicData>
             </a:graphic>
-          </wp:anchor>
+          </wp:inline>
         </w:drawing>
       </w:r>
     </w:p>
@@ -13531,17 +13403,9 @@
           <w:sz w:val="22"/>
         </w:rPr>
         <w:drawing>
-          <wp:anchor allowOverlap="1" behindDoc="0" distB="114300" distT="114300" distL="114300" distR="114300" hidden="0" layoutInCell="1" locked="0" relativeHeight="0" simplePos="0">
-            <wp:simplePos x="0" y="0"/>
-            <wp:positionH relativeFrom="column">
-              <wp:align>center</wp:align>
-            </wp:positionH>
-            <wp:positionV relativeFrom="paragraph">
-              <wp:posOffset>161925</wp:posOffset>
-            </wp:positionV>
+          <wp:inline distT="0" distB="0" distL="0" distR="0">
             <wp:extent cx="1323975" cy="2616707"/>
-            <wp:wrapSquare wrapText="bothSides"/>
-            <wp:effectExtent b="0" l="0" r="0" t="0"/>
+            <wp:effectExtent l="0" t="0" r="0" b="0"/>
             <wp:docPr id="6" name="image32.jpg"/>
             <a:graphic>
               <a:graphicData uri="http://schemas.openxmlformats.org/drawingml/2006/picture">
@@ -13568,20 +13432,12 @@
                 </pic:pic>
               </a:graphicData>
             </a:graphic>
-          </wp:anchor>
+          </wp:inline>
         </w:drawing>
         <w:drawing>
-          <wp:anchor allowOverlap="1" behindDoc="0" distB="114300" distT="114300" distL="114300" distR="114300" hidden="0" layoutInCell="1" locked="0" relativeHeight="0" simplePos="0">
-            <wp:simplePos x="0" y="0"/>
-            <wp:positionH relativeFrom="column">
-              <wp:align>center</wp:align>
-            </wp:positionH>
-            <wp:positionV relativeFrom="paragraph">
-              <wp:posOffset>114300</wp:posOffset>
-            </wp:positionV>
+          <wp:inline distT="0" distB="0" distL="0" distR="0">
             <wp:extent cx="1323975" cy="2710900"/>
-            <wp:wrapSquare wrapText="bothSides"/>
-            <wp:effectExtent b="0" l="0" r="0" t="0"/>
+            <wp:effectExtent l="0" t="0" r="0" b="0"/>
             <wp:docPr id="3" name="image17.jpg"/>
             <a:graphic>
               <a:graphicData uri="http://schemas.openxmlformats.org/drawingml/2006/picture">
@@ -13608,20 +13464,12 @@
                 </pic:pic>
               </a:graphicData>
             </a:graphic>
-          </wp:anchor>
+          </wp:inline>
         </w:drawing>
         <w:drawing>
-          <wp:anchor allowOverlap="1" behindDoc="0" distB="114300" distT="114300" distL="114300" distR="114300" hidden="0" layoutInCell="1" locked="0" relativeHeight="0" simplePos="0">
-            <wp:simplePos x="0" y="0"/>
-            <wp:positionH relativeFrom="column">
-              <wp:align>center</wp:align>
-            </wp:positionH>
-            <wp:positionV relativeFrom="paragraph">
-              <wp:posOffset>114300</wp:posOffset>
-            </wp:positionV>
+          <wp:inline distT="0" distB="0" distL="0" distR="0">
             <wp:extent cx="1323975" cy="3031618"/>
-            <wp:wrapSquare wrapText="bothSides"/>
-            <wp:effectExtent b="0" l="0" r="0" t="0"/>
+            <wp:effectExtent l="0" t="0" r="0" b="0"/>
             <wp:docPr id="34" name="image42.jpg"/>
             <a:graphic>
               <a:graphicData uri="http://schemas.openxmlformats.org/drawingml/2006/picture">
@@ -13648,7 +13496,7 @@
                 </pic:pic>
               </a:graphicData>
             </a:graphic>
-          </wp:anchor>
+          </wp:inline>
         </w:drawing>
       </w:r>
     </w:p>
@@ -13679,17 +13527,9 @@
           <w:sz w:val="22"/>
         </w:rPr>
         <w:drawing>
-          <wp:anchor allowOverlap="1" behindDoc="0" distB="114300" distT="114300" distL="114300" distR="114300" hidden="0" layoutInCell="1" locked="0" relativeHeight="0" simplePos="0">
-            <wp:simplePos x="0" y="0"/>
-            <wp:positionH relativeFrom="column">
-              <wp:align>center</wp:align>
-            </wp:positionH>
-            <wp:positionV relativeFrom="paragraph">
-              <wp:posOffset>1687071</wp:posOffset>
-            </wp:positionV>
+          <wp:inline distT="0" distB="0" distL="0" distR="0">
             <wp:extent cx="1323975" cy="3172971"/>
-            <wp:wrapSquare wrapText="bothSides"/>
-            <wp:effectExtent b="0" l="0" r="0" t="0"/>
+            <wp:effectExtent l="0" t="0" r="0" b="0"/>
             <wp:docPr id="2" name="image36.jpg"/>
             <a:graphic>
               <a:graphicData uri="http://schemas.openxmlformats.org/drawingml/2006/picture">
@@ -13716,20 +13556,12 @@
                 </pic:pic>
               </a:graphicData>
             </a:graphic>
-          </wp:anchor>
+          </wp:inline>
         </w:drawing>
         <w:drawing>
-          <wp:anchor allowOverlap="1" behindDoc="0" distB="114300" distT="114300" distL="114300" distR="114300" hidden="0" layoutInCell="1" locked="0" relativeHeight="0" simplePos="0">
-            <wp:simplePos x="0" y="0"/>
-            <wp:positionH relativeFrom="column">
-              <wp:align>center</wp:align>
-            </wp:positionH>
-            <wp:positionV relativeFrom="paragraph">
-              <wp:posOffset>1771650</wp:posOffset>
-            </wp:positionV>
+          <wp:inline distT="0" distB="0" distL="0" distR="0">
             <wp:extent cx="1323975" cy="2982471"/>
-            <wp:wrapSquare wrapText="bothSides"/>
-            <wp:effectExtent b="0" l="0" r="0" t="0"/>
+            <wp:effectExtent l="0" t="0" r="0" b="0"/>
             <wp:docPr id="33" name="image34.jpg"/>
             <a:graphic>
               <a:graphicData uri="http://schemas.openxmlformats.org/drawingml/2006/picture">
@@ -13756,20 +13588,12 @@
                 </pic:pic>
               </a:graphicData>
             </a:graphic>
-          </wp:anchor>
+          </wp:inline>
         </w:drawing>
         <w:drawing>
-          <wp:anchor allowOverlap="1" behindDoc="0" distB="114300" distT="114300" distL="114300" distR="114300" hidden="0" layoutInCell="1" locked="0" relativeHeight="0" simplePos="0">
-            <wp:simplePos x="0" y="0"/>
-            <wp:positionH relativeFrom="column">
-              <wp:align>center</wp:align>
-            </wp:positionH>
-            <wp:positionV relativeFrom="paragraph">
-              <wp:posOffset>1925196</wp:posOffset>
-            </wp:positionV>
+          <wp:inline distT="0" distB="0" distL="0" distR="0">
             <wp:extent cx="1323975" cy="2649096"/>
-            <wp:wrapSquare wrapText="bothSides"/>
-            <wp:effectExtent b="0" l="0" r="0" t="0"/>
+            <wp:effectExtent l="0" t="0" r="0" b="0"/>
             <wp:docPr id="41" name="image43.jpg"/>
             <a:graphic>
               <a:graphicData uri="http://schemas.openxmlformats.org/drawingml/2006/picture">
@@ -13796,7 +13620,7 @@
                 </pic:pic>
               </a:graphicData>
             </a:graphic>
-          </wp:anchor>
+          </wp:inline>
         </w:drawing>
       </w:r>
     </w:p>
@@ -13884,17 +13708,9 @@
           <w:sz w:val="22"/>
         </w:rPr>
         <w:drawing>
-          <wp:anchor allowOverlap="1" behindDoc="0" distB="114300" distT="114300" distL="114300" distR="114300" hidden="0" layoutInCell="1" locked="0" relativeHeight="0" simplePos="0">
-            <wp:simplePos x="0" y="0"/>
-            <wp:positionH relativeFrom="column">
-              <wp:align>center</wp:align>
-            </wp:positionH>
-            <wp:positionV relativeFrom="paragraph">
-              <wp:posOffset>3705225</wp:posOffset>
-            </wp:positionV>
+          <wp:inline distT="0" distB="0" distL="0" distR="0">
             <wp:extent cx="1323975" cy="2240450"/>
-            <wp:wrapSquare wrapText="bothSides"/>
-            <wp:effectExtent b="0" l="0" r="0" t="0"/>
+            <wp:effectExtent l="0" t="0" r="0" b="0"/>
             <wp:docPr id="4" name="image8.jpg"/>
             <a:graphic>
               <a:graphicData uri="http://schemas.openxmlformats.org/drawingml/2006/picture">
@@ -13921,20 +13737,12 @@
                 </pic:pic>
               </a:graphicData>
             </a:graphic>
-          </wp:anchor>
+          </wp:inline>
         </w:drawing>
         <w:drawing>
-          <wp:anchor allowOverlap="1" behindDoc="0" distB="114300" distT="114300" distL="114300" distR="114300" hidden="0" layoutInCell="1" locked="0" relativeHeight="0" simplePos="0">
-            <wp:simplePos x="0" y="0"/>
-            <wp:positionH relativeFrom="column">
-              <wp:align>center</wp:align>
-            </wp:positionH>
-            <wp:positionV relativeFrom="paragraph">
-              <wp:posOffset>3638550</wp:posOffset>
-            </wp:positionV>
+          <wp:inline distT="0" distB="0" distL="0" distR="0">
             <wp:extent cx="1323975" cy="3029820"/>
-            <wp:wrapSquare wrapText="bothSides"/>
-            <wp:effectExtent b="0" l="0" r="0" t="0"/>
+            <wp:effectExtent l="0" t="0" r="0" b="0"/>
             <wp:docPr id="10" name="image13.jpg"/>
             <a:graphic>
               <a:graphicData uri="http://schemas.openxmlformats.org/drawingml/2006/picture">
@@ -13961,20 +13769,12 @@
                 </pic:pic>
               </a:graphicData>
             </a:graphic>
-          </wp:anchor>
+          </wp:inline>
         </w:drawing>
         <w:drawing>
-          <wp:anchor allowOverlap="1" behindDoc="0" distB="114300" distT="114300" distL="114300" distR="114300" hidden="0" layoutInCell="1" locked="0" relativeHeight="0" simplePos="0">
-            <wp:simplePos x="0" y="0"/>
-            <wp:positionH relativeFrom="column">
-              <wp:align>center</wp:align>
-            </wp:positionH>
-            <wp:positionV relativeFrom="paragraph">
-              <wp:posOffset>495300</wp:posOffset>
-            </wp:positionV>
+          <wp:inline distT="0" distB="0" distL="0" distR="0">
             <wp:extent cx="1323975" cy="2269025"/>
-            <wp:wrapSquare wrapText="bothSides"/>
-            <wp:effectExtent b="0" l="0" r="0" t="0"/>
+            <wp:effectExtent l="0" t="0" r="0" b="0"/>
             <wp:docPr id="17" name="image12.jpg"/>
             <a:graphic>
               <a:graphicData uri="http://schemas.openxmlformats.org/drawingml/2006/picture">
@@ -14001,20 +13801,12 @@
                 </pic:pic>
               </a:graphicData>
             </a:graphic>
-          </wp:anchor>
+          </wp:inline>
         </w:drawing>
         <w:drawing>
-          <wp:anchor allowOverlap="1" behindDoc="0" distB="114300" distT="114300" distL="114300" distR="114300" hidden="0" layoutInCell="1" locked="0" relativeHeight="0" simplePos="0">
-            <wp:simplePos x="0" y="0"/>
-            <wp:positionH relativeFrom="column">
-              <wp:align>center</wp:align>
-            </wp:positionH>
-            <wp:positionV relativeFrom="paragraph">
-              <wp:posOffset>3705225</wp:posOffset>
-            </wp:positionV>
+          <wp:inline distT="0" distB="0" distL="0" distR="0">
             <wp:extent cx="1323975" cy="3006157"/>
-            <wp:wrapSquare wrapText="bothSides"/>
-            <wp:effectExtent b="0" l="0" r="0" t="0"/>
+            <wp:effectExtent l="0" t="0" r="0" b="0"/>
             <wp:docPr id="20" name="image10.jpg"/>
             <a:graphic>
               <a:graphicData uri="http://schemas.openxmlformats.org/drawingml/2006/picture">
@@ -14041,20 +13833,12 @@
                 </pic:pic>
               </a:graphicData>
             </a:graphic>
-          </wp:anchor>
+          </wp:inline>
         </w:drawing>
         <w:drawing>
-          <wp:anchor allowOverlap="1" behindDoc="0" distB="114300" distT="114300" distL="114300" distR="114300" hidden="0" layoutInCell="1" locked="0" relativeHeight="0" simplePos="0">
-            <wp:simplePos x="0" y="0"/>
-            <wp:positionH relativeFrom="column">
-              <wp:align>center</wp:align>
-            </wp:positionH>
-            <wp:positionV relativeFrom="paragraph">
-              <wp:posOffset>497375</wp:posOffset>
-            </wp:positionV>
+          <wp:inline distT="0" distB="0" distL="0" distR="0">
             <wp:extent cx="1257300" cy="2836375"/>
-            <wp:wrapSquare wrapText="bothSides"/>
-            <wp:effectExtent b="0" l="0" r="0" t="0"/>
+            <wp:effectExtent l="0" t="0" r="0" b="0"/>
             <wp:docPr id="29" name="image19.jpg"/>
             <a:graphic>
               <a:graphicData uri="http://schemas.openxmlformats.org/drawingml/2006/picture">
@@ -14081,20 +13865,12 @@
                 </pic:pic>
               </a:graphicData>
             </a:graphic>
-          </wp:anchor>
+          </wp:inline>
         </w:drawing>
         <w:drawing>
-          <wp:anchor allowOverlap="1" behindDoc="0" distB="114300" distT="114300" distL="114300" distR="114300" hidden="0" layoutInCell="1" locked="0" relativeHeight="0" simplePos="0">
-            <wp:simplePos x="0" y="0"/>
-            <wp:positionH relativeFrom="column">
-              <wp:align>center</wp:align>
-            </wp:positionH>
-            <wp:positionV relativeFrom="paragraph">
-              <wp:posOffset>495300</wp:posOffset>
-            </wp:positionV>
+          <wp:inline distT="0" distB="0" distL="0" distR="0">
             <wp:extent cx="1323975" cy="2841817"/>
-            <wp:wrapSquare wrapText="bothSides"/>
-            <wp:effectExtent b="0" l="0" r="0" t="0"/>
+            <wp:effectExtent l="0" t="0" r="0" b="0"/>
             <wp:docPr id="26" name="image15.jpg"/>
             <a:graphic>
               <a:graphicData uri="http://schemas.openxmlformats.org/drawingml/2006/picture">
@@ -14121,20 +13897,12 @@
                 </pic:pic>
               </a:graphicData>
             </a:graphic>
-          </wp:anchor>
+          </wp:inline>
         </w:drawing>
         <w:drawing>
-          <wp:anchor allowOverlap="1" behindDoc="0" distB="114300" distT="114300" distL="114300" distR="114300" hidden="0" layoutInCell="1" locked="0" relativeHeight="0" simplePos="0">
-            <wp:simplePos x="0" y="0"/>
-            <wp:positionH relativeFrom="column">
-              <wp:align>center</wp:align>
-            </wp:positionH>
-            <wp:positionV relativeFrom="paragraph">
-              <wp:posOffset>419100</wp:posOffset>
-            </wp:positionV>
+          <wp:inline distT="0" distB="0" distL="0" distR="0">
             <wp:extent cx="1323975" cy="2274400"/>
-            <wp:wrapSquare wrapText="bothSides"/>
-            <wp:effectExtent b="0" l="0" r="0" t="0"/>
+            <wp:effectExtent l="0" t="0" r="0" b="0"/>
             <wp:docPr id="14" name="image9.jpg"/>
             <a:graphic>
               <a:graphicData uri="http://schemas.openxmlformats.org/drawingml/2006/picture">
@@ -14161,7 +13929,7 @@
                 </pic:pic>
               </a:graphicData>
             </a:graphic>
-          </wp:anchor>
+          </wp:inline>
         </w:drawing>
       </w:r>
     </w:p>
@@ -14249,17 +14017,9 @@
           <w:sz w:val="22"/>
         </w:rPr>
         <w:drawing>
-          <wp:anchor allowOverlap="1" behindDoc="0" distB="114300" distT="114300" distL="114300" distR="114300" hidden="0" layoutInCell="1" locked="0" relativeHeight="0" simplePos="0">
-            <wp:simplePos x="0" y="0"/>
-            <wp:positionH relativeFrom="column">
-              <wp:align>center</wp:align>
-            </wp:positionH>
-            <wp:positionV relativeFrom="paragraph">
-              <wp:posOffset>3686175</wp:posOffset>
-            </wp:positionV>
+          <wp:inline distT="0" distB="0" distL="0" distR="0">
             <wp:extent cx="1257300" cy="2836375"/>
-            <wp:wrapSquare wrapText="bothSides"/>
-            <wp:effectExtent b="0" l="0" r="0" t="0"/>
+            <wp:effectExtent l="0" t="0" r="0" b="0"/>
             <wp:docPr id="27" name="image37.jpg"/>
             <a:graphic>
               <a:graphicData uri="http://schemas.openxmlformats.org/drawingml/2006/picture">
@@ -14286,20 +14046,12 @@
                 </pic:pic>
               </a:graphicData>
             </a:graphic>
-          </wp:anchor>
+          </wp:inline>
         </w:drawing>
         <w:drawing>
-          <wp:anchor allowOverlap="1" behindDoc="0" distB="114300" distT="114300" distL="114300" distR="114300" hidden="0" layoutInCell="1" locked="0" relativeHeight="0" simplePos="0">
-            <wp:simplePos x="0" y="0"/>
-            <wp:positionH relativeFrom="column">
-              <wp:align>center</wp:align>
-            </wp:positionH>
-            <wp:positionV relativeFrom="paragraph">
-              <wp:posOffset>342900</wp:posOffset>
-            </wp:positionV>
+          <wp:inline distT="0" distB="0" distL="0" distR="0">
             <wp:extent cx="1257300" cy="2836375"/>
-            <wp:wrapSquare wrapText="bothSides"/>
-            <wp:effectExtent b="0" l="0" r="0" t="0"/>
+            <wp:effectExtent l="0" t="0" r="0" b="0"/>
             <wp:docPr id="46" name="image45.jpg"/>
             <a:graphic>
               <a:graphicData uri="http://schemas.openxmlformats.org/drawingml/2006/picture">
@@ -14326,20 +14078,12 @@
                 </pic:pic>
               </a:graphicData>
             </a:graphic>
-          </wp:anchor>
+          </wp:inline>
         </w:drawing>
         <w:drawing>
-          <wp:anchor allowOverlap="1" behindDoc="0" distB="114300" distT="114300" distL="114300" distR="114300" hidden="0" layoutInCell="1" locked="0" relativeHeight="0" simplePos="0">
-            <wp:simplePos x="0" y="0"/>
-            <wp:positionH relativeFrom="column">
-              <wp:align>center</wp:align>
-            </wp:positionH>
-            <wp:positionV relativeFrom="paragraph">
-              <wp:posOffset>346625</wp:posOffset>
-            </wp:positionV>
+          <wp:inline distT="0" distB="0" distL="0" distR="0">
             <wp:extent cx="1257300" cy="2836375"/>
-            <wp:wrapSquare wrapText="bothSides"/>
-            <wp:effectExtent b="0" l="0" r="0" t="0"/>
+            <wp:effectExtent l="0" t="0" r="0" b="0"/>
             <wp:docPr id="48" name="image46.jpg"/>
             <a:graphic>
               <a:graphicData uri="http://schemas.openxmlformats.org/drawingml/2006/picture">
@@ -14366,20 +14110,12 @@
                 </pic:pic>
               </a:graphicData>
             </a:graphic>
-          </wp:anchor>
+          </wp:inline>
         </w:drawing>
         <w:drawing>
-          <wp:anchor allowOverlap="1" behindDoc="0" distB="114300" distT="114300" distL="114300" distR="114300" hidden="0" layoutInCell="1" locked="0" relativeHeight="0" simplePos="0">
-            <wp:simplePos x="0" y="0"/>
-            <wp:positionH relativeFrom="column">
-              <wp:align>center</wp:align>
-            </wp:positionH>
-            <wp:positionV relativeFrom="paragraph">
-              <wp:posOffset>3684910</wp:posOffset>
-            </wp:positionV>
+          <wp:inline distT="0" distB="0" distL="0" distR="0">
             <wp:extent cx="1257300" cy="2836375"/>
-            <wp:wrapSquare wrapText="bothSides"/>
-            <wp:effectExtent b="0" l="0" r="0" t="0"/>
+            <wp:effectExtent l="0" t="0" r="0" b="0"/>
             <wp:docPr id="18" name="image44.jpg"/>
             <a:graphic>
               <a:graphicData uri="http://schemas.openxmlformats.org/drawingml/2006/picture">
@@ -14406,20 +14142,12 @@
                 </pic:pic>
               </a:graphicData>
             </a:graphic>
-          </wp:anchor>
+          </wp:inline>
         </w:drawing>
         <w:drawing>
-          <wp:anchor allowOverlap="1" behindDoc="0" distB="114300" distT="114300" distL="114300" distR="114300" hidden="0" layoutInCell="1" locked="0" relativeHeight="0" simplePos="0">
-            <wp:simplePos x="0" y="0"/>
-            <wp:positionH relativeFrom="column">
-              <wp:align>center</wp:align>
-            </wp:positionH>
-            <wp:positionV relativeFrom="paragraph">
-              <wp:posOffset>3686175</wp:posOffset>
-            </wp:positionV>
+          <wp:inline distT="0" distB="0" distL="0" distR="0">
             <wp:extent cx="1257300" cy="2836375"/>
-            <wp:wrapSquare wrapText="bothSides"/>
-            <wp:effectExtent b="0" l="0" r="0" t="0"/>
+            <wp:effectExtent l="0" t="0" r="0" b="0"/>
             <wp:docPr id="42" name="image48.jpg"/>
             <a:graphic>
               <a:graphicData uri="http://schemas.openxmlformats.org/drawingml/2006/picture">
@@ -14446,20 +14174,12 @@
                 </pic:pic>
               </a:graphicData>
             </a:graphic>
-          </wp:anchor>
+          </wp:inline>
         </w:drawing>
         <w:drawing>
-          <wp:anchor allowOverlap="1" behindDoc="0" distB="114300" distT="114300" distL="114300" distR="114300" hidden="0" layoutInCell="1" locked="0" relativeHeight="0" simplePos="0">
-            <wp:simplePos x="0" y="0"/>
-            <wp:positionH relativeFrom="column">
-              <wp:align>center</wp:align>
-            </wp:positionH>
-            <wp:positionV relativeFrom="paragraph">
-              <wp:posOffset>342900</wp:posOffset>
-            </wp:positionV>
+          <wp:inline distT="0" distB="0" distL="0" distR="0">
             <wp:extent cx="1257300" cy="2836375"/>
-            <wp:wrapSquare wrapText="bothSides"/>
-            <wp:effectExtent b="0" l="0" r="0" t="0"/>
+            <wp:effectExtent l="0" t="0" r="0" b="0"/>
             <wp:docPr id="11" name="image24.jpg"/>
             <a:graphic>
               <a:graphicData uri="http://schemas.openxmlformats.org/drawingml/2006/picture">
@@ -14486,7 +14206,7 @@
                 </pic:pic>
               </a:graphicData>
             </a:graphic>
-          </wp:anchor>
+          </wp:inline>
         </w:drawing>
       </w:r>
     </w:p>

</xml_diff>

<commit_message>
Body Fig1 full-width inline; appendix side-by-side scaled to fit margins
- Body Figure 1: 5.50 in wide inline (HEDGE model)
- Appendix: keep side-by-side layout; scale any multi-image row that exceeded 5.50 in so it stays inside page margins
</commit_message>
<xml_diff>
--- a/thesis/Velasquez_CTA_Skincare_Thesis_DRAFT_003.docx
+++ b/thesis/Velasquez_CTA_Skincare_Thesis_DRAFT_003.docx
@@ -1500,7 +1500,7 @@
         </w:rPr>
         <w:drawing>
           <wp:inline distT="0" distB="0" distL="0" distR="0">
-            <wp:extent cx="3052763" cy="3229856"/>
+            <wp:extent cx="5029200" cy="5320947"/>
             <wp:effectExtent l="0" t="0" r="0" b="0"/>
             <wp:docPr id="12" name="image40.jpg"/>
             <a:graphic>
@@ -1520,7 +1520,7 @@
                   <pic:spPr>
                     <a:xfrm>
                       <a:off x="0" y="0"/>
-                      <a:ext cx="3052763" cy="3229856"/>
+                      <a:ext cx="5029200" cy="5320947"/>
                     </a:xfrm>
                     <a:prstGeom prst="rect"/>
                     <a:ln/>
@@ -12614,7 +12614,7 @@
         </w:rPr>
         <w:drawing>
           <wp:inline distT="0" distB="0" distL="0" distR="0">
-            <wp:extent cx="1323975" cy="2471401"/>
+            <wp:extent cx="1285034" cy="2398712"/>
             <wp:effectExtent l="0" t="0" r="0" b="0"/>
             <wp:docPr id="43" name="image28.jpg"/>
             <a:graphic>
@@ -12634,7 +12634,7 @@
                   <pic:spPr>
                     <a:xfrm>
                       <a:off x="0" y="0"/>
-                      <a:ext cx="1323975" cy="2471401"/>
+                      <a:ext cx="1285034" cy="2398712"/>
                     </a:xfrm>
                     <a:prstGeom prst="rect"/>
                     <a:ln/>
@@ -12646,7 +12646,7 @@
         </w:drawing>
         <w:drawing>
           <wp:inline distT="0" distB="0" distL="0" distR="0">
-            <wp:extent cx="1266825" cy="2466975"/>
+            <wp:extent cx="1229565" cy="2394416"/>
             <wp:effectExtent l="0" t="0" r="0" b="0"/>
             <wp:docPr id="39" name="image39.jpg"/>
             <a:graphic>
@@ -12666,7 +12666,7 @@
                   <pic:spPr>
                     <a:xfrm>
                       <a:off x="0" y="0"/>
-                      <a:ext cx="1266825" cy="2466975"/>
+                      <a:ext cx="1229565" cy="2394416"/>
                     </a:xfrm>
                     <a:prstGeom prst="rect"/>
                     <a:ln/>
@@ -12678,7 +12678,7 @@
         </w:drawing>
         <w:drawing>
           <wp:inline distT="0" distB="0" distL="0" distR="0">
-            <wp:extent cx="1323975" cy="2632289"/>
+            <wp:extent cx="1285034" cy="2554868"/>
             <wp:effectExtent l="0" t="0" r="0" b="0"/>
             <wp:docPr id="37" name="image30.jpg"/>
             <a:graphic>
@@ -12698,7 +12698,7 @@
                   <pic:spPr>
                     <a:xfrm>
                       <a:off x="0" y="0"/>
-                      <a:ext cx="1323975" cy="2632289"/>
+                      <a:ext cx="1285034" cy="2554868"/>
                     </a:xfrm>
                     <a:prstGeom prst="rect"/>
                     <a:ln/>
@@ -12710,7 +12710,7 @@
         </w:drawing>
         <w:drawing>
           <wp:inline distT="0" distB="0" distL="0" distR="0">
-            <wp:extent cx="1266825" cy="2466975"/>
+            <wp:extent cx="1229565" cy="2394416"/>
             <wp:effectExtent l="0" t="0" r="0" b="0"/>
             <wp:docPr id="9" name="image47.jpg"/>
             <a:graphic>
@@ -12730,7 +12730,7 @@
                   <pic:spPr>
                     <a:xfrm>
                       <a:off x="0" y="0"/>
-                      <a:ext cx="1266825" cy="2466975"/>
+                      <a:ext cx="1229565" cy="2394416"/>
                     </a:xfrm>
                     <a:prstGeom prst="rect"/>
                     <a:ln/>
@@ -13709,7 +13709,7 @@
         </w:rPr>
         <w:drawing>
           <wp:inline distT="0" distB="0" distL="0" distR="0">
-            <wp:extent cx="1323975" cy="2240450"/>
+            <wp:extent cx="723663" cy="1224593"/>
             <wp:effectExtent l="0" t="0" r="0" b="0"/>
             <wp:docPr id="4" name="image8.jpg"/>
             <a:graphic>
@@ -13729,7 +13729,7 @@
                   <pic:spPr>
                     <a:xfrm>
                       <a:off x="0" y="0"/>
-                      <a:ext cx="1323975" cy="2240450"/>
+                      <a:ext cx="723663" cy="1224593"/>
                     </a:xfrm>
                     <a:prstGeom prst="rect"/>
                     <a:ln/>
@@ -13741,7 +13741,7 @@
         </w:drawing>
         <w:drawing>
           <wp:inline distT="0" distB="0" distL="0" distR="0">
-            <wp:extent cx="1323975" cy="3029820"/>
+            <wp:extent cx="723663" cy="1656050"/>
             <wp:effectExtent l="0" t="0" r="0" b="0"/>
             <wp:docPr id="10" name="image13.jpg"/>
             <a:graphic>
@@ -13761,7 +13761,7 @@
                   <pic:spPr>
                     <a:xfrm>
                       <a:off x="0" y="0"/>
-                      <a:ext cx="1323975" cy="3029820"/>
+                      <a:ext cx="723663" cy="1656050"/>
                     </a:xfrm>
                     <a:prstGeom prst="rect"/>
                     <a:ln/>
@@ -13773,7 +13773,7 @@
         </w:drawing>
         <w:drawing>
           <wp:inline distT="0" distB="0" distL="0" distR="0">
-            <wp:extent cx="1323975" cy="2269025"/>
+            <wp:extent cx="723663" cy="1240212"/>
             <wp:effectExtent l="0" t="0" r="0" b="0"/>
             <wp:docPr id="17" name="image12.jpg"/>
             <a:graphic>
@@ -13793,7 +13793,7 @@
                   <pic:spPr>
                     <a:xfrm>
                       <a:off x="0" y="0"/>
-                      <a:ext cx="1323975" cy="2269025"/>
+                      <a:ext cx="723663" cy="1240212"/>
                     </a:xfrm>
                     <a:prstGeom prst="rect"/>
                     <a:ln/>
@@ -13805,7 +13805,7 @@
         </w:drawing>
         <w:drawing>
           <wp:inline distT="0" distB="0" distL="0" distR="0">
-            <wp:extent cx="1323975" cy="3006157"/>
+            <wp:extent cx="723663" cy="1643116"/>
             <wp:effectExtent l="0" t="0" r="0" b="0"/>
             <wp:docPr id="20" name="image10.jpg"/>
             <a:graphic>
@@ -13825,7 +13825,7 @@
                   <pic:spPr>
                     <a:xfrm>
                       <a:off x="0" y="0"/>
-                      <a:ext cx="1323975" cy="3006157"/>
+                      <a:ext cx="723663" cy="1643116"/>
                     </a:xfrm>
                     <a:prstGeom prst="rect"/>
                     <a:ln/>
@@ -13837,7 +13837,7 @@
         </w:drawing>
         <w:drawing>
           <wp:inline distT="0" distB="0" distL="0" distR="0">
-            <wp:extent cx="1257300" cy="2836375"/>
+            <wp:extent cx="687219" cy="1550316"/>
             <wp:effectExtent l="0" t="0" r="0" b="0"/>
             <wp:docPr id="29" name="image19.jpg"/>
             <a:graphic>
@@ -13857,7 +13857,7 @@
                   <pic:spPr>
                     <a:xfrm>
                       <a:off x="0" y="0"/>
-                      <a:ext cx="1257300" cy="2836375"/>
+                      <a:ext cx="687219" cy="1550316"/>
                     </a:xfrm>
                     <a:prstGeom prst="rect"/>
                     <a:ln/>
@@ -13869,7 +13869,7 @@
         </w:drawing>
         <w:drawing>
           <wp:inline distT="0" distB="0" distL="0" distR="0">
-            <wp:extent cx="1323975" cy="2841817"/>
+            <wp:extent cx="723663" cy="1553291"/>
             <wp:effectExtent l="0" t="0" r="0" b="0"/>
             <wp:docPr id="26" name="image15.jpg"/>
             <a:graphic>
@@ -13889,7 +13889,7 @@
                   <pic:spPr>
                     <a:xfrm>
                       <a:off x="0" y="0"/>
-                      <a:ext cx="1323975" cy="2841817"/>
+                      <a:ext cx="723663" cy="1553291"/>
                     </a:xfrm>
                     <a:prstGeom prst="rect"/>
                     <a:ln/>
@@ -13901,7 +13901,7 @@
         </w:drawing>
         <w:drawing>
           <wp:inline distT="0" distB="0" distL="0" distR="0">
-            <wp:extent cx="1323975" cy="2274400"/>
+            <wp:extent cx="723663" cy="1243150"/>
             <wp:effectExtent l="0" t="0" r="0" b="0"/>
             <wp:docPr id="14" name="image9.jpg"/>
             <a:graphic>
@@ -13921,7 +13921,7 @@
                   <pic:spPr>
                     <a:xfrm>
                       <a:off x="0" y="0"/>
-                      <a:ext cx="1323975" cy="2274400"/>
+                      <a:ext cx="723663" cy="1243150"/>
                     </a:xfrm>
                     <a:prstGeom prst="rect"/>
                     <a:ln/>
@@ -14018,7 +14018,7 @@
         </w:rPr>
         <w:drawing>
           <wp:inline distT="0" distB="0" distL="0" distR="0">
-            <wp:extent cx="1257300" cy="2836375"/>
+            <wp:extent cx="838200" cy="1890916"/>
             <wp:effectExtent l="0" t="0" r="0" b="0"/>
             <wp:docPr id="27" name="image37.jpg"/>
             <a:graphic>
@@ -14038,7 +14038,7 @@
                   <pic:spPr>
                     <a:xfrm>
                       <a:off x="0" y="0"/>
-                      <a:ext cx="1257300" cy="2836375"/>
+                      <a:ext cx="838200" cy="1890916"/>
                     </a:xfrm>
                     <a:prstGeom prst="rect"/>
                     <a:ln/>
@@ -14050,7 +14050,7 @@
         </w:drawing>
         <w:drawing>
           <wp:inline distT="0" distB="0" distL="0" distR="0">
-            <wp:extent cx="1257300" cy="2836375"/>
+            <wp:extent cx="838200" cy="1890916"/>
             <wp:effectExtent l="0" t="0" r="0" b="0"/>
             <wp:docPr id="46" name="image45.jpg"/>
             <a:graphic>
@@ -14070,7 +14070,7 @@
                   <pic:spPr>
                     <a:xfrm>
                       <a:off x="0" y="0"/>
-                      <a:ext cx="1257300" cy="2836375"/>
+                      <a:ext cx="838200" cy="1890916"/>
                     </a:xfrm>
                     <a:prstGeom prst="rect"/>
                     <a:ln/>
@@ -14082,7 +14082,7 @@
         </w:drawing>
         <w:drawing>
           <wp:inline distT="0" distB="0" distL="0" distR="0">
-            <wp:extent cx="1257300" cy="2836375"/>
+            <wp:extent cx="838200" cy="1890916"/>
             <wp:effectExtent l="0" t="0" r="0" b="0"/>
             <wp:docPr id="48" name="image46.jpg"/>
             <a:graphic>
@@ -14102,7 +14102,7 @@
                   <pic:spPr>
                     <a:xfrm>
                       <a:off x="0" y="0"/>
-                      <a:ext cx="1257300" cy="2836375"/>
+                      <a:ext cx="838200" cy="1890916"/>
                     </a:xfrm>
                     <a:prstGeom prst="rect"/>
                     <a:ln/>
@@ -14114,7 +14114,7 @@
         </w:drawing>
         <w:drawing>
           <wp:inline distT="0" distB="0" distL="0" distR="0">
-            <wp:extent cx="1257300" cy="2836375"/>
+            <wp:extent cx="838200" cy="1890916"/>
             <wp:effectExtent l="0" t="0" r="0" b="0"/>
             <wp:docPr id="18" name="image44.jpg"/>
             <a:graphic>
@@ -14134,7 +14134,7 @@
                   <pic:spPr>
                     <a:xfrm>
                       <a:off x="0" y="0"/>
-                      <a:ext cx="1257300" cy="2836375"/>
+                      <a:ext cx="838200" cy="1890916"/>
                     </a:xfrm>
                     <a:prstGeom prst="rect"/>
                     <a:ln/>
@@ -14146,7 +14146,7 @@
         </w:drawing>
         <w:drawing>
           <wp:inline distT="0" distB="0" distL="0" distR="0">
-            <wp:extent cx="1257300" cy="2836375"/>
+            <wp:extent cx="838200" cy="1890916"/>
             <wp:effectExtent l="0" t="0" r="0" b="0"/>
             <wp:docPr id="42" name="image48.jpg"/>
             <a:graphic>
@@ -14166,7 +14166,7 @@
                   <pic:spPr>
                     <a:xfrm>
                       <a:off x="0" y="0"/>
-                      <a:ext cx="1257300" cy="2836375"/>
+                      <a:ext cx="838200" cy="1890916"/>
                     </a:xfrm>
                     <a:prstGeom prst="rect"/>
                     <a:ln/>
@@ -14178,7 +14178,7 @@
         </w:drawing>
         <w:drawing>
           <wp:inline distT="0" distB="0" distL="0" distR="0">
-            <wp:extent cx="1257300" cy="2836375"/>
+            <wp:extent cx="838200" cy="1890916"/>
             <wp:effectExtent l="0" t="0" r="0" b="0"/>
             <wp:docPr id="11" name="image24.jpg"/>
             <a:graphic>
@@ -14198,7 +14198,7 @@
                   <pic:spPr>
                     <a:xfrm>
                       <a:off x="0" y="0"/>
-                      <a:ext cx="1257300" cy="2836375"/>
+                      <a:ext cx="838200" cy="1890916"/>
                     </a:xfrm>
                     <a:prstGeom prst="rect"/>
                     <a:ln/>

</xml_diff>

<commit_message>
Restore figure labels: Figure N bold 11pt, captions regular
All Figure labels restored to Georgia 11 bold left. Conceptual Framework and appendix brand captions regular 11.
</commit_message>
<xml_diff>
--- a/thesis/Velasquez_CTA_Skincare_Thesis_DRAFT_003.docx
+++ b/thesis/Velasquez_CTA_Skincare_Thesis_DRAFT_003.docx
@@ -1442,7 +1442,7 @@
     <w:p>
       <w:pPr>
         <w:spacing w:after="0" w:before="0" w:line="360" w:lineRule="auto"/>
-        <w:ind/>
+        <w:ind w:firstLine="0"/>
         <w:jc w:val="left"/>
         <w:rPr>
           <w:rFonts w:ascii="Georgia" w:cs="Georgia" w:eastAsia="Georgia" w:hAnsi="Georgia"/>
@@ -1456,7 +1456,7 @@
       <w:r>
         <w:rPr>
           <w:rFonts w:ascii="Georgia" w:cs="Georgia" w:eastAsia="Georgia" w:hAnsi="Georgia"/>
-          <w:b w:val="0"/>
+          <w:b/>
           <w:bCs w:val="1"/>
           <w:i w:val="0"/>
           <w:color w:val="27251e"/>
@@ -1469,9 +1469,9 @@
     </w:p>
     <w:p>
       <w:pPr>
-        <w:spacing w:after="0" w:before="0" w:line="480" w:lineRule="auto"/>
-        <w:ind w:firstLine="720"/>
-        <w:jc w:val="both"/>
+        <w:spacing w:after="0" w:before="0" w:line="360" w:lineRule="auto"/>
+        <w:ind w:firstLine="0"/>
+        <w:jc w:val="left"/>
         <w:rPr>
           <w:rFonts w:ascii="Georgia" w:cs="Georgia" w:eastAsia="Georgia" w:hAnsi="Georgia"/>
           <w:i w:val="1"/>
@@ -12537,7 +12537,7 @@
     <w:p>
       <w:pPr>
         <w:spacing w:before="0" w:after="0" w:line="360" w:lineRule="auto"/>
-        <w:ind/>
+        <w:ind w:firstLine="0"/>
         <w:jc w:val="left"/>
         <w:rPr>
           <w:rFonts w:ascii="Georgia" w:cs="Georgia" w:eastAsia="Georgia" w:hAnsi="Georgia"/>
@@ -12550,7 +12550,7 @@
       <w:r>
         <w:rPr>
           <w:rFonts w:ascii="Georgia" w:cs="Georgia" w:eastAsia="Georgia" w:hAnsi="Georgia"/>
-          <w:b w:val="0"/>
+          <w:b/>
           <w:bCs w:val="1"/>
           <w:i w:val="0"/>
           <w:sz w:val="22"/>
@@ -12563,8 +12563,8 @@
     <w:p>
       <w:pPr>
         <w:spacing w:before="0" w:after="0" w:line="480" w:lineRule="auto"/>
-        <w:ind w:firstLine="720"/>
-        <w:jc w:val="both"/>
+        <w:ind w:firstLine="0"/>
+        <w:jc w:val="left"/>
         <w:rPr>
           <w:rFonts w:ascii="Georgia" w:cs="Georgia" w:eastAsia="Georgia" w:hAnsi="Georgia"/>
           <w:i w:val="1"/>
@@ -12874,7 +12874,7 @@
     <w:p>
       <w:pPr>
         <w:spacing w:before="0" w:after="0" w:line="360" w:lineRule="auto"/>
-        <w:ind/>
+        <w:ind w:firstLine="0"/>
         <w:jc w:val="left"/>
         <w:rPr>
           <w:rFonts w:ascii="Georgia" w:cs="Georgia" w:eastAsia="Georgia" w:hAnsi="Georgia"/>
@@ -12887,7 +12887,7 @@
       <w:r>
         <w:rPr>
           <w:rFonts w:ascii="Georgia" w:cs="Georgia" w:eastAsia="Georgia" w:hAnsi="Georgia"/>
-          <w:b w:val="0"/>
+          <w:b/>
           <w:bCs w:val="1"/>
           <w:i w:val="0"/>
           <w:sz w:val="22"/>
@@ -12900,8 +12900,8 @@
     <w:p>
       <w:pPr>
         <w:spacing w:before="0" w:after="0" w:line="480" w:lineRule="auto"/>
-        <w:ind w:firstLine="720"/>
-        <w:jc w:val="both"/>
+        <w:ind w:firstLine="0"/>
+        <w:jc w:val="left"/>
         <w:rPr>
           <w:rFonts w:ascii="Georgia" w:cs="Georgia" w:eastAsia="Georgia" w:hAnsi="Georgia"/>
           <w:i w:val="1"/>
@@ -13267,7 +13267,7 @@
     <w:p>
       <w:pPr>
         <w:spacing w:before="0" w:after="0" w:line="360" w:lineRule="auto"/>
-        <w:ind/>
+        <w:ind w:firstLine="0"/>
         <w:jc w:val="left"/>
         <w:rPr>
           <w:rFonts w:ascii="Georgia" w:cs="Georgia" w:eastAsia="Georgia" w:hAnsi="Georgia"/>
@@ -13280,7 +13280,7 @@
       <w:r>
         <w:rPr>
           <w:rFonts w:ascii="Georgia" w:cs="Georgia" w:eastAsia="Georgia" w:hAnsi="Georgia"/>
-          <w:b w:val="0"/>
+          <w:b/>
           <w:bCs w:val="1"/>
           <w:i w:val="0"/>
           <w:sz w:val="22"/>
@@ -13293,8 +13293,8 @@
     <w:p>
       <w:pPr>
         <w:spacing w:before="0" w:after="0" w:line="480" w:lineRule="auto"/>
-        <w:ind w:firstLine="720"/>
-        <w:jc w:val="both"/>
+        <w:ind w:firstLine="0"/>
+        <w:jc w:val="left"/>
         <w:rPr>
           <w:rFonts w:ascii="Georgia" w:cs="Georgia" w:eastAsia="Georgia" w:hAnsi="Georgia"/>
           <w:i w:val="1"/>
@@ -13632,7 +13632,7 @@
     <w:p>
       <w:pPr>
         <w:spacing w:before="0" w:after="0" w:line="360" w:lineRule="auto"/>
-        <w:ind/>
+        <w:ind w:firstLine="0"/>
         <w:jc w:val="left"/>
         <w:rPr>
           <w:rFonts w:ascii="Georgia" w:cs="Georgia" w:eastAsia="Georgia" w:hAnsi="Georgia"/>
@@ -13645,7 +13645,7 @@
       <w:r>
         <w:rPr>
           <w:rFonts w:ascii="Georgia" w:cs="Georgia" w:eastAsia="Georgia" w:hAnsi="Georgia"/>
-          <w:b w:val="0"/>
+          <w:b/>
           <w:bCs w:val="1"/>
           <w:i w:val="0"/>
           <w:sz w:val="22"/>
@@ -13658,8 +13658,8 @@
     <w:p>
       <w:pPr>
         <w:spacing w:before="0" w:after="0" w:line="480" w:lineRule="auto"/>
-        <w:ind w:firstLine="720"/>
-        <w:jc w:val="both"/>
+        <w:ind w:firstLine="0"/>
+        <w:jc w:val="left"/>
         <w:rPr>
           <w:rFonts w:ascii="Georgia" w:cs="Georgia" w:eastAsia="Georgia" w:hAnsi="Georgia"/>
           <w:i w:val="1"/>
@@ -13941,7 +13941,7 @@
     <w:p>
       <w:pPr>
         <w:spacing w:before="0" w:after="0" w:line="360" w:lineRule="auto"/>
-        <w:ind/>
+        <w:ind w:firstLine="0"/>
         <w:jc w:val="left"/>
         <w:rPr>
           <w:rFonts w:ascii="Georgia" w:cs="Georgia" w:eastAsia="Georgia" w:hAnsi="Georgia"/>
@@ -13954,7 +13954,7 @@
       <w:r>
         <w:rPr>
           <w:rFonts w:ascii="Georgia" w:cs="Georgia" w:eastAsia="Georgia" w:hAnsi="Georgia"/>
-          <w:b w:val="0"/>
+          <w:b/>
           <w:bCs w:val="1"/>
           <w:i w:val="0"/>
           <w:sz w:val="22"/>
@@ -13967,8 +13967,8 @@
     <w:p>
       <w:pPr>
         <w:spacing w:before="0" w:after="0" w:line="480" w:lineRule="auto"/>
-        <w:ind w:firstLine="720"/>
-        <w:jc w:val="both"/>
+        <w:ind w:firstLine="0"/>
+        <w:jc w:val="left"/>
         <w:rPr>
           <w:rFonts w:ascii="Georgia" w:cs="Georgia" w:eastAsia="Georgia" w:hAnsi="Georgia"/>
           <w:i w:val="1"/>
@@ -14295,8 +14295,8 @@
     <w:p>
       <w:pPr>
         <w:spacing w:line="480" w:lineRule="auto" w:before="0" w:after="0"/>
-        <w:ind w:firstLine="720"/>
-        <w:jc w:val="both"/>
+        <w:ind w:firstLine="0"/>
+        <w:jc w:val="left"/>
         <w:rPr>
           <w:rFonts w:ascii="Georgia" w:cs="Georgia" w:eastAsia="Georgia" w:hAnsi="Georgia"/>
           <w:i w:val="1"/>
@@ -15702,8 +15702,8 @@
     <w:p>
       <w:pPr>
         <w:spacing w:before="0" w:after="0" w:line="480" w:lineRule="auto"/>
-        <w:ind w:firstLine="720"/>
-        <w:jc w:val="both"/>
+        <w:ind w:firstLine="0"/>
+        <w:jc w:val="left"/>
         <w:rPr>
           <w:rFonts w:ascii="Georgia" w:cs="Georgia" w:eastAsia="Georgia" w:hAnsi="Georgia"/>
           <w:i w:val="1"/>
@@ -17543,8 +17543,8 @@
     <w:p>
       <w:pPr>
         <w:spacing w:before="0" w:after="0" w:line="480" w:lineRule="auto"/>
-        <w:ind w:firstLine="720"/>
-        <w:jc w:val="both"/>
+        <w:ind w:firstLine="0"/>
+        <w:jc w:val="left"/>
         <w:rPr>
           <w:rFonts w:ascii="Georgia" w:cs="Georgia" w:eastAsia="Georgia" w:hAnsi="Georgia"/>
           <w:i w:val="1"/>
@@ -19582,8 +19582,8 @@
     <w:p>
       <w:pPr>
         <w:spacing w:before="0" w:after="0" w:line="480" w:lineRule="auto"/>
-        <w:ind w:firstLine="720"/>
-        <w:jc w:val="both"/>
+        <w:ind w:firstLine="0"/>
+        <w:jc w:val="left"/>
         <w:rPr>
           <w:rFonts w:ascii="Georgia" w:cs="Georgia" w:eastAsia="Georgia" w:hAnsi="Georgia"/>
           <w:i w:val="1"/>
@@ -21475,8 +21475,8 @@
     <w:p>
       <w:pPr>
         <w:spacing w:before="0" w:after="0" w:line="480" w:lineRule="auto"/>
-        <w:ind w:firstLine="720"/>
-        <w:jc w:val="both"/>
+        <w:ind w:firstLine="0"/>
+        <w:jc w:val="left"/>
         <w:rPr>
           <w:rFonts w:ascii="Georgia" w:cs="Georgia" w:eastAsia="Georgia" w:hAnsi="Georgia"/>
           <w:i w:val="1"/>
@@ -23157,8 +23157,8 @@
     <w:p>
       <w:pPr>
         <w:spacing w:line="480" w:lineRule="auto" w:before="0" w:after="0"/>
-        <w:ind w:firstLine="720"/>
-        <w:jc w:val="both"/>
+        <w:ind w:firstLine="0"/>
+        <w:jc w:val="left"/>
         <w:rPr>
           <w:rFonts w:ascii="Georgia" w:cs="Georgia" w:eastAsia="Georgia" w:hAnsi="Georgia"/>
           <w:i w:val="1"/>
@@ -24055,8 +24055,8 @@
     <w:p>
       <w:pPr>
         <w:spacing w:before="0" w:after="0" w:line="480" w:lineRule="auto"/>
-        <w:ind w:firstLine="720"/>
-        <w:jc w:val="both"/>
+        <w:ind w:firstLine="0"/>
+        <w:jc w:val="left"/>
         <w:rPr>
           <w:rFonts w:ascii="Georgia" w:cs="Georgia" w:eastAsia="Georgia" w:hAnsi="Georgia"/>
           <w:i w:val="1"/>
@@ -24942,8 +24942,8 @@
     <w:p>
       <w:pPr>
         <w:spacing w:before="0" w:after="0" w:line="480" w:lineRule="auto"/>
-        <w:ind w:firstLine="720"/>
-        <w:jc w:val="both"/>
+        <w:ind w:firstLine="0"/>
+        <w:jc w:val="left"/>
         <w:rPr>
           <w:rFonts w:ascii="Georgia" w:cs="Georgia" w:eastAsia="Georgia" w:hAnsi="Georgia"/>
           <w:i w:val="1"/>
@@ -25841,8 +25841,8 @@
     <w:p>
       <w:pPr>
         <w:spacing w:before="0" w:after="0" w:line="480" w:lineRule="auto"/>
-        <w:ind w:firstLine="720"/>
-        <w:jc w:val="both"/>
+        <w:ind w:firstLine="0"/>
+        <w:jc w:val="left"/>
         <w:rPr>
           <w:rFonts w:ascii="Georgia" w:cs="Georgia" w:eastAsia="Georgia" w:hAnsi="Georgia"/>
           <w:i w:val="1"/>
@@ -26728,8 +26728,8 @@
     <w:p>
       <w:pPr>
         <w:spacing w:after="0" w:before="0" w:lineRule="auto" w:line="480"/>
-        <w:ind w:firstLine="720"/>
-        <w:jc w:val="both"/>
+        <w:ind w:firstLine="0"/>
+        <w:jc w:val="left"/>
         <w:rPr>
           <w:rFonts w:ascii="Georgia" w:cs="Georgia" w:eastAsia="Georgia" w:hAnsi="Georgia"/>
           <w:i w:val="1"/>

</xml_diff>